<commit_message>
Accept inspection act DOCX gate 2 template
</commit_message>
<xml_diff>
--- a/Templates/Acts/inspection_act.docx
+++ b/Templates/Acts/inspection_act.docx
@@ -1,6 +1,6 @@
 
 <file path=word/document.xml><?xml version="1.0" encoding="utf-8"?>
-<w:document xmlns:wpc="http://schemas.microsoft.com/office/word/2010/wordprocessingCanvas" xmlns:cx="http://schemas.microsoft.com/office/drawing/2014/chartex" xmlns:cx1="http://schemas.microsoft.com/office/drawing/2015/9/8/chartex" xmlns:mc="http://schemas.openxmlformats.org/markup-compatibility/2006" xmlns:o="urn:schemas-microsoft-com:office:office" xmlns:r="http://schemas.openxmlformats.org/officeDocument/2006/relationships" xmlns:m="http://schemas.openxmlformats.org/officeDocument/2006/math" xmlns:v="urn:schemas-microsoft-com:vml" xmlns:wp14="http://schemas.microsoft.com/office/word/2010/wordprocessingDrawing" xmlns:wp="http://schemas.openxmlformats.org/drawingml/2006/wordprocessingDrawing" xmlns:w10="urn:schemas-microsoft-com:office:word" xmlns:w="http://schemas.openxmlformats.org/wordprocessingml/2006/main" xmlns:w14="http://schemas.microsoft.com/office/word/2010/wordml" xmlns:w15="http://schemas.microsoft.com/office/word/2012/wordml" xmlns:w16se="http://schemas.microsoft.com/office/word/2015/wordml/symex" xmlns:wpg="http://schemas.microsoft.com/office/word/2010/wordprocessingGroup" xmlns:wpi="http://schemas.microsoft.com/office/word/2010/wordprocessingInk" xmlns:wne="http://schemas.microsoft.com/office/word/2006/wordml" xmlns:wps="http://schemas.microsoft.com/office/word/2010/wordprocessingShape" mc:Ignorable="w14 w15 w16se wp14">
+<w:document xmlns:wpc="http://schemas.microsoft.com/office/word/2010/wordprocessingCanvas" xmlns:cx="http://schemas.microsoft.com/office/drawing/2014/chartex" xmlns:mc="http://schemas.openxmlformats.org/markup-compatibility/2006" xmlns:o="urn:schemas-microsoft-com:office:office" xmlns:r="http://schemas.openxmlformats.org/officeDocument/2006/relationships" xmlns:m="http://schemas.openxmlformats.org/officeDocument/2006/math" xmlns:v="urn:schemas-microsoft-com:vml" xmlns:wp14="http://schemas.microsoft.com/office/word/2010/wordprocessingDrawing" xmlns:wp="http://schemas.openxmlformats.org/drawingml/2006/wordprocessingDrawing" xmlns:w10="urn:schemas-microsoft-com:office:word" xmlns:w="http://schemas.openxmlformats.org/wordprocessingml/2006/main" xmlns:w14="http://schemas.microsoft.com/office/word/2010/wordml" xmlns:w15="http://schemas.microsoft.com/office/word/2012/wordml" xmlns:w16se="http://schemas.microsoft.com/office/word/2015/wordml/symex" xmlns:wpg="http://schemas.microsoft.com/office/word/2010/wordprocessingGroup" xmlns:wpi="http://schemas.microsoft.com/office/word/2010/wordprocessingInk" xmlns:wne="http://schemas.microsoft.com/office/word/2006/wordml" xmlns:wps="http://schemas.microsoft.com/office/word/2010/wordprocessingShape" mc:Ignorable="w14 w15 w16se wp14">
   <w:body>
     <w:p>
       <w:pPr>
@@ -10,38 +10,983 @@
         </w:tabs>
         <w:ind w:left="5387"/>
         <w:outlineLvl w:val="0"/>
+      </w:pPr>
+      <w:r>
+        <w:rPr>
+          <w:rFonts w:ascii="Arial" w:eastAsia="Arial" w:hAnsi="Arial" w:cs="Arial"/>
+        </w:rPr>
+        <w:t>УТВЕРЖДАЮ</w:t>
+      </w:r>
+    </w:p>
+    <w:p>
+      <w:pPr>
+        <w:tabs>
+          <w:tab w:val="left" w:pos="-284"/>
+          <w:tab w:val="left" w:pos="284"/>
+        </w:tabs>
+        <w:ind w:left="5387"/>
+        <w:rPr>
+          <w:rFonts w:ascii="Arial" w:eastAsia="Arial" w:hAnsi="Arial" w:cs="Arial"/>
+        </w:rPr>
+      </w:pPr>
+      <w:r>
+        <w:rPr>
+          <w:rFonts w:ascii="Arial" w:eastAsia="Arial" w:hAnsi="Arial" w:cs="Arial"/>
+        </w:rPr>
+        <w:t>Замест</w:t>
+      </w:r>
+      <w:r>
+        <w:rPr>
+          <w:rFonts w:ascii="Arial" w:eastAsia="Arial" w:hAnsi="Arial" w:cs="Arial"/>
+        </w:rPr>
+        <w:t xml:space="preserve">итель главного инженера </w:t>
+      </w:r>
+    </w:p>
+    <w:p>
+      <w:pPr>
+        <w:tabs>
+          <w:tab w:val="left" w:pos="-284"/>
+          <w:tab w:val="left" w:pos="284"/>
+        </w:tabs>
+        <w:ind w:left="5387"/>
+      </w:pPr>
+      <w:r>
+        <w:rPr>
+          <w:rFonts w:ascii="Arial" w:eastAsia="Arial" w:hAnsi="Arial" w:cs="Arial"/>
+        </w:rPr>
+        <w:t>по ИТиА -</w:t>
+      </w:r>
+      <w:r>
+        <w:rPr>
+          <w:rFonts w:ascii="Arial" w:eastAsia="Arial" w:hAnsi="Arial" w:cs="Arial"/>
+        </w:rPr>
+        <w:t xml:space="preserve"> н</w:t>
+      </w:r>
+      <w:r>
+        <w:rPr>
+          <w:rFonts w:ascii="Arial" w:eastAsia="Arial" w:hAnsi="Arial" w:cs="Arial"/>
+        </w:rPr>
+        <w:t>ачальник УИТиА</w:t>
+      </w:r>
+    </w:p>
+    <w:p>
+      <w:pPr>
+        <w:tabs>
+          <w:tab w:val="left" w:pos="-284"/>
+          <w:tab w:val="left" w:pos="284"/>
+        </w:tabs>
+        <w:ind w:left="5387"/>
+      </w:pPr>
+    </w:p>
+    <w:tbl>
+      <w:tblPr>
+        <w:tblW w:w="0" w:type="auto"/>
+        <w:jc w:val="right"/>
+        <w:tblBorders>
+          <w:top w:val="nil"/>
+          <w:left w:val="nil"/>
+          <w:bottom w:val="nil"/>
+          <w:right w:val="nil"/>
+          <w:insideH w:val="nil"/>
+          <w:insideV w:val="nil"/>
+        </w:tblBorders>
+        <w:tblLayout w:type="fixed"/>
+        <w:tblLook w:val="04A0" w:firstRow="1" w:lastRow="0" w:firstColumn="1" w:lastColumn="0" w:noHBand="0" w:noVBand="1"/>
+      </w:tblPr>
+      <w:tblGrid>
+        <w:gridCol w:w="4300"/>
+      </w:tblGrid>
+      <w:tr>
+        <w:trPr>
+          <w:trHeight w:hRule="exact" w:val="250"/>
+          <w:jc w:val="right"/>
+        </w:trPr>
+        <w:tc>
+          <w:tcPr>
+            <w:tcW w:w="4300" w:type="dxa"/>
+            <w:tcBorders>
+              <w:top w:val="nil"/>
+              <w:left w:val="nil"/>
+              <w:bottom w:val="single" w:sz="4" w:space="0" w:color="000000"/>
+              <w:right w:val="nil"/>
+            </w:tcBorders>
+            <w:vAlign w:val="bottom"/>
+          </w:tcPr>
+          <w:p>
+            <w:pPr>
+              <w:spacing w:line="220" w:lineRule="exact"/>
+            </w:pPr>
+            <w:r>
+              <w:rPr>
+                <w:rFonts w:ascii="Arial" w:eastAsia="Arial" w:hAnsi="Arial" w:cs="Arial"/>
+                <w:sz w:val="22"/>
+                <w:szCs w:val="22"/>
+              </w:rPr>
+              <w:t>{{ApproverName}}</w:t>
+            </w:r>
+          </w:p>
+        </w:tc>
+      </w:tr>
+      <w:tr>
+        <w:trPr>
+          <w:trHeight w:hRule="exact" w:val="501"/>
+          <w:jc w:val="right"/>
+        </w:trPr>
+        <w:tc>
+          <w:tcPr>
+            <w:tcW w:w="4300" w:type="dxa"/>
+            <w:tcBorders>
+              <w:top w:val="nil"/>
+              <w:left w:val="nil"/>
+              <w:bottom w:val="single" w:sz="4" w:space="0" w:color="000000"/>
+              <w:right w:val="nil"/>
+            </w:tcBorders>
+            <w:vAlign w:val="bottom"/>
+          </w:tcPr>
+          <w:p>
+            <w:pPr>
+              <w:spacing w:line="220" w:lineRule="exact"/>
+            </w:pPr>
+            <w:r>
+              <w:rPr>
+                <w:rFonts w:ascii="Arial" w:eastAsia="Arial" w:hAnsi="Arial" w:cs="Arial"/>
+                <w:sz w:val="22"/>
+                <w:szCs w:val="22"/>
+              </w:rPr>
+              <w:t>{{</w:t>
+            </w:r>
+            <w:proofErr w:type="spellStart"/>
+            <w:r>
+              <w:rPr>
+                <w:rFonts w:ascii="Arial" w:eastAsia="Arial" w:hAnsi="Arial" w:cs="Arial"/>
+                <w:sz w:val="22"/>
+                <w:szCs w:val="22"/>
+              </w:rPr>
+              <w:t>ApprovalDate</w:t>
+            </w:r>
+            <w:proofErr w:type="spellEnd"/>
+            <w:r>
+              <w:rPr>
+                <w:rFonts w:ascii="Arial" w:eastAsia="Arial" w:hAnsi="Arial" w:cs="Arial"/>
+                <w:sz w:val="22"/>
+                <w:szCs w:val="22"/>
+              </w:rPr>
+              <w:t>}}</w:t>
+            </w:r>
+          </w:p>
+        </w:tc>
+      </w:tr>
+    </w:tbl>
+    <w:p>
+      <w:pPr>
+        <w:tabs>
+          <w:tab w:val="left" w:pos="-284"/>
+          <w:tab w:val="left" w:pos="284"/>
+        </w:tabs>
+        <w:jc w:val="center"/>
+      </w:pPr>
+    </w:p>
+    <w:p>
+      <w:pPr>
+        <w:tabs>
+          <w:tab w:val="left" w:pos="-284"/>
+          <w:tab w:val="left" w:pos="284"/>
+        </w:tabs>
+        <w:jc w:val="center"/>
+        <w:outlineLvl w:val="0"/>
+      </w:pPr>
+      <w:r>
+        <w:rPr>
+          <w:rFonts w:ascii="Arial" w:eastAsia="Arial" w:hAnsi="Arial" w:cs="Arial"/>
+        </w:rPr>
+        <w:t>АКТ</w:t>
+      </w:r>
+    </w:p>
+    <w:tbl>
+      <w:tblPr>
+        <w:tblW w:w="5245" w:type="dxa"/>
+        <w:tblBorders>
+          <w:top w:val="nil"/>
+          <w:left w:val="nil"/>
+          <w:bottom w:val="nil"/>
+          <w:right w:val="nil"/>
+          <w:insideH w:val="nil"/>
+          <w:insideV w:val="nil"/>
+        </w:tblBorders>
+        <w:tblLayout w:type="fixed"/>
+        <w:tblLook w:val="04A0" w:firstRow="1" w:lastRow="0" w:firstColumn="1" w:lastColumn="0" w:noHBand="0" w:noVBand="1"/>
+      </w:tblPr>
+      <w:tblGrid>
+        <w:gridCol w:w="3828"/>
+        <w:gridCol w:w="1417"/>
+      </w:tblGrid>
+      <w:tr>
+        <w:trPr>
+          <w:trHeight w:hRule="exact" w:val="517"/>
+        </w:trPr>
+        <w:tc>
+          <w:tcPr>
+            <w:tcW w:w="3828" w:type="dxa"/>
+            <w:tcBorders>
+              <w:top w:val="nil"/>
+              <w:left w:val="nil"/>
+              <w:bottom w:val="nil"/>
+              <w:right w:val="nil"/>
+            </w:tcBorders>
+            <w:vAlign w:val="bottom"/>
+          </w:tcPr>
+          <w:p>
+            <w:pPr>
+              <w:spacing w:line="220" w:lineRule="exact"/>
+            </w:pPr>
+            <w:r>
+              <w:rPr>
+                <w:rFonts w:ascii="Arial" w:eastAsia="Arial" w:hAnsi="Arial" w:cs="Arial"/>
+                <w:sz w:val="22"/>
+                <w:szCs w:val="22"/>
+              </w:rPr>
+              <w:t>о приемке выполненных работ от</w:t>
+            </w:r>
+          </w:p>
+        </w:tc>
+        <w:tc>
+          <w:tcPr>
+            <w:tcW w:w="1417" w:type="dxa"/>
+            <w:tcBorders>
+              <w:top w:val="nil"/>
+              <w:left w:val="nil"/>
+              <w:bottom w:val="single" w:sz="4" w:space="0" w:color="000000"/>
+              <w:right w:val="nil"/>
+            </w:tcBorders>
+            <w:vAlign w:val="bottom"/>
+          </w:tcPr>
+          <w:p>
+            <w:pPr>
+              <w:spacing w:line="220" w:lineRule="exact"/>
+            </w:pPr>
+            <w:r>
+              <w:rPr>
+                <w:rFonts w:ascii="Arial" w:eastAsia="Arial" w:hAnsi="Arial" w:cs="Arial"/>
+                <w:sz w:val="22"/>
+                <w:szCs w:val="22"/>
+              </w:rPr>
+              <w:t>{{</w:t>
+            </w:r>
+            <w:proofErr w:type="spellStart"/>
+            <w:r>
+              <w:rPr>
+                <w:rFonts w:ascii="Arial" w:eastAsia="Arial" w:hAnsi="Arial" w:cs="Arial"/>
+                <w:sz w:val="22"/>
+                <w:szCs w:val="22"/>
+              </w:rPr>
+              <w:t>ActDate</w:t>
+            </w:r>
+            <w:proofErr w:type="spellEnd"/>
+            <w:r>
+              <w:rPr>
+                <w:rFonts w:ascii="Arial" w:eastAsia="Arial" w:hAnsi="Arial" w:cs="Arial"/>
+                <w:sz w:val="22"/>
+                <w:szCs w:val="22"/>
+              </w:rPr>
+              <w:t>}}</w:t>
+            </w:r>
+          </w:p>
+        </w:tc>
+      </w:tr>
+    </w:tbl>
+    <w:p>
+      <w:pPr>
+        <w:spacing w:line="120" w:lineRule="exact"/>
+      </w:pPr>
+    </w:p>
+    <w:tbl>
+      <w:tblPr>
+        <w:tblW w:w="0" w:type="auto"/>
+        <w:tblBorders>
+          <w:top w:val="nil"/>
+          <w:left w:val="nil"/>
+          <w:bottom w:val="nil"/>
+          <w:right w:val="nil"/>
+          <w:insideH w:val="nil"/>
+          <w:insideV w:val="nil"/>
+        </w:tblBorders>
+        <w:tblLayout w:type="fixed"/>
+        <w:tblCellMar>
+          <w:left w:w="0" w:type="dxa"/>
+          <w:right w:w="0" w:type="dxa"/>
+        </w:tblCellMar>
+        <w:tblLook w:val="04A0" w:firstRow="1" w:lastRow="0" w:firstColumn="1" w:lastColumn="0" w:noHBand="0" w:noVBand="1"/>
+      </w:tblPr>
+      <w:tblGrid>
+        <w:gridCol w:w="9600"/>
+      </w:tblGrid>
+      <w:tr>
+        <w:trPr>
+          <w:trHeight w:hRule="exact" w:val="300"/>
+        </w:trPr>
+        <w:tc>
+          <w:tcPr>
+            <w:tcW w:w="9600" w:type="dxa"/>
+            <w:tcBorders>
+              <w:top w:val="nil"/>
+              <w:left w:val="nil"/>
+              <w:bottom w:val="single" w:sz="4" w:space="0" w:color="000000"/>
+              <w:right w:val="nil"/>
+            </w:tcBorders>
+            <w:vAlign w:val="bottom"/>
+          </w:tcPr>
+          <w:p>
+            <w:pPr>
+              <w:spacing w:line="220" w:lineRule="exact"/>
+            </w:pPr>
+            <w:r>
+              <w:rPr>
+                <w:rFonts w:ascii="Arial" w:eastAsia="Arial" w:hAnsi="Arial" w:cs="Arial"/>
+                <w:sz w:val="22"/>
+                <w:szCs w:val="22"/>
+              </w:rPr>
+              <w:t xml:space="preserve">  </w:t>
+            </w:r>
+            <w:r>
+              <w:rPr>
+                <w:rFonts w:ascii="Arial" w:eastAsia="Arial" w:hAnsi="Arial" w:cs="Arial"/>
+                <w:sz w:val="22"/>
+                <w:szCs w:val="22"/>
+              </w:rPr>
+              <w:t>{{ObjectLine1}}</w:t>
+            </w:r>
+          </w:p>
+        </w:tc>
+      </w:tr>
+    </w:tbl>
+    <w:p>
+      <w:pPr>
+        <w:spacing w:line="220" w:lineRule="exact"/>
+        <w:jc w:val="center"/>
+      </w:pPr>
+    </w:p>
+    <w:tbl>
+      <w:tblPr>
+        <w:tblW w:w="0" w:type="auto"/>
+        <w:tblBorders>
+          <w:top w:val="nil"/>
+          <w:left w:val="nil"/>
+          <w:bottom w:val="nil"/>
+          <w:right w:val="nil"/>
+          <w:insideH w:val="nil"/>
+          <w:insideV w:val="nil"/>
+        </w:tblBorders>
+        <w:tblLayout w:type="fixed"/>
+        <w:tblCellMar>
+          <w:left w:w="0" w:type="dxa"/>
+          <w:right w:w="0" w:type="dxa"/>
+        </w:tblCellMar>
+        <w:tblLook w:val="04A0" w:firstRow="1" w:lastRow="0" w:firstColumn="1" w:lastColumn="0" w:noHBand="0" w:noVBand="1"/>
+      </w:tblPr>
+      <w:tblGrid>
+        <w:gridCol w:w="9600"/>
+      </w:tblGrid>
+      <w:tr>
+        <w:trPr>
+          <w:trHeight w:hRule="exact" w:val="226"/>
+        </w:trPr>
+        <w:tc>
+          <w:tcPr>
+            <w:tcW w:w="9600" w:type="dxa"/>
+            <w:tcBorders>
+              <w:top w:val="nil"/>
+              <w:left w:val="nil"/>
+              <w:bottom w:val="single" w:sz="4" w:space="0" w:color="000000"/>
+              <w:right w:val="nil"/>
+            </w:tcBorders>
+            <w:vAlign w:val="bottom"/>
+          </w:tcPr>
+          <w:p>
+            <w:pPr>
+              <w:spacing w:line="220" w:lineRule="exact"/>
+            </w:pPr>
+            <w:r>
+              <w:rPr>
+                <w:rFonts w:ascii="Arial" w:eastAsia="Arial" w:hAnsi="Arial" w:cs="Arial"/>
+                <w:sz w:val="22"/>
+                <w:szCs w:val="22"/>
+              </w:rPr>
+              <w:t xml:space="preserve">  </w:t>
+            </w:r>
+            <w:r>
+              <w:rPr>
+                <w:rFonts w:ascii="Arial" w:eastAsia="Arial" w:hAnsi="Arial" w:cs="Arial"/>
+                <w:sz w:val="22"/>
+                <w:szCs w:val="22"/>
+              </w:rPr>
+              <w:t>{{ObjectLine2}}</w:t>
+            </w:r>
+          </w:p>
+        </w:tc>
+      </w:tr>
+    </w:tbl>
+    <w:p>
+      <w:pPr>
+        <w:tabs>
+          <w:tab w:val="left" w:pos="-284"/>
+          <w:tab w:val="left" w:pos="284"/>
+        </w:tabs>
+        <w:jc w:val="center"/>
+        <w:rPr>
+          <w:sz w:val="16"/>
+          <w:szCs w:val="16"/>
+        </w:rPr>
+      </w:pPr>
+      <w:r>
+        <w:rPr>
+          <w:rFonts w:ascii="Arial" w:eastAsia="Arial" w:hAnsi="Arial" w:cs="Arial"/>
+          <w:sz w:val="16"/>
+          <w:szCs w:val="16"/>
+        </w:rPr>
+        <w:t>Наименование цеха, объекта. Наименование установки, системы. Описание заявки, неисправности.</w:t>
+      </w:r>
+    </w:p>
+    <w:tbl>
+      <w:tblPr>
+        <w:tblW w:w="0" w:type="auto"/>
+        <w:tblBorders>
+          <w:top w:val="nil"/>
+          <w:left w:val="nil"/>
+          <w:bottom w:val="nil"/>
+          <w:right w:val="nil"/>
+          <w:insideH w:val="nil"/>
+          <w:insideV w:val="nil"/>
+        </w:tblBorders>
+        <w:tblLayout w:type="fixed"/>
+        <w:tblCellMar>
+          <w:left w:w="0" w:type="dxa"/>
+          <w:right w:w="0" w:type="dxa"/>
+        </w:tblCellMar>
+        <w:tblLook w:val="04A0" w:firstRow="1" w:lastRow="0" w:firstColumn="1" w:lastColumn="0" w:noHBand="0" w:noVBand="1"/>
+      </w:tblPr>
+      <w:tblGrid>
+        <w:gridCol w:w="1350"/>
+        <w:gridCol w:w="8250"/>
+      </w:tblGrid>
+      <w:tr>
+        <w:trPr>
+          <w:trHeight w:hRule="exact" w:val="445"/>
+        </w:trPr>
+        <w:tc>
+          <w:tcPr>
+            <w:tcW w:w="1350" w:type="dxa"/>
+            <w:tcBorders>
+              <w:top w:val="nil"/>
+              <w:left w:val="nil"/>
+              <w:bottom w:val="nil"/>
+              <w:right w:val="nil"/>
+            </w:tcBorders>
+            <w:vAlign w:val="bottom"/>
+          </w:tcPr>
+          <w:p>
+            <w:pPr>
+              <w:spacing w:line="220" w:lineRule="exact"/>
+            </w:pPr>
+            <w:r>
+              <w:rPr>
+                <w:rFonts w:ascii="Arial" w:eastAsia="Arial" w:hAnsi="Arial" w:cs="Arial"/>
+                <w:sz w:val="22"/>
+                <w:szCs w:val="22"/>
+              </w:rPr>
+              <w:t>Основание</w:t>
+            </w:r>
+          </w:p>
+        </w:tc>
+        <w:tc>
+          <w:tcPr>
+            <w:tcW w:w="8250" w:type="dxa"/>
+            <w:tcBorders>
+              <w:top w:val="nil"/>
+              <w:left w:val="nil"/>
+              <w:bottom w:val="single" w:sz="4" w:space="0" w:color="000000"/>
+              <w:right w:val="nil"/>
+            </w:tcBorders>
+            <w:vAlign w:val="bottom"/>
+          </w:tcPr>
+          <w:p>
+            <w:pPr>
+              <w:spacing w:line="220" w:lineRule="exact"/>
+            </w:pPr>
+            <w:r>
+              <w:rPr>
+                <w:rFonts w:ascii="Arial" w:eastAsia="Arial" w:hAnsi="Arial" w:cs="Arial"/>
+                <w:sz w:val="22"/>
+                <w:szCs w:val="22"/>
+              </w:rPr>
+              <w:t xml:space="preserve">  </w:t>
+            </w:r>
+            <w:r>
+              <w:rPr>
+                <w:rFonts w:ascii="Arial" w:eastAsia="Arial" w:hAnsi="Arial" w:cs="Arial"/>
+                <w:sz w:val="22"/>
+                <w:szCs w:val="22"/>
+              </w:rPr>
+              <w:t>{{</w:t>
+            </w:r>
+            <w:proofErr w:type="spellStart"/>
+            <w:r>
+              <w:rPr>
+                <w:rFonts w:ascii="Arial" w:eastAsia="Arial" w:hAnsi="Arial" w:cs="Arial"/>
+                <w:sz w:val="22"/>
+                <w:szCs w:val="22"/>
+              </w:rPr>
+              <w:t>RequestDocument</w:t>
+            </w:r>
+            <w:proofErr w:type="spellEnd"/>
+            <w:r>
+              <w:rPr>
+                <w:rFonts w:ascii="Arial" w:eastAsia="Arial" w:hAnsi="Arial" w:cs="Arial"/>
+                <w:sz w:val="22"/>
+                <w:szCs w:val="22"/>
+              </w:rPr>
+              <w:t>}}</w:t>
+            </w:r>
+          </w:p>
+        </w:tc>
+      </w:tr>
+    </w:tbl>
+    <w:p>
+      <w:pPr>
+        <w:spacing w:line="190" w:lineRule="exact"/>
+        <w:jc w:val="center"/>
+        <w:rPr>
+          <w:rFonts w:ascii="Arial" w:eastAsia="Arial" w:hAnsi="Arial" w:cs="Arial"/>
+          <w:sz w:val="16"/>
+          <w:szCs w:val="16"/>
+        </w:rPr>
+      </w:pPr>
+      <w:r>
+        <w:rPr>
+          <w:rFonts w:ascii="Arial" w:eastAsia="Arial" w:hAnsi="Arial" w:cs="Arial"/>
+          <w:sz w:val="16"/>
+          <w:szCs w:val="16"/>
+        </w:rPr>
+        <w:t xml:space="preserve">                       </w:t>
+      </w:r>
+      <w:r>
+        <w:rPr>
+          <w:rFonts w:ascii="Arial" w:eastAsia="Arial" w:hAnsi="Arial" w:cs="Arial"/>
+          <w:sz w:val="16"/>
+          <w:szCs w:val="16"/>
+        </w:rPr>
+        <w:t>заявка, служебная записка или иной документ, указать наименование подразделения,</w:t>
+      </w:r>
+      <w:r>
+        <w:rPr>
+          <w:rFonts w:ascii="Arial" w:eastAsia="Arial" w:hAnsi="Arial" w:cs="Arial"/>
+          <w:sz w:val="16"/>
+          <w:szCs w:val="16"/>
+        </w:rPr>
+        <w:t xml:space="preserve"> </w:t>
+      </w:r>
+      <w:r>
+        <w:rPr>
+          <w:rFonts w:ascii="Arial" w:eastAsia="Arial" w:hAnsi="Arial" w:cs="Arial"/>
+          <w:sz w:val="16"/>
+          <w:szCs w:val="16"/>
+        </w:rPr>
+        <w:t>должность</w:t>
+      </w:r>
+    </w:p>
+    <w:p>
+      <w:pPr>
+        <w:spacing w:line="190" w:lineRule="exact"/>
+        <w:jc w:val="center"/>
+        <w:rPr>
+          <w:rFonts w:ascii="Arial" w:eastAsia="Arial" w:hAnsi="Arial" w:cs="Arial"/>
+          <w:sz w:val="16"/>
+          <w:szCs w:val="16"/>
+        </w:rPr>
+      </w:pPr>
+      <w:r>
+        <w:rPr>
+          <w:rFonts w:ascii="Arial" w:eastAsia="Arial" w:hAnsi="Arial" w:cs="Arial"/>
+          <w:sz w:val="16"/>
+          <w:szCs w:val="16"/>
+        </w:rPr>
+        <w:t xml:space="preserve">                       </w:t>
+      </w:r>
+      <w:r>
+        <w:rPr>
+          <w:rFonts w:ascii="Arial" w:eastAsia="Arial" w:hAnsi="Arial" w:cs="Arial"/>
+          <w:sz w:val="16"/>
+          <w:szCs w:val="16"/>
+        </w:rPr>
+        <w:t xml:space="preserve">и Ф.И.О лица, </w:t>
+      </w:r>
+      <w:r>
+        <w:rPr>
+          <w:rFonts w:ascii="Arial" w:eastAsia="Arial" w:hAnsi="Arial" w:cs="Arial"/>
+          <w:sz w:val="16"/>
+          <w:szCs w:val="16"/>
+        </w:rPr>
+        <w:t>подавшего заявку, или № служебной записки, или реквизиты иного документа</w:t>
+      </w:r>
+    </w:p>
+    <w:p>
+      <w:pPr>
+        <w:tabs>
+          <w:tab w:val="left" w:pos="-284"/>
+          <w:tab w:val="left" w:pos="284"/>
+        </w:tabs>
+        <w:jc w:val="center"/>
         <w:rPr>
           <w:sz w:val="22"/>
           <w:szCs w:val="22"/>
         </w:rPr>
       </w:pPr>
-      <w:r>
-        <w:rPr>
+    </w:p>
+    <w:p>
+      <w:pPr>
+        <w:spacing w:line="220" w:lineRule="exact"/>
+        <w:rPr>
+          <w:rFonts w:ascii="Arial" w:eastAsia="Arial" w:hAnsi="Arial" w:cs="Arial"/>
           <w:sz w:val="22"/>
           <w:szCs w:val="22"/>
         </w:rPr>
-        <w:t>УТВЕРЖДАЮ</w:t>
+      </w:pPr>
+      <w:r>
+        <w:rPr>
+          <w:rFonts w:ascii="Arial" w:eastAsia="Arial" w:hAnsi="Arial" w:cs="Arial"/>
+          <w:sz w:val="22"/>
+          <w:szCs w:val="22"/>
+        </w:rPr>
+        <w:t xml:space="preserve">Мы </w:t>
+      </w:r>
+      <w:r>
+        <w:rPr>
+          <w:rFonts w:ascii="Arial" w:eastAsia="Arial" w:hAnsi="Arial" w:cs="Arial"/>
+          <w:sz w:val="22"/>
+          <w:szCs w:val="22"/>
+        </w:rPr>
+        <w:t>нижеподписавшиеся:</w:t>
       </w:r>
     </w:p>
     <w:p>
       <w:pPr>
+        <w:spacing w:line="220" w:lineRule="exact"/>
+      </w:pPr>
+    </w:p>
+    <w:tbl>
+      <w:tblPr>
+        <w:tblW w:w="9574" w:type="dxa"/>
+        <w:tblBorders>
+          <w:top w:val="nil"/>
+          <w:left w:val="nil"/>
+          <w:bottom w:val="nil"/>
+          <w:right w:val="nil"/>
+          <w:insideH w:val="nil"/>
+          <w:insideV w:val="nil"/>
+        </w:tblBorders>
+        <w:tblLayout w:type="fixed"/>
+        <w:tblCellMar>
+          <w:left w:w="0" w:type="dxa"/>
+          <w:right w:w="0" w:type="dxa"/>
+        </w:tblCellMar>
+        <w:tblLook w:val="04A0" w:firstRow="1" w:lastRow="0" w:firstColumn="1" w:lastColumn="0" w:noHBand="0" w:noVBand="1"/>
+      </w:tblPr>
+      <w:tblGrid>
+        <w:gridCol w:w="3686"/>
+        <w:gridCol w:w="5888"/>
+      </w:tblGrid>
+      <w:tr>
+        <w:trPr>
+          <w:trHeight w:hRule="exact" w:val="367"/>
+        </w:trPr>
+        <w:tc>
+          <w:tcPr>
+            <w:tcW w:w="3686" w:type="dxa"/>
+            <w:tcBorders>
+              <w:top w:val="nil"/>
+              <w:left w:val="nil"/>
+              <w:bottom w:val="nil"/>
+              <w:right w:val="nil"/>
+            </w:tcBorders>
+            <w:vAlign w:val="bottom"/>
+          </w:tcPr>
+          <w:p>
+            <w:pPr>
+              <w:spacing w:line="220" w:lineRule="exact"/>
+              <w:rPr>
+                <w:rFonts w:ascii="Arial" w:eastAsia="Arial" w:hAnsi="Arial" w:cs="Arial"/>
+                <w:sz w:val="22"/>
+                <w:szCs w:val="22"/>
+              </w:rPr>
+            </w:pPr>
+            <w:r>
+              <w:rPr>
+                <w:rFonts w:ascii="Arial" w:eastAsia="Arial" w:hAnsi="Arial" w:cs="Arial"/>
+                <w:sz w:val="22"/>
+                <w:szCs w:val="22"/>
+              </w:rPr>
+              <w:t>представитель исполнителя работ</w:t>
+            </w:r>
+          </w:p>
+        </w:tc>
+        <w:tc>
+          <w:tcPr>
+            <w:tcW w:w="5888" w:type="dxa"/>
+            <w:tcBorders>
+              <w:top w:val="nil"/>
+              <w:left w:val="nil"/>
+              <w:bottom w:val="single" w:sz="4" w:space="0" w:color="000000"/>
+              <w:right w:val="nil"/>
+            </w:tcBorders>
+            <w:vAlign w:val="bottom"/>
+          </w:tcPr>
+          <w:p>
+            <w:pPr>
+              <w:spacing w:line="220" w:lineRule="exact"/>
+            </w:pPr>
+            <w:r>
+              <w:rPr>
+                <w:rFonts w:ascii="Arial" w:eastAsia="Arial" w:hAnsi="Arial" w:cs="Arial"/>
+                <w:sz w:val="22"/>
+                <w:szCs w:val="22"/>
+              </w:rPr>
+              <w:t xml:space="preserve">  </w:t>
+            </w:r>
+            <w:r>
+              <w:rPr>
+                <w:rFonts w:ascii="Arial" w:eastAsia="Arial" w:hAnsi="Arial" w:cs="Arial"/>
+                <w:sz w:val="22"/>
+                <w:szCs w:val="22"/>
+              </w:rPr>
+              <w:t>{{</w:t>
+            </w:r>
+            <w:proofErr w:type="spellStart"/>
+            <w:r>
+              <w:rPr>
+                <w:rFonts w:ascii="Arial" w:eastAsia="Arial" w:hAnsi="Arial" w:cs="Arial"/>
+                <w:sz w:val="22"/>
+                <w:szCs w:val="22"/>
+              </w:rPr>
+              <w:t>ExecutorNamePosition</w:t>
+            </w:r>
+            <w:proofErr w:type="spellEnd"/>
+            <w:r>
+              <w:rPr>
+                <w:rFonts w:ascii="Arial" w:eastAsia="Arial" w:hAnsi="Arial" w:cs="Arial"/>
+                <w:sz w:val="22"/>
+                <w:szCs w:val="22"/>
+              </w:rPr>
+              <w:t>}}</w:t>
+            </w:r>
+          </w:p>
+        </w:tc>
+      </w:tr>
+    </w:tbl>
+    <w:p>
+      <w:pPr>
+        <w:spacing w:line="220" w:lineRule="exact"/>
+        <w:jc w:val="center"/>
+      </w:pPr>
+      <w:r>
+        <w:rPr>
+          <w:rFonts w:ascii="Arial" w:eastAsia="Arial" w:hAnsi="Arial" w:cs="Arial"/>
+          <w:sz w:val="18"/>
+          <w:szCs w:val="18"/>
+        </w:rPr>
+        <w:t xml:space="preserve">                                                     </w:t>
+      </w:r>
+      <w:r>
+        <w:rPr>
+          <w:rFonts w:ascii="Arial" w:eastAsia="Arial" w:hAnsi="Arial" w:cs="Arial"/>
+          <w:sz w:val="18"/>
+          <w:szCs w:val="18"/>
+        </w:rPr>
+        <w:t>Ф.И.О, должность, наименование подразделения</w:t>
+      </w:r>
+    </w:p>
+    <w:tbl>
+      <w:tblPr>
+        <w:tblpPr w:leftFromText="180" w:rightFromText="180" w:vertAnchor="text" w:horzAnchor="margin" w:tblpXSpec="right" w:tblpY="76"/>
+        <w:tblW w:w="6521" w:type="dxa"/>
+        <w:tblBorders>
+          <w:top w:val="nil"/>
+          <w:left w:val="nil"/>
+          <w:bottom w:val="nil"/>
+          <w:right w:val="nil"/>
+          <w:insideH w:val="nil"/>
+          <w:insideV w:val="nil"/>
+        </w:tblBorders>
+        <w:tblLayout w:type="fixed"/>
+        <w:tblLook w:val="04A0" w:firstRow="1" w:lastRow="0" w:firstColumn="1" w:lastColumn="0" w:noHBand="0" w:noVBand="1"/>
+      </w:tblPr>
+      <w:tblGrid>
+        <w:gridCol w:w="6521"/>
+      </w:tblGrid>
+      <w:tr>
+        <w:trPr>
+          <w:trHeight w:hRule="exact" w:val="383"/>
+        </w:trPr>
+        <w:tc>
+          <w:tcPr>
+            <w:tcW w:w="6521" w:type="dxa"/>
+            <w:tcBorders>
+              <w:top w:val="nil"/>
+              <w:left w:val="nil"/>
+              <w:bottom w:val="single" w:sz="4" w:space="0" w:color="000000"/>
+              <w:right w:val="nil"/>
+            </w:tcBorders>
+            <w:vAlign w:val="bottom"/>
+          </w:tcPr>
+          <w:p>
+            <w:pPr>
+              <w:spacing w:line="220" w:lineRule="exact"/>
+            </w:pPr>
+            <w:r>
+              <w:rPr>
+                <w:rFonts w:ascii="Arial" w:eastAsia="Arial" w:hAnsi="Arial" w:cs="Arial"/>
+                <w:sz w:val="22"/>
+                <w:szCs w:val="22"/>
+              </w:rPr>
+              <w:t xml:space="preserve">            </w:t>
+            </w:r>
+            <w:r>
+              <w:rPr>
+                <w:rFonts w:ascii="Arial" w:eastAsia="Arial" w:hAnsi="Arial" w:cs="Arial"/>
+                <w:sz w:val="22"/>
+                <w:szCs w:val="22"/>
+              </w:rPr>
+              <w:t>{{CustomerNamePosition1}}</w:t>
+            </w:r>
+          </w:p>
+        </w:tc>
+      </w:tr>
+    </w:tbl>
+    <w:p>
+      <w:pPr>
         <w:tabs>
           <w:tab w:val="left" w:pos="-284"/>
           <w:tab w:val="left" w:pos="284"/>
         </w:tabs>
-        <w:ind w:left="5387"/>
-      </w:pPr>
-      <w:r>
-        <w:t xml:space="preserve">{{ApproverPosition}}</w:t>
-      </w:r>
+      </w:pPr>
     </w:p>
     <w:p>
       <w:pPr>
+        <w:spacing w:line="220" w:lineRule="exact"/>
+      </w:pPr>
+      <w:r>
+        <w:rPr>
+          <w:rFonts w:ascii="Arial" w:eastAsia="Arial" w:hAnsi="Arial" w:cs="Arial"/>
+          <w:sz w:val="22"/>
+          <w:szCs w:val="22"/>
+        </w:rPr>
+        <w:t>и представитель заказчика</w:t>
+      </w:r>
+    </w:p>
+    <w:p>
+      <w:pPr>
+        <w:spacing w:line="220" w:lineRule="exact"/>
+        <w:jc w:val="center"/>
+        <w:rPr>
+          <w:rFonts w:ascii="Arial" w:eastAsia="Arial" w:hAnsi="Arial" w:cs="Arial"/>
+          <w:sz w:val="18"/>
+          <w:szCs w:val="18"/>
+        </w:rPr>
+      </w:pPr>
+      <w:r>
+        <w:rPr>
+          <w:rFonts w:ascii="Arial" w:eastAsia="Arial" w:hAnsi="Arial" w:cs="Arial"/>
+          <w:sz w:val="18"/>
+          <w:szCs w:val="18"/>
+        </w:rPr>
+        <w:t xml:space="preserve">                               </w:t>
+      </w:r>
+      <w:r>
+        <w:rPr>
+          <w:rFonts w:ascii="Arial" w:eastAsia="Arial" w:hAnsi="Arial" w:cs="Arial"/>
+          <w:sz w:val="18"/>
+          <w:szCs w:val="18"/>
+        </w:rPr>
+        <w:tab/>
+      </w:r>
+      <w:r>
+        <w:rPr>
+          <w:rFonts w:ascii="Arial" w:eastAsia="Arial" w:hAnsi="Arial" w:cs="Arial"/>
+          <w:sz w:val="18"/>
+          <w:szCs w:val="18"/>
+        </w:rPr>
+        <w:tab/>
+      </w:r>
+      <w:r>
+        <w:rPr>
+          <w:rFonts w:ascii="Arial" w:eastAsia="Arial" w:hAnsi="Arial" w:cs="Arial"/>
+          <w:sz w:val="18"/>
+          <w:szCs w:val="18"/>
+        </w:rPr>
+        <w:t>Ф.И.О, должность лица, подавшего заявку или начальника</w:t>
+      </w:r>
+      <w:r>
+        <w:rPr>
+          <w:rFonts w:ascii="Arial" w:eastAsia="Arial" w:hAnsi="Arial" w:cs="Arial"/>
+          <w:sz w:val="18"/>
+          <w:szCs w:val="18"/>
+        </w:rPr>
+        <w:t xml:space="preserve"> п</w:t>
+      </w:r>
+      <w:r>
+        <w:rPr>
+          <w:rFonts w:ascii="Arial" w:eastAsia="Arial" w:hAnsi="Arial" w:cs="Arial"/>
+          <w:sz w:val="18"/>
+          <w:szCs w:val="18"/>
+        </w:rPr>
+        <w:t>одразделения,</w:t>
+      </w:r>
+    </w:p>
+    <w:p>
+      <w:pPr>
+        <w:spacing w:line="220" w:lineRule="exact"/>
+        <w:ind w:left="3000"/>
+        <w:jc w:val="both"/>
+        <w:rPr>
+          <w:rFonts w:ascii="Arial" w:eastAsia="Arial" w:hAnsi="Arial" w:cs="Arial"/>
+          <w:sz w:val="18"/>
+          <w:szCs w:val="18"/>
+        </w:rPr>
+      </w:pPr>
+      <w:r>
+        <w:rPr>
+          <w:rFonts w:ascii="Arial" w:eastAsia="Arial" w:hAnsi="Arial" w:cs="Arial"/>
+          <w:sz w:val="18"/>
+          <w:szCs w:val="18"/>
+        </w:rPr>
+        <w:t xml:space="preserve">направившего служебную записку или ответственного лица за приемку по </w:t>
+      </w:r>
+      <w:r>
+        <w:rPr>
+          <w:rFonts w:ascii="Arial" w:eastAsia="Arial" w:hAnsi="Arial" w:cs="Arial"/>
+          <w:sz w:val="18"/>
+          <w:szCs w:val="18"/>
+        </w:rPr>
+        <w:t xml:space="preserve">                                 </w:t>
+      </w:r>
+      <w:r>
+        <w:rPr>
+          <w:rFonts w:ascii="Arial" w:eastAsia="Arial" w:hAnsi="Arial" w:cs="Arial"/>
+          <w:sz w:val="18"/>
+          <w:szCs w:val="18"/>
+        </w:rPr>
+        <w:t>иному документу</w:t>
+      </w:r>
+    </w:p>
+    <w:p>
+      <w:pPr>
         <w:tabs>
           <w:tab w:val="left" w:pos="-284"/>
           <w:tab w:val="left" w:pos="284"/>
         </w:tabs>
-        <w:ind w:left="5387"/>
+        <w:jc w:val="center"/>
+        <w:rPr>
+          <w:sz w:val="16"/>
+          <w:szCs w:val="16"/>
+        </w:rPr>
       </w:pPr>
     </w:p>
     <w:p>
@@ -50,32 +995,747 @@
           <w:tab w:val="left" w:pos="-284"/>
           <w:tab w:val="left" w:pos="284"/>
         </w:tabs>
-        <w:ind w:left="5387"/>
-      </w:pPr>
-      <w:r>
-        <w:rPr>
-          <w:u w:val="single"/>
-        </w:rPr>
-        <w:t xml:space="preserve">__________________{{ApproverName}}</w:t>
-      </w:r>
+        <w:jc w:val="center"/>
+        <w:rPr>
+          <w:sz w:val="16"/>
+          <w:szCs w:val="16"/>
+        </w:rPr>
+      </w:pPr>
     </w:p>
     <w:p>
       <w:pPr>
+        <w:spacing w:line="220" w:lineRule="exact"/>
+      </w:pPr>
+      <w:r>
+        <w:rPr>
+          <w:rFonts w:ascii="Arial" w:eastAsia="Arial" w:hAnsi="Arial" w:cs="Arial"/>
+          <w:sz w:val="22"/>
+          <w:szCs w:val="22"/>
+        </w:rPr>
+        <w:t>Провели осмотр и проверку выполненных работ и установили:</w:t>
+      </w:r>
+    </w:p>
+    <w:tbl>
+      <w:tblPr>
+        <w:tblW w:w="9781" w:type="dxa"/>
+        <w:tblBorders>
+          <w:top w:val="nil"/>
+          <w:left w:val="nil"/>
+          <w:bottom w:val="nil"/>
+          <w:right w:val="nil"/>
+          <w:insideH w:val="nil"/>
+          <w:insideV w:val="nil"/>
+        </w:tblBorders>
+        <w:tblLayout w:type="fixed"/>
+        <w:tblCellMar>
+          <w:left w:w="0" w:type="dxa"/>
+          <w:right w:w="0" w:type="dxa"/>
+        </w:tblCellMar>
+        <w:tblLook w:val="04A0" w:firstRow="1" w:lastRow="0" w:firstColumn="1" w:lastColumn="0" w:noHBand="0" w:noVBand="1"/>
+      </w:tblPr>
+      <w:tblGrid>
+        <w:gridCol w:w="9781"/>
+      </w:tblGrid>
+      <w:tr>
+        <w:trPr>
+          <w:trHeight w:hRule="exact" w:val="400"/>
+        </w:trPr>
+        <w:tc>
+          <w:tcPr>
+            <w:tcW w:w="9781" w:type="dxa"/>
+            <w:tcBorders>
+              <w:top w:val="nil"/>
+              <w:left w:val="nil"/>
+              <w:bottom w:val="single" w:sz="4" w:space="0" w:color="000000"/>
+              <w:right w:val="nil"/>
+            </w:tcBorders>
+            <w:vAlign w:val="bottom"/>
+          </w:tcPr>
+          <w:p>
+            <w:pPr>
+              <w:spacing w:line="220" w:lineRule="exact"/>
+            </w:pPr>
+            <w:r>
+              <w:rPr>
+                <w:rFonts w:ascii="Arial" w:eastAsia="Arial" w:hAnsi="Arial" w:cs="Arial"/>
+                <w:sz w:val="22"/>
+                <w:szCs w:val="22"/>
+              </w:rPr>
+              <w:t xml:space="preserve">  </w:t>
+            </w:r>
+            <w:r>
+              <w:rPr>
+                <w:rFonts w:ascii="Arial" w:eastAsia="Arial" w:hAnsi="Arial" w:cs="Arial"/>
+                <w:sz w:val="22"/>
+                <w:szCs w:val="22"/>
+              </w:rPr>
+              <w:t>{{InspectionResultLine1}}</w:t>
+            </w:r>
+          </w:p>
+        </w:tc>
+      </w:tr>
+      <w:tr>
+        <w:trPr>
+          <w:trHeight w:hRule="exact" w:val="400"/>
+        </w:trPr>
+        <w:tc>
+          <w:tcPr>
+            <w:tcW w:w="9781" w:type="dxa"/>
+            <w:tcBorders>
+              <w:top w:val="nil"/>
+              <w:left w:val="nil"/>
+              <w:bottom w:val="single" w:sz="4" w:space="0" w:color="000000"/>
+              <w:right w:val="nil"/>
+            </w:tcBorders>
+            <w:vAlign w:val="bottom"/>
+          </w:tcPr>
+          <w:p>
+            <w:pPr>
+              <w:spacing w:line="220" w:lineRule="exact"/>
+            </w:pPr>
+            <w:r>
+              <w:rPr>
+                <w:rFonts w:ascii="Arial" w:eastAsia="Arial" w:hAnsi="Arial" w:cs="Arial"/>
+                <w:sz w:val="22"/>
+                <w:szCs w:val="22"/>
+              </w:rPr>
+              <w:t xml:space="preserve">  </w:t>
+            </w:r>
+            <w:r>
+              <w:rPr>
+                <w:rFonts w:ascii="Arial" w:eastAsia="Arial" w:hAnsi="Arial" w:cs="Arial"/>
+                <w:sz w:val="22"/>
+                <w:szCs w:val="22"/>
+              </w:rPr>
+              <w:t>{{InspectionResultLine2}}</w:t>
+            </w:r>
+          </w:p>
+        </w:tc>
+      </w:tr>
+      <w:tr>
+        <w:trPr>
+          <w:trHeight w:hRule="exact" w:val="400"/>
+        </w:trPr>
+        <w:tc>
+          <w:tcPr>
+            <w:tcW w:w="9781" w:type="dxa"/>
+            <w:tcBorders>
+              <w:top w:val="nil"/>
+              <w:left w:val="nil"/>
+              <w:bottom w:val="single" w:sz="4" w:space="0" w:color="000000"/>
+              <w:right w:val="nil"/>
+            </w:tcBorders>
+            <w:vAlign w:val="bottom"/>
+          </w:tcPr>
+          <w:p>
+            <w:pPr>
+              <w:spacing w:line="220" w:lineRule="exact"/>
+            </w:pPr>
+            <w:r>
+              <w:rPr>
+                <w:rFonts w:ascii="Arial" w:eastAsia="Arial" w:hAnsi="Arial" w:cs="Arial"/>
+                <w:sz w:val="22"/>
+                <w:szCs w:val="22"/>
+              </w:rPr>
+              <w:t xml:space="preserve">  </w:t>
+            </w:r>
+            <w:r>
+              <w:rPr>
+                <w:rFonts w:ascii="Arial" w:eastAsia="Arial" w:hAnsi="Arial" w:cs="Arial"/>
+                <w:sz w:val="22"/>
+                <w:szCs w:val="22"/>
+              </w:rPr>
+              <w:t>{{InspectionResultLine3}}</w:t>
+            </w:r>
+          </w:p>
+        </w:tc>
+      </w:tr>
+      <w:tr>
+        <w:trPr>
+          <w:trHeight w:hRule="exact" w:val="400"/>
+        </w:trPr>
+        <w:tc>
+          <w:tcPr>
+            <w:tcW w:w="9781" w:type="dxa"/>
+            <w:tcBorders>
+              <w:top w:val="nil"/>
+              <w:left w:val="nil"/>
+              <w:bottom w:val="single" w:sz="4" w:space="0" w:color="000000"/>
+              <w:right w:val="nil"/>
+            </w:tcBorders>
+            <w:vAlign w:val="bottom"/>
+          </w:tcPr>
+          <w:p>
+            <w:pPr>
+              <w:spacing w:line="220" w:lineRule="exact"/>
+            </w:pPr>
+            <w:r>
+              <w:rPr>
+                <w:rFonts w:ascii="Arial" w:eastAsia="Arial" w:hAnsi="Arial" w:cs="Arial"/>
+                <w:sz w:val="22"/>
+                <w:szCs w:val="22"/>
+              </w:rPr>
+              <w:t xml:space="preserve">  </w:t>
+            </w:r>
+            <w:r>
+              <w:rPr>
+                <w:rFonts w:ascii="Arial" w:eastAsia="Arial" w:hAnsi="Arial" w:cs="Arial"/>
+                <w:sz w:val="22"/>
+                <w:szCs w:val="22"/>
+              </w:rPr>
+              <w:t>{{InspectionResultLine4}}</w:t>
+            </w:r>
+          </w:p>
+        </w:tc>
+      </w:tr>
+      <w:tr>
+        <w:trPr>
+          <w:trHeight w:hRule="exact" w:val="400"/>
+        </w:trPr>
+        <w:tc>
+          <w:tcPr>
+            <w:tcW w:w="9781" w:type="dxa"/>
+            <w:tcBorders>
+              <w:top w:val="nil"/>
+              <w:left w:val="nil"/>
+              <w:bottom w:val="single" w:sz="4" w:space="0" w:color="000000"/>
+              <w:right w:val="nil"/>
+            </w:tcBorders>
+            <w:vAlign w:val="bottom"/>
+          </w:tcPr>
+          <w:p>
+            <w:pPr>
+              <w:spacing w:line="220" w:lineRule="exact"/>
+            </w:pPr>
+            <w:r>
+              <w:rPr>
+                <w:rFonts w:ascii="Arial" w:eastAsia="Arial" w:hAnsi="Arial" w:cs="Arial"/>
+                <w:sz w:val="22"/>
+                <w:szCs w:val="22"/>
+              </w:rPr>
+              <w:t xml:space="preserve">  </w:t>
+            </w:r>
+            <w:r>
+              <w:rPr>
+                <w:rFonts w:ascii="Arial" w:eastAsia="Arial" w:hAnsi="Arial" w:cs="Arial"/>
+                <w:sz w:val="22"/>
+                <w:szCs w:val="22"/>
+              </w:rPr>
+              <w:t>{{InspectionResultLine5}}</w:t>
+            </w:r>
+          </w:p>
+        </w:tc>
+      </w:tr>
+      <w:tr>
+        <w:trPr>
+          <w:trHeight w:hRule="exact" w:val="400"/>
+        </w:trPr>
+        <w:tc>
+          <w:tcPr>
+            <w:tcW w:w="9781" w:type="dxa"/>
+            <w:tcBorders>
+              <w:top w:val="nil"/>
+              <w:left w:val="nil"/>
+              <w:bottom w:val="single" w:sz="4" w:space="0" w:color="000000"/>
+              <w:right w:val="nil"/>
+            </w:tcBorders>
+            <w:vAlign w:val="bottom"/>
+          </w:tcPr>
+          <w:p>
+            <w:pPr>
+              <w:spacing w:line="220" w:lineRule="exact"/>
+            </w:pPr>
+            <w:r>
+              <w:rPr>
+                <w:rFonts w:ascii="Arial" w:eastAsia="Arial" w:hAnsi="Arial" w:cs="Arial"/>
+                <w:sz w:val="22"/>
+                <w:szCs w:val="22"/>
+              </w:rPr>
+              <w:t xml:space="preserve">  </w:t>
+            </w:r>
+            <w:bookmarkStart w:id="0" w:name="_GoBack"/>
+            <w:bookmarkEnd w:id="0"/>
+            <w:r>
+              <w:rPr>
+                <w:rFonts w:ascii="Arial" w:eastAsia="Arial" w:hAnsi="Arial" w:cs="Arial"/>
+                <w:sz w:val="22"/>
+                <w:szCs w:val="22"/>
+              </w:rPr>
+              <w:t>{{InspectionResultLine6}}</w:t>
+            </w:r>
+          </w:p>
+        </w:tc>
+      </w:tr>
+    </w:tbl>
+    <w:p>
+      <w:pPr>
+        <w:spacing w:line="220" w:lineRule="exact"/>
+        <w:jc w:val="center"/>
+      </w:pPr>
+      <w:r>
+        <w:rPr>
+          <w:rFonts w:ascii="Arial" w:eastAsia="Arial" w:hAnsi="Arial" w:cs="Arial"/>
+          <w:sz w:val="18"/>
+          <w:szCs w:val="18"/>
+        </w:rPr>
+        <w:t>Указать полноту выполненных работ, оценку их качества, состояние на момент окончания работ.</w:t>
+      </w:r>
+    </w:p>
+    <w:tbl>
+      <w:tblPr>
+        <w:tblW w:w="9781" w:type="dxa"/>
+        <w:tblBorders>
+          <w:top w:val="nil"/>
+          <w:left w:val="nil"/>
+          <w:bottom w:val="nil"/>
+          <w:right w:val="nil"/>
+          <w:insideH w:val="nil"/>
+          <w:insideV w:val="nil"/>
+        </w:tblBorders>
+        <w:tblLayout w:type="fixed"/>
+        <w:tblLook w:val="04A0" w:firstRow="1" w:lastRow="0" w:firstColumn="1" w:lastColumn="0" w:noHBand="0" w:noVBand="1"/>
+      </w:tblPr>
+      <w:tblGrid>
+        <w:gridCol w:w="9781"/>
+      </w:tblGrid>
+      <w:tr>
+        <w:trPr>
+          <w:trHeight w:hRule="exact" w:val="557"/>
+        </w:trPr>
+        <w:tc>
+          <w:tcPr>
+            <w:tcW w:w="9781" w:type="dxa"/>
+            <w:tcBorders>
+              <w:top w:val="nil"/>
+              <w:left w:val="nil"/>
+              <w:bottom w:val="single" w:sz="4" w:space="0" w:color="000000"/>
+              <w:right w:val="nil"/>
+            </w:tcBorders>
+            <w:vAlign w:val="bottom"/>
+          </w:tcPr>
+          <w:p>
+            <w:pPr>
+              <w:spacing w:line="220" w:lineRule="exact"/>
+            </w:pPr>
+            <w:r>
+              <w:rPr>
+                <w:rFonts w:ascii="Arial" w:eastAsia="Arial" w:hAnsi="Arial" w:cs="Arial"/>
+                <w:sz w:val="22"/>
+                <w:szCs w:val="22"/>
+              </w:rPr>
+              <w:t>{{</w:t>
+            </w:r>
+            <w:proofErr w:type="spellStart"/>
+            <w:r>
+              <w:rPr>
+                <w:rFonts w:ascii="Arial" w:eastAsia="Arial" w:hAnsi="Arial" w:cs="Arial"/>
+                <w:sz w:val="22"/>
+                <w:szCs w:val="22"/>
+              </w:rPr>
+              <w:t>TransferredToLine</w:t>
+            </w:r>
+            <w:proofErr w:type="spellEnd"/>
+            <w:r>
+              <w:rPr>
+                <w:rFonts w:ascii="Arial" w:eastAsia="Arial" w:hAnsi="Arial" w:cs="Arial"/>
+                <w:sz w:val="22"/>
+                <w:szCs w:val="22"/>
+              </w:rPr>
+              <w:t>}}</w:t>
+            </w:r>
+          </w:p>
+        </w:tc>
+      </w:tr>
+    </w:tbl>
+    <w:p>
+      <w:pPr>
+        <w:spacing w:line="220" w:lineRule="exact"/>
+        <w:jc w:val="center"/>
+      </w:pPr>
+      <w:r>
+        <w:rPr>
+          <w:rFonts w:ascii="Arial" w:eastAsia="Arial" w:hAnsi="Arial" w:cs="Arial"/>
+          <w:sz w:val="18"/>
+          <w:szCs w:val="18"/>
+        </w:rPr>
+        <w:t xml:space="preserve">В какую службу, подразделение переданы работы по выполнению </w:t>
+      </w:r>
+      <w:r>
+        <w:rPr>
+          <w:rFonts w:ascii="Arial" w:eastAsia="Arial" w:hAnsi="Arial" w:cs="Arial"/>
+          <w:sz w:val="18"/>
+          <w:szCs w:val="18"/>
+        </w:rPr>
+        <w:t>заявки.</w:t>
+      </w:r>
+    </w:p>
+    <w:p>
+      <w:pPr>
         <w:tabs>
           <w:tab w:val="left" w:pos="-284"/>
           <w:tab w:val="left" w:pos="284"/>
         </w:tabs>
-        <w:ind w:left="5387"/>
-      </w:pPr>
-      <w:r>
-        <w:rPr>
-          <w:u w:val="single"/>
-        </w:rPr>
-        <w:t xml:space="preserve">____________________{{ActDate}}</w:t>
-      </w:r>
-      <w:r>
-        <w:t xml:space="preserve"> г.</w:t>
-      </w:r>
+      </w:pPr>
+    </w:p>
+    <w:tbl>
+      <w:tblPr>
+        <w:tblW w:w="0" w:type="auto"/>
+        <w:tblBorders>
+          <w:top w:val="nil"/>
+          <w:left w:val="nil"/>
+          <w:bottom w:val="nil"/>
+          <w:right w:val="nil"/>
+          <w:insideH w:val="nil"/>
+          <w:insideV w:val="nil"/>
+        </w:tblBorders>
+        <w:tblLayout w:type="fixed"/>
+        <w:tblLook w:val="04A0" w:firstRow="1" w:lastRow="0" w:firstColumn="1" w:lastColumn="0" w:noHBand="0" w:noVBand="1"/>
+      </w:tblPr>
+      <w:tblGrid>
+        <w:gridCol w:w="1800"/>
+        <w:gridCol w:w="2800"/>
+        <w:gridCol w:w="2200"/>
+        <w:gridCol w:w="3000"/>
+      </w:tblGrid>
+      <w:tr>
+        <w:trPr>
+          <w:trHeight w:hRule="exact" w:val="260"/>
+        </w:trPr>
+        <w:tc>
+          <w:tcPr>
+            <w:tcW w:w="1800" w:type="dxa"/>
+            <w:tcBorders>
+              <w:top w:val="nil"/>
+              <w:left w:val="nil"/>
+              <w:bottom w:val="nil"/>
+              <w:right w:val="nil"/>
+            </w:tcBorders>
+            <w:vAlign w:val="bottom"/>
+          </w:tcPr>
+          <w:p>
+            <w:pPr>
+              <w:spacing w:line="220" w:lineRule="exact"/>
+            </w:pPr>
+            <w:r>
+              <w:rPr>
+                <w:rFonts w:ascii="Arial" w:eastAsia="Arial" w:hAnsi="Arial" w:cs="Arial"/>
+                <w:sz w:val="22"/>
+                <w:szCs w:val="22"/>
+              </w:rPr>
+              <w:t>Начало работ</w:t>
+            </w:r>
+          </w:p>
+        </w:tc>
+        <w:tc>
+          <w:tcPr>
+            <w:tcW w:w="2800" w:type="dxa"/>
+            <w:tcBorders>
+              <w:top w:val="nil"/>
+              <w:left w:val="nil"/>
+              <w:bottom w:val="single" w:sz="4" w:space="0" w:color="000000"/>
+              <w:right w:val="nil"/>
+            </w:tcBorders>
+            <w:vAlign w:val="bottom"/>
+          </w:tcPr>
+          <w:p>
+            <w:pPr>
+              <w:spacing w:line="220" w:lineRule="exact"/>
+            </w:pPr>
+            <w:r>
+              <w:rPr>
+                <w:rFonts w:ascii="Arial" w:eastAsia="Arial" w:hAnsi="Arial" w:cs="Arial"/>
+                <w:sz w:val="22"/>
+                <w:szCs w:val="22"/>
+              </w:rPr>
+              <w:t>{{WorkStart}}</w:t>
+            </w:r>
+          </w:p>
+        </w:tc>
+        <w:tc>
+          <w:tcPr>
+            <w:tcW w:w="2200" w:type="dxa"/>
+            <w:tcBorders>
+              <w:top w:val="nil"/>
+              <w:left w:val="nil"/>
+              <w:bottom w:val="nil"/>
+              <w:right w:val="nil"/>
+            </w:tcBorders>
+            <w:vAlign w:val="bottom"/>
+          </w:tcPr>
+          <w:p>
+            <w:pPr>
+              <w:spacing w:line="220" w:lineRule="exact"/>
+            </w:pPr>
+            <w:r>
+              <w:rPr>
+                <w:rFonts w:ascii="Arial" w:eastAsia="Arial" w:hAnsi="Arial" w:cs="Arial"/>
+                <w:sz w:val="22"/>
+                <w:szCs w:val="22"/>
+              </w:rPr>
+              <w:t>Окончание работ</w:t>
+            </w:r>
+          </w:p>
+        </w:tc>
+        <w:tc>
+          <w:tcPr>
+            <w:tcW w:w="3000" w:type="dxa"/>
+            <w:tcBorders>
+              <w:top w:val="nil"/>
+              <w:left w:val="nil"/>
+              <w:bottom w:val="single" w:sz="4" w:space="0" w:color="000000"/>
+              <w:right w:val="nil"/>
+            </w:tcBorders>
+            <w:vAlign w:val="bottom"/>
+          </w:tcPr>
+          <w:p>
+            <w:pPr>
+              <w:spacing w:line="220" w:lineRule="exact"/>
+            </w:pPr>
+            <w:r>
+              <w:rPr>
+                <w:rFonts w:ascii="Arial" w:eastAsia="Arial" w:hAnsi="Arial" w:cs="Arial"/>
+                <w:sz w:val="22"/>
+                <w:szCs w:val="22"/>
+              </w:rPr>
+              <w:t>{{WorkEnd}}</w:t>
+            </w:r>
+          </w:p>
+        </w:tc>
+      </w:tr>
+    </w:tbl>
+    <w:p>
+      <w:pPr>
+        <w:tabs>
+          <w:tab w:val="left" w:pos="-284"/>
+          <w:tab w:val="left" w:pos="284"/>
+        </w:tabs>
+      </w:pPr>
+      <w:r>
+        <w:rPr>
+          <w:rFonts w:ascii="Arial" w:eastAsia="Arial" w:hAnsi="Arial" w:cs="Arial"/>
+          <w:sz w:val="18"/>
+          <w:szCs w:val="18"/>
+        </w:rPr>
+        <w:tab/>
+      </w:r>
+      <w:r>
+        <w:rPr>
+          <w:rFonts w:ascii="Arial" w:eastAsia="Arial" w:hAnsi="Arial" w:cs="Arial"/>
+          <w:sz w:val="18"/>
+          <w:szCs w:val="18"/>
+        </w:rPr>
+        <w:tab/>
+      </w:r>
+      <w:r>
+        <w:rPr>
+          <w:rFonts w:ascii="Arial" w:eastAsia="Arial" w:hAnsi="Arial" w:cs="Arial"/>
+          <w:sz w:val="18"/>
+          <w:szCs w:val="18"/>
+        </w:rPr>
+        <w:tab/>
+      </w:r>
+      <w:r>
+        <w:rPr>
+          <w:rFonts w:ascii="Arial" w:eastAsia="Arial" w:hAnsi="Arial" w:cs="Arial"/>
+          <w:sz w:val="18"/>
+          <w:szCs w:val="18"/>
+        </w:rPr>
+        <w:tab/>
+      </w:r>
+      <w:r>
+        <w:rPr>
+          <w:rFonts w:ascii="Arial" w:eastAsia="Arial" w:hAnsi="Arial" w:cs="Arial"/>
+          <w:sz w:val="18"/>
+          <w:szCs w:val="18"/>
+        </w:rPr>
+        <w:t>Дата, время</w:t>
+      </w:r>
+      <w:r>
+        <w:rPr>
+          <w:rFonts w:ascii="Arial" w:eastAsia="Arial" w:hAnsi="Arial" w:cs="Arial"/>
+          <w:sz w:val="18"/>
+          <w:szCs w:val="18"/>
+        </w:rPr>
+        <w:tab/>
+      </w:r>
+      <w:r>
+        <w:rPr>
+          <w:rFonts w:ascii="Arial" w:eastAsia="Arial" w:hAnsi="Arial" w:cs="Arial"/>
+          <w:sz w:val="18"/>
+          <w:szCs w:val="18"/>
+        </w:rPr>
+        <w:tab/>
+      </w:r>
+      <w:r>
+        <w:rPr>
+          <w:rFonts w:ascii="Arial" w:eastAsia="Arial" w:hAnsi="Arial" w:cs="Arial"/>
+          <w:sz w:val="18"/>
+          <w:szCs w:val="18"/>
+        </w:rPr>
+        <w:tab/>
+      </w:r>
+      <w:r>
+        <w:rPr>
+          <w:rFonts w:ascii="Arial" w:eastAsia="Arial" w:hAnsi="Arial" w:cs="Arial"/>
+          <w:sz w:val="18"/>
+          <w:szCs w:val="18"/>
+        </w:rPr>
+        <w:tab/>
+      </w:r>
+      <w:r>
+        <w:rPr>
+          <w:rFonts w:ascii="Arial" w:eastAsia="Arial" w:hAnsi="Arial" w:cs="Arial"/>
+          <w:sz w:val="18"/>
+          <w:szCs w:val="18"/>
+        </w:rPr>
+        <w:tab/>
+      </w:r>
+      <w:r>
+        <w:rPr>
+          <w:rFonts w:ascii="Arial" w:eastAsia="Arial" w:hAnsi="Arial" w:cs="Arial"/>
+          <w:sz w:val="18"/>
+          <w:szCs w:val="18"/>
+        </w:rPr>
+        <w:tab/>
+      </w:r>
+      <w:r>
+        <w:rPr>
+          <w:rFonts w:ascii="Arial" w:eastAsia="Arial" w:hAnsi="Arial" w:cs="Arial"/>
+          <w:sz w:val="18"/>
+          <w:szCs w:val="18"/>
+        </w:rPr>
+        <w:t>Дата, время</w:t>
+      </w:r>
+      <w:r>
+        <w:rPr>
+          <w:rFonts w:ascii="Arial" w:eastAsia="Arial" w:hAnsi="Arial" w:cs="Arial"/>
+          <w:sz w:val="18"/>
+          <w:szCs w:val="18"/>
+        </w:rPr>
+        <w:br/>
+      </w:r>
+    </w:p>
+    <w:tbl>
+      <w:tblPr>
+        <w:tblW w:w="9781" w:type="dxa"/>
+        <w:tblBorders>
+          <w:top w:val="nil"/>
+          <w:left w:val="nil"/>
+          <w:bottom w:val="nil"/>
+          <w:right w:val="nil"/>
+          <w:insideH w:val="nil"/>
+          <w:insideV w:val="nil"/>
+        </w:tblBorders>
+        <w:tblLayout w:type="fixed"/>
+        <w:tblCellMar>
+          <w:left w:w="0" w:type="dxa"/>
+          <w:right w:w="0" w:type="dxa"/>
+        </w:tblCellMar>
+        <w:tblLook w:val="04A0" w:firstRow="1" w:lastRow="0" w:firstColumn="1" w:lastColumn="0" w:noHBand="0" w:noVBand="1"/>
+      </w:tblPr>
+      <w:tblGrid>
+        <w:gridCol w:w="3544"/>
+        <w:gridCol w:w="6237"/>
+      </w:tblGrid>
+      <w:tr>
+        <w:trPr>
+          <w:trHeight w:hRule="exact" w:val="260"/>
+        </w:trPr>
+        <w:tc>
+          <w:tcPr>
+            <w:tcW w:w="3544" w:type="dxa"/>
+            <w:tcBorders>
+              <w:top w:val="nil"/>
+              <w:left w:val="nil"/>
+              <w:bottom w:val="nil"/>
+              <w:right w:val="nil"/>
+            </w:tcBorders>
+            <w:vAlign w:val="bottom"/>
+          </w:tcPr>
+          <w:p>
+            <w:pPr>
+              <w:spacing w:line="220" w:lineRule="exact"/>
+            </w:pPr>
+            <w:r>
+              <w:rPr>
+                <w:rFonts w:ascii="Arial" w:eastAsia="Arial" w:hAnsi="Arial" w:cs="Arial"/>
+                <w:sz w:val="22"/>
+                <w:szCs w:val="22"/>
+              </w:rPr>
+              <w:t>Фактическая трудоемкость работ</w:t>
+            </w:r>
+          </w:p>
+        </w:tc>
+        <w:tc>
+          <w:tcPr>
+            <w:tcW w:w="6237" w:type="dxa"/>
+            <w:tcBorders>
+              <w:top w:val="nil"/>
+              <w:left w:val="nil"/>
+              <w:bottom w:val="single" w:sz="4" w:space="0" w:color="000000"/>
+              <w:right w:val="nil"/>
+            </w:tcBorders>
+            <w:vAlign w:val="bottom"/>
+          </w:tcPr>
+          <w:p>
+            <w:pPr>
+              <w:spacing w:line="220" w:lineRule="exact"/>
+            </w:pPr>
+            <w:r>
+              <w:rPr>
+                <w:rFonts w:ascii="Arial" w:eastAsia="Arial" w:hAnsi="Arial" w:cs="Arial"/>
+                <w:sz w:val="22"/>
+                <w:szCs w:val="22"/>
+              </w:rPr>
+              <w:t xml:space="preserve">  </w:t>
+            </w:r>
+            <w:r>
+              <w:rPr>
+                <w:rFonts w:ascii="Arial" w:eastAsia="Arial" w:hAnsi="Arial" w:cs="Arial"/>
+                <w:sz w:val="22"/>
+                <w:szCs w:val="22"/>
+              </w:rPr>
+              <w:t>{{</w:t>
+            </w:r>
+            <w:proofErr w:type="spellStart"/>
+            <w:r>
+              <w:rPr>
+                <w:rFonts w:ascii="Arial" w:eastAsia="Arial" w:hAnsi="Arial" w:cs="Arial"/>
+                <w:sz w:val="22"/>
+                <w:szCs w:val="22"/>
+              </w:rPr>
+              <w:t>ActualLaborHours</w:t>
+            </w:r>
+            <w:proofErr w:type="spellEnd"/>
+            <w:r>
+              <w:rPr>
+                <w:rFonts w:ascii="Arial" w:eastAsia="Arial" w:hAnsi="Arial" w:cs="Arial"/>
+                <w:sz w:val="22"/>
+                <w:szCs w:val="22"/>
+              </w:rPr>
+              <w:t xml:space="preserve">}} </w:t>
+            </w:r>
+            <w:proofErr w:type="spellStart"/>
+            <w:r>
+              <w:rPr>
+                <w:rFonts w:ascii="Arial" w:eastAsia="Arial" w:hAnsi="Arial" w:cs="Arial"/>
+                <w:sz w:val="22"/>
+                <w:szCs w:val="22"/>
+              </w:rPr>
+              <w:t>чел.часов</w:t>
+            </w:r>
+            <w:proofErr w:type="spellEnd"/>
+          </w:p>
+        </w:tc>
+      </w:tr>
+    </w:tbl>
+    <w:p>
+      <w:pPr>
+        <w:tabs>
+          <w:tab w:val="left" w:pos="-284"/>
+          <w:tab w:val="left" w:pos="284"/>
+        </w:tabs>
+      </w:pPr>
     </w:p>
     <w:p>
       <w:pPr>
@@ -83,1041 +1743,333 @@
           <w:tab w:val="left" w:pos="-284"/>
           <w:tab w:val="left" w:pos="284"/>
         </w:tabs>
-        <w:jc w:val="center"/>
-      </w:pPr>
-    </w:p>
-    <w:p>
-      <w:pPr>
-        <w:tabs>
-          <w:tab w:val="left" w:pos="-284"/>
-          <w:tab w:val="left" w:pos="284"/>
-        </w:tabs>
-        <w:jc w:val="center"/>
-        <w:outlineLvl w:val="0"/>
-      </w:pPr>
-      <w:r>
-        <w:t>АКТ</w:t>
-      </w:r>
-    </w:p>
-    <w:p>
-      <w:pPr>
-        <w:tabs>
-          <w:tab w:val="left" w:pos="-284"/>
-          <w:tab w:val="left" w:pos="284"/>
-        </w:tabs>
-        <w:jc w:val="center"/>
-      </w:pPr>
-      <w:r>
-        <w:t xml:space="preserve">о приемке выполненных работ от </w:t>
-      </w:r>
-      <w:r>
-        <w:rPr>
-          <w:u w:val="single"/>
-        </w:rPr>
-        <w:t xml:space="preserve">{{ActDate}}</w:t>
-      </w:r>
-    </w:p>
-    <w:p>
-      <w:pPr>
-        <w:tabs>
-          <w:tab w:val="left" w:pos="-284"/>
-          <w:tab w:val="left" w:pos="284"/>
-        </w:tabs>
-        <w:jc w:val="center"/>
-      </w:pPr>
-    </w:p>
-    <w:p>
-      <w:pPr>
-        <w:tabs>
-          <w:tab w:val="left" w:pos="-284"/>
-          <w:tab w:val="left" w:pos="284"/>
-        </w:tabs>
-        <w:rPr>
-          <w:sz w:val="28"/>
-          <w:szCs w:val="28"/>
-        </w:rPr>
-      </w:pPr>
-      <w:r>
-        <w:rPr>
-          <w:u w:val="single"/>
-        </w:rPr>
-        <w:t xml:space="preserve">{{InspectionWorkDescription}}</w:t>
-      </w:r>
-    </w:p>
-    <w:p>
-      <w:pPr>
-        <w:tabs>
-          <w:tab w:val="left" w:pos="-284"/>
-          <w:tab w:val="left" w:pos="284"/>
-        </w:tabs>
-        <w:rPr>
-          <w:sz w:val="28"/>
-          <w:szCs w:val="28"/>
-        </w:rPr>
-      </w:pPr>
-      <w:r>
         <w:rPr>
           <w:sz w:val="16"/>
           <w:szCs w:val="16"/>
         </w:rPr>
-        <w:tab/>
-      </w:r>
-      <w:r>
-        <w:rPr>
-          <w:sz w:val="16"/>
-          <w:szCs w:val="16"/>
-        </w:rPr>
-        <w:tab/>
-        <w:t>Наименование цеха, объекта. Наименование установки, системы. Описание заявки</w:t>
-      </w:r>
-      <w:r>
-        <w:rPr>
-          <w:sz w:val="16"/>
-          <w:szCs w:val="16"/>
-        </w:rPr>
-        <w:t>, неисправности</w:t>
-      </w:r>
-      <w:r>
-        <w:rPr>
-          <w:sz w:val="16"/>
-          <w:szCs w:val="16"/>
-        </w:rPr>
-        <w:t>.</w:t>
-      </w:r>
-      <w:r>
-        <w:rPr>
-          <w:sz w:val="20"/>
-          <w:szCs w:val="20"/>
-        </w:rPr>
-        <w:br/>
-      </w:r>
-      <w:r>
-        <w:rPr>
-          <w:sz w:val="28"/>
-          <w:szCs w:val="28"/>
-        </w:rPr>
-        <w:t>_____________________________________________</w:t>
-      </w:r>
-      <w:r>
-        <w:rPr>
-          <w:sz w:val="28"/>
-          <w:szCs w:val="28"/>
-        </w:rPr>
-        <w:t>____________________</w:t>
-      </w:r>
-      <w:r>
-        <w:rPr>
-          <w:sz w:val="28"/>
-          <w:szCs w:val="28"/>
-        </w:rPr>
-        <w:t>_____________________________________________</w:t>
-      </w:r>
-      <w:r>
-        <w:rPr>
-          <w:sz w:val="28"/>
-          <w:szCs w:val="28"/>
-        </w:rPr>
-        <w:t>_______________</w:t>
-      </w:r>
-      <w:r>
-        <w:rPr>
-          <w:sz w:val="28"/>
-          <w:szCs w:val="28"/>
-        </w:rPr>
-        <w:t>_________</w:t>
-      </w:r>
+      </w:pPr>
     </w:p>
-    <w:p>
-      <w:pPr>
-        <w:tabs>
-          <w:tab w:val="left" w:pos="-284"/>
-          <w:tab w:val="left" w:pos="284"/>
-        </w:tabs>
-        <w:rPr>
-          <w:sz w:val="28"/>
-          <w:szCs w:val="28"/>
-        </w:rPr>
-      </w:pPr>
-      <w:r>
-        <w:rPr>
-          <w:sz w:val="28"/>
-          <w:szCs w:val="28"/>
-        </w:rPr>
-        <w:t>___________________________________________________________</w:t>
-      </w:r>
-      <w:r>
-        <w:rPr>
-          <w:sz w:val="28"/>
-          <w:szCs w:val="28"/>
-        </w:rPr>
-        <w:t>________</w:t>
-      </w:r>
-    </w:p>
-    <w:p>
-      <w:pPr>
-        <w:tabs>
-          <w:tab w:val="left" w:pos="-284"/>
-          <w:tab w:val="left" w:pos="284"/>
-        </w:tabs>
-        <w:rPr>
-          <w:sz w:val="16"/>
-          <w:szCs w:val="16"/>
-        </w:rPr>
-      </w:pPr>
-      <w:r>
-        <w:rPr>
-          <w:sz w:val="16"/>
-          <w:szCs w:val="16"/>
-        </w:rPr>
-        <w:tab/>
-      </w:r>
-    </w:p>
-    <w:p>
-      <w:pPr>
-        <w:tabs>
-          <w:tab w:val="left" w:pos="-284"/>
-          <w:tab w:val="left" w:pos="284"/>
-        </w:tabs>
-      </w:pPr>
-      <w:r>
-        <w:t xml:space="preserve">Основание </w:t>
-      </w:r>
-      <w:r>
-        <w:rPr>
-          <w:u w:val="single"/>
-        </w:rPr>
-        <w:t xml:space="preserve">{{RequestDocument}}</w:t>
-      </w:r>
-    </w:p>
-    <w:p>
-      <w:pPr>
-        <w:tabs>
-          <w:tab w:val="left" w:pos="-284"/>
-          <w:tab w:val="left" w:pos="284"/>
-        </w:tabs>
-        <w:jc w:val="center"/>
-        <w:rPr>
-          <w:sz w:val="16"/>
-          <w:szCs w:val="16"/>
-        </w:rPr>
-      </w:pPr>
-      <w:r>
-        <w:rPr>
-          <w:sz w:val="16"/>
-          <w:szCs w:val="16"/>
-        </w:rPr>
-        <w:tab/>
-      </w:r>
-      <w:r>
-        <w:rPr>
-          <w:sz w:val="16"/>
-          <w:szCs w:val="16"/>
-        </w:rPr>
-        <w:tab/>
-      </w:r>
-      <w:r>
-        <w:rPr>
-          <w:sz w:val="16"/>
-          <w:szCs w:val="16"/>
-        </w:rPr>
-        <w:t>з</w:t>
-      </w:r>
-      <w:r>
-        <w:rPr>
-          <w:sz w:val="16"/>
-          <w:szCs w:val="16"/>
-        </w:rPr>
-        <w:t>аявка</w:t>
-      </w:r>
-      <w:r>
-        <w:rPr>
-          <w:sz w:val="16"/>
-          <w:szCs w:val="16"/>
-        </w:rPr>
-        <w:t>, служебная записка или иной документ,</w:t>
-      </w:r>
-      <w:r>
-        <w:t xml:space="preserve"> </w:t>
-      </w:r>
-      <w:r>
-        <w:rPr>
-          <w:sz w:val="16"/>
-          <w:szCs w:val="16"/>
-        </w:rPr>
-        <w:t>указать наименование подразделения, должность и Ф.И.О лица,</w:t>
-      </w:r>
-      <w:r>
-        <w:br/>
-      </w:r>
-      <w:r>
-        <w:rPr>
-          <w:sz w:val="16"/>
-          <w:szCs w:val="16"/>
-        </w:rPr>
-        <w:t>подавшего заявку, или № сл</w:t>
-      </w:r>
-      <w:r>
-        <w:rPr>
-          <w:sz w:val="16"/>
-          <w:szCs w:val="16"/>
-        </w:rPr>
-        <w:t xml:space="preserve">ужебной </w:t>
-      </w:r>
-      <w:r>
-        <w:rPr>
-          <w:sz w:val="16"/>
-          <w:szCs w:val="16"/>
-        </w:rPr>
-        <w:t>зап</w:t>
-      </w:r>
-      <w:r>
-        <w:rPr>
-          <w:sz w:val="16"/>
-          <w:szCs w:val="16"/>
-        </w:rPr>
-        <w:t>иски,</w:t>
-      </w:r>
-      <w:r>
-        <w:rPr>
-          <w:sz w:val="16"/>
-          <w:szCs w:val="16"/>
-        </w:rPr>
-        <w:t xml:space="preserve"> </w:t>
-      </w:r>
-      <w:r>
-        <w:rPr>
-          <w:sz w:val="16"/>
-          <w:szCs w:val="16"/>
-        </w:rPr>
-        <w:t>или реквизиты иного документа</w:t>
-      </w:r>
-    </w:p>
-    <w:p>
-      <w:pPr>
-        <w:tabs>
-          <w:tab w:val="left" w:pos="-284"/>
-          <w:tab w:val="left" w:pos="284"/>
-        </w:tabs>
-        <w:jc w:val="center"/>
-        <w:rPr>
-          <w:sz w:val="18"/>
-          <w:szCs w:val="18"/>
-        </w:rPr>
-      </w:pPr>
-    </w:p>
-    <w:p>
-      <w:pPr>
-        <w:tabs>
-          <w:tab w:val="left" w:pos="-284"/>
-          <w:tab w:val="left" w:pos="284"/>
-        </w:tabs>
-      </w:pPr>
-      <w:r>
-        <w:t>Мы нижеподписавшиеся:</w:t>
-      </w:r>
-    </w:p>
-    <w:p>
-      <w:pPr>
-        <w:tabs>
-          <w:tab w:val="left" w:pos="-284"/>
-          <w:tab w:val="left" w:pos="284"/>
-        </w:tabs>
-      </w:pPr>
-      <w:r>
-        <w:t xml:space="preserve">представитель исполнителя работ </w:t>
-      </w:r>
-      <w:r>
-        <w:rPr>
-          <w:u w:val="single"/>
-        </w:rPr>
-        <w:t xml:space="preserve">{{Executor1Name}}, {{Executor1Position}}</w:t>
-      </w:r>
-    </w:p>
-    <w:p>
-      <w:pPr>
-        <w:tabs>
-          <w:tab w:val="left" w:pos="-284"/>
-          <w:tab w:val="left" w:pos="284"/>
-        </w:tabs>
-        <w:jc w:val="center"/>
-      </w:pPr>
-      <w:r>
-        <w:rPr>
-          <w:sz w:val="20"/>
-          <w:szCs w:val="20"/>
-        </w:rPr>
-        <w:tab/>
-      </w:r>
-      <w:r>
-        <w:rPr>
-          <w:sz w:val="20"/>
-          <w:szCs w:val="20"/>
-        </w:rPr>
-        <w:tab/>
-      </w:r>
-      <w:r>
-        <w:rPr>
-          <w:sz w:val="20"/>
-          <w:szCs w:val="20"/>
-        </w:rPr>
-        <w:tab/>
-      </w:r>
-      <w:r>
-        <w:rPr>
-          <w:sz w:val="20"/>
-          <w:szCs w:val="20"/>
-        </w:rPr>
-        <w:tab/>
-      </w:r>
-      <w:r>
-        <w:rPr>
-          <w:sz w:val="20"/>
-          <w:szCs w:val="20"/>
-        </w:rPr>
-        <w:tab/>
-      </w:r>
-      <w:r>
-        <w:rPr>
-          <w:sz w:val="20"/>
-          <w:szCs w:val="20"/>
-        </w:rPr>
-        <w:tab/>
-      </w:r>
-      <w:r>
-        <w:rPr>
-          <w:sz w:val="16"/>
-          <w:szCs w:val="16"/>
-        </w:rPr>
-        <w:t>Ф</w:t>
-      </w:r>
-      <w:r>
-        <w:rPr>
-          <w:sz w:val="16"/>
-          <w:szCs w:val="16"/>
-        </w:rPr>
-        <w:t>.</w:t>
-      </w:r>
-      <w:r>
-        <w:rPr>
-          <w:sz w:val="16"/>
-          <w:szCs w:val="16"/>
-        </w:rPr>
-        <w:t>И</w:t>
-      </w:r>
-      <w:r>
-        <w:rPr>
-          <w:sz w:val="16"/>
-          <w:szCs w:val="16"/>
-        </w:rPr>
-        <w:t>.</w:t>
-      </w:r>
-      <w:r>
-        <w:rPr>
-          <w:sz w:val="16"/>
-          <w:szCs w:val="16"/>
-        </w:rPr>
-        <w:t>О, должность, наименование подразделения</w:t>
-      </w:r>
-      <w:r>
-        <w:rPr>
-          <w:sz w:val="20"/>
-          <w:szCs w:val="20"/>
-        </w:rPr>
-        <w:t xml:space="preserve"> </w:t>
-      </w:r>
-      <w:r>
-        <w:rPr>
-          <w:sz w:val="20"/>
-          <w:szCs w:val="20"/>
-        </w:rPr>
-        <w:br/>
-      </w:r>
-      <w:r>
-        <w:t>______________________________________________________________________________</w:t>
-      </w:r>
-    </w:p>
-    <w:p>
-      <w:pPr>
-        <w:tabs>
-          <w:tab w:val="left" w:pos="-284"/>
-          <w:tab w:val="left" w:pos="284"/>
-        </w:tabs>
-      </w:pPr>
-    </w:p>
-    <w:p>
-      <w:pPr>
-        <w:tabs>
-          <w:tab w:val="left" w:pos="-284"/>
-          <w:tab w:val="left" w:pos="284"/>
-        </w:tabs>
-        <w:jc w:val="right"/>
-      </w:pPr>
-      <w:r>
-        <w:t xml:space="preserve">и представитель заказчика </w:t>
-      </w:r>
-      <w:r>
-        <w:rPr>
-          <w:u w:val="single"/>
-        </w:rPr>
-        <w:t xml:space="preserve">{{CustomerName}}, {{CustomerPosition}}</w:t>
-      </w:r>
-    </w:p>
-    <w:p>
-      <w:pPr>
-        <w:tabs>
-          <w:tab w:val="left" w:pos="-284"/>
-          <w:tab w:val="left" w:pos="284"/>
-        </w:tabs>
-        <w:rPr>
-          <w:sz w:val="20"/>
-          <w:szCs w:val="20"/>
-        </w:rPr>
-      </w:pPr>
-      <w:r>
-        <w:tab/>
-      </w:r>
-      <w:r>
-        <w:tab/>
-      </w:r>
-      <w:r>
-        <w:tab/>
-      </w:r>
-      <w:r>
-        <w:tab/>
-      </w:r>
-      <w:r>
-        <w:tab/>
-      </w:r>
-      <w:r>
-        <w:tab/>
-      </w:r>
-      <w:r>
-        <w:rPr>
-          <w:sz w:val="16"/>
-          <w:szCs w:val="16"/>
-        </w:rPr>
-        <w:t xml:space="preserve">Ф.И.О, </w:t>
-      </w:r>
-      <w:r>
-        <w:rPr>
-          <w:sz w:val="16"/>
-          <w:szCs w:val="16"/>
-        </w:rPr>
-        <w:t>должность лица, подавшего заявку или начальника подразделения,</w:t>
-      </w:r>
-    </w:p>
-    <w:p>
-      <w:pPr>
-        <w:tabs>
-          <w:tab w:val="left" w:pos="-284"/>
-          <w:tab w:val="left" w:pos="284"/>
-        </w:tabs>
-        <w:jc w:val="center"/>
-        <w:rPr>
-          <w:sz w:val="16"/>
-          <w:szCs w:val="16"/>
-        </w:rPr>
-      </w:pPr>
-      <w:r>
-        <w:t>_______________________________________________________________________________</w:t>
-      </w:r>
-      <w:r>
-        <w:rPr>
-          <w:sz w:val="16"/>
-          <w:szCs w:val="16"/>
-        </w:rPr>
-        <w:t>направившего служебную записку или ответственного лица за приемку по иному документу</w:t>
-      </w:r>
-    </w:p>
-    <w:p>
-      <w:pPr>
-        <w:tabs>
-          <w:tab w:val="left" w:pos="-284"/>
-          <w:tab w:val="left" w:pos="284"/>
-        </w:tabs>
-        <w:jc w:val="center"/>
-        <w:rPr>
-          <w:sz w:val="16"/>
-          <w:szCs w:val="16"/>
-        </w:rPr>
-      </w:pPr>
-    </w:p>
-    <w:p>
-      <w:pPr>
-        <w:tabs>
-          <w:tab w:val="left" w:pos="-284"/>
-          <w:tab w:val="left" w:pos="284"/>
-        </w:tabs>
-        <w:rPr>
-          <w:sz w:val="16"/>
-          <w:szCs w:val="16"/>
-        </w:rPr>
-      </w:pPr>
-      <w:r>
-        <w:t xml:space="preserve">Провели осмотр и проверку выполненных работ и установили: </w:t>
-      </w:r>
-      <w:r>
-        <w:rPr>
-          <w:u w:val="single"/>
-        </w:rPr>
-        <w:t xml:space="preserve">{{InspectionResult}}</w:t>
-      </w:r>
-    </w:p>
-    <w:p>
-      <w:pPr>
-        <w:tabs>
-          <w:tab w:val="left" w:pos="-284"/>
-          <w:tab w:val="left" w:pos="284"/>
-        </w:tabs>
-        <w:rPr>
-          <w:sz w:val="16"/>
-          <w:szCs w:val="16"/>
-        </w:rPr>
-      </w:pPr>
-    </w:p>
-    <w:p>
-      <w:pPr>
-        <w:tabs>
-          <w:tab w:val="left" w:pos="-284"/>
-          <w:tab w:val="left" w:pos="284"/>
-        </w:tabs>
-        <w:spacing w:line="276" w:lineRule="auto"/>
-        <w:rPr>
-          <w:sz w:val="20"/>
-          <w:szCs w:val="20"/>
-        </w:rPr>
-      </w:pPr>
-      <w:r>
-        <w:rPr>
-          <w:sz w:val="16"/>
-          <w:szCs w:val="16"/>
-        </w:rPr>
-        <w:t>___________________________________________________________________________________________________________</w:t>
-      </w:r>
-      <w:r>
-        <w:rPr>
-          <w:sz w:val="16"/>
-          <w:szCs w:val="16"/>
-        </w:rPr>
-        <w:t>_</w:t>
-      </w:r>
-      <w:r>
-        <w:rPr>
-          <w:sz w:val="16"/>
-          <w:szCs w:val="16"/>
-        </w:rPr>
-        <w:t>__________</w:t>
-      </w:r>
-      <w:r>
-        <w:rPr>
-          <w:sz w:val="20"/>
-          <w:szCs w:val="20"/>
-        </w:rPr>
-        <w:br/>
-      </w:r>
-      <w:r>
-        <w:t xml:space="preserve">_______________________________________________________________________________ </w:t>
-      </w:r>
-    </w:p>
-    <w:p>
-      <w:pPr>
-        <w:tabs>
-          <w:tab w:val="left" w:pos="-284"/>
-          <w:tab w:val="left" w:pos="284"/>
-        </w:tabs>
-        <w:spacing w:line="276" w:lineRule="auto"/>
-        <w:rPr>
-          <w:sz w:val="20"/>
-          <w:szCs w:val="20"/>
-        </w:rPr>
-      </w:pPr>
-      <w:r>
-        <w:t xml:space="preserve">_______________________________________________________________________________ </w:t>
-      </w:r>
-    </w:p>
-    <w:p>
-      <w:pPr>
-        <w:tabs>
-          <w:tab w:val="left" w:pos="-284"/>
-          <w:tab w:val="left" w:pos="284"/>
-        </w:tabs>
-        <w:spacing w:line="276" w:lineRule="auto"/>
-      </w:pPr>
-      <w:r>
-        <w:t xml:space="preserve">_______________________________________________________________________________ </w:t>
-      </w:r>
-    </w:p>
-    <w:p>
-      <w:pPr>
-        <w:tabs>
-          <w:tab w:val="left" w:pos="-284"/>
-          <w:tab w:val="left" w:pos="284"/>
-        </w:tabs>
-        <w:spacing w:line="276" w:lineRule="auto"/>
-        <w:rPr>
-          <w:b/>
-          <w:sz w:val="20"/>
-          <w:szCs w:val="20"/>
-        </w:rPr>
-      </w:pPr>
-      <w:r>
-        <w:rPr>
-          <w:b/>
-        </w:rPr>
-        <w:t>_______________________________________________________________________________</w:t>
-      </w:r>
-    </w:p>
-    <w:p>
-      <w:pPr>
-        <w:tabs>
-          <w:tab w:val="left" w:pos="-284"/>
-          <w:tab w:val="left" w:pos="284"/>
-        </w:tabs>
-        <w:spacing w:line="276" w:lineRule="auto"/>
-        <w:rPr>
-          <w:b/>
-        </w:rPr>
-      </w:pPr>
-      <w:r>
-        <w:rPr>
-          <w:b/>
-        </w:rPr>
-        <w:t xml:space="preserve">_______________________________________________________________________________ </w:t>
-      </w:r>
-    </w:p>
-    <w:p>
-      <w:pPr>
-        <w:tabs>
-          <w:tab w:val="left" w:pos="-284"/>
-          <w:tab w:val="left" w:pos="284"/>
-        </w:tabs>
-        <w:spacing w:line="276" w:lineRule="auto"/>
-        <w:rPr>
-          <w:b/>
-          <w:sz w:val="20"/>
-          <w:szCs w:val="20"/>
-        </w:rPr>
-      </w:pPr>
-      <w:r>
-        <w:rPr>
-          <w:b/>
-        </w:rPr>
-        <w:t>_______________________________________________________________________________</w:t>
-      </w:r>
-    </w:p>
-    <w:p>
-      <w:pPr>
-        <w:tabs>
-          <w:tab w:val="left" w:pos="-284"/>
-          <w:tab w:val="left" w:pos="284"/>
-        </w:tabs>
-        <w:spacing w:line="276" w:lineRule="auto"/>
-      </w:pPr>
-      <w:r>
-        <w:t xml:space="preserve">_______________________________________________________________________________ </w:t>
-      </w:r>
-    </w:p>
-    <w:p>
-      <w:pPr>
-        <w:tabs>
-          <w:tab w:val="left" w:pos="-284"/>
-          <w:tab w:val="left" w:pos="284"/>
-        </w:tabs>
-        <w:spacing w:line="276" w:lineRule="auto"/>
-      </w:pPr>
-      <w:r>
-        <w:t xml:space="preserve">_______________________________________________________________________________ </w:t>
-      </w:r>
-    </w:p>
-    <w:p>
-      <w:pPr>
-        <w:tabs>
-          <w:tab w:val="left" w:pos="-284"/>
-          <w:tab w:val="left" w:pos="284"/>
-        </w:tabs>
-      </w:pPr>
-    </w:p>
-    <w:p>
-      <w:pPr>
-        <w:tabs>
-          <w:tab w:val="left" w:pos="-284"/>
-          <w:tab w:val="left" w:pos="284"/>
-        </w:tabs>
-      </w:pPr>
-      <w:r>
-        <w:t xml:space="preserve">Начало работ ________________________ Окончание работ ____________________________</w:t>
-      </w:r>
-    </w:p>
-    <w:p>
-      <w:pPr>
-        <w:tabs>
-          <w:tab w:val="left" w:pos="-284"/>
-          <w:tab w:val="left" w:pos="284"/>
-        </w:tabs>
-      </w:pPr>
-      <w:r>
-        <w:rPr>
-          <w:sz w:val="16"/>
-          <w:szCs w:val="16"/>
-        </w:rPr>
-        <w:tab/>
-      </w:r>
-      <w:r>
-        <w:rPr>
-          <w:sz w:val="16"/>
-          <w:szCs w:val="16"/>
-        </w:rPr>
-        <w:tab/>
-      </w:r>
-      <w:r>
-        <w:rPr>
-          <w:sz w:val="16"/>
-          <w:szCs w:val="16"/>
-        </w:rPr>
-        <w:tab/>
-      </w:r>
-      <w:r>
-        <w:rPr>
-          <w:sz w:val="16"/>
-          <w:szCs w:val="16"/>
-        </w:rPr>
-        <w:tab/>
-      </w:r>
-      <w:r>
-        <w:rPr>
-          <w:sz w:val="16"/>
-          <w:szCs w:val="16"/>
-        </w:rPr>
-        <w:t>Дата, время</w:t>
-      </w:r>
-      <w:r>
-        <w:rPr>
-          <w:sz w:val="16"/>
-          <w:szCs w:val="16"/>
-        </w:rPr>
-        <w:tab/>
-      </w:r>
-      <w:r>
-        <w:rPr>
-          <w:sz w:val="16"/>
-          <w:szCs w:val="16"/>
-        </w:rPr>
-        <w:tab/>
-      </w:r>
-      <w:r>
-        <w:rPr>
-          <w:sz w:val="16"/>
-          <w:szCs w:val="16"/>
-        </w:rPr>
-        <w:tab/>
-      </w:r>
-      <w:r>
-        <w:rPr>
-          <w:sz w:val="16"/>
-          <w:szCs w:val="16"/>
-        </w:rPr>
-        <w:tab/>
-      </w:r>
-      <w:r>
-        <w:rPr>
-          <w:sz w:val="16"/>
-          <w:szCs w:val="16"/>
-        </w:rPr>
-        <w:tab/>
-      </w:r>
-      <w:r>
-        <w:rPr>
-          <w:sz w:val="16"/>
-          <w:szCs w:val="16"/>
-        </w:rPr>
-        <w:tab/>
-      </w:r>
-      <w:r>
-        <w:rPr>
-          <w:sz w:val="16"/>
-          <w:szCs w:val="16"/>
-        </w:rPr>
-        <w:t>Дата, время</w:t>
-      </w:r>
-      <w:r>
-        <w:br/>
-      </w:r>
-    </w:p>
-    <w:p>
-      <w:pPr>
-        <w:tabs>
-          <w:tab w:val="left" w:pos="-284"/>
-          <w:tab w:val="left" w:pos="284"/>
-        </w:tabs>
-        <w:rPr>
-          <w:sz w:val="16"/>
-          <w:szCs w:val="16"/>
-        </w:rPr>
-      </w:pPr>
-      <w:r>
-        <w:t xml:space="preserve">Фактическая трудоемкость работ </w:t>
-      </w:r>
-      <w:r>
-        <w:rPr>
-          <w:u w:val="single"/>
-        </w:rPr>
-        <w:t xml:space="preserve">{{ActualLaborHours}}</w:t>
-      </w:r>
-      <w:r>
-        <w:t xml:space="preserve"> чел.часов</w:t>
-      </w:r>
-    </w:p>
-    <w:p>
-      <w:pPr>
-        <w:tabs>
-          <w:tab w:val="left" w:pos="-284"/>
-          <w:tab w:val="left" w:pos="284"/>
-        </w:tabs>
-      </w:pPr>
-    </w:p>
-    <w:p>
-      <w:pPr>
-        <w:tabs>
-          <w:tab w:val="left" w:pos="-284"/>
-          <w:tab w:val="left" w:pos="284"/>
-        </w:tabs>
-        <w:rPr>
-          <w:sz w:val="16"/>
-          <w:szCs w:val="16"/>
-        </w:rPr>
-      </w:pPr>
-    </w:p>
-    <w:p>
-      <w:pPr>
-        <w:tabs>
-          <w:tab w:val="left" w:pos="-284"/>
-          <w:tab w:val="left" w:pos="284"/>
-        </w:tabs>
-      </w:pPr>
-      <w:r>
-        <w:t xml:space="preserve">Представитель заказчика </w:t>
-      </w:r>
-      <w:r>
-        <w:rPr>
-          <w:u w:val="single"/>
-        </w:rPr>
-        <w:t xml:space="preserve">________________</w:t>
-      </w:r>
-      <w:r>
-        <w:t xml:space="preserve">         </w:t>
-      </w:r>
-      <w:r>
-        <w:rPr>
-          <w:u w:val="single"/>
-        </w:rPr>
-        <w:t xml:space="preserve">{{CustomerName}}</w:t>
-      </w:r>
-    </w:p>
-    <w:p>
-      <w:pPr>
-        <w:tabs>
-          <w:tab w:val="left" w:pos="-284"/>
-          <w:tab w:val="left" w:pos="284"/>
-        </w:tabs>
-      </w:pPr>
-      <w:r>
-        <w:tab/>
-      </w:r>
-      <w:r>
-        <w:tab/>
-      </w:r>
-      <w:r>
-        <w:tab/>
-      </w:r>
-      <w:r>
-        <w:tab/>
-      </w:r>
-      <w:r>
-        <w:tab/>
-      </w:r>
-      <w:r>
-        <w:t xml:space="preserve">     п</w:t>
-      </w:r>
-      <w:r>
-        <w:t>одпись</w:t>
-      </w:r>
-      <w:r>
-        <w:tab/>
-      </w:r>
-      <w:r>
-        <w:tab/>
-      </w:r>
-      <w:r>
-        <w:tab/>
-        <w:t>расшифровка подписи</w:t>
-      </w:r>
-      <w:r>
-        <w:br/>
-      </w:r>
-    </w:p>
-    <w:p>
-      <w:pPr>
-        <w:tabs>
-          <w:tab w:val="left" w:pos="-284"/>
-          <w:tab w:val="left" w:pos="284"/>
-        </w:tabs>
-      </w:pPr>
-      <w:r>
-        <w:t xml:space="preserve">Представитель исполнителя </w:t>
-      </w:r>
-      <w:r>
-        <w:rPr>
-          <w:u w:val="single"/>
-        </w:rPr>
-        <w:t xml:space="preserve">________________</w:t>
-      </w:r>
-      <w:r>
-        <w:t xml:space="preserve">         </w:t>
-      </w:r>
-      <w:r>
-        <w:rPr>
-          <w:u w:val="single"/>
-        </w:rPr>
-        <w:t xml:space="preserve">{{Executor1Name}}</w:t>
-      </w:r>
-    </w:p>
-    <w:p>
-      <w:pPr>
-        <w:tabs>
-          <w:tab w:val="left" w:pos="-284"/>
-          <w:tab w:val="left" w:pos="284"/>
-        </w:tabs>
-      </w:pPr>
-      <w:r>
-        <w:tab/>
-      </w:r>
-      <w:r>
-        <w:tab/>
-      </w:r>
-      <w:r>
-        <w:tab/>
-      </w:r>
-      <w:r>
-        <w:tab/>
-      </w:r>
-      <w:r>
-        <w:tab/>
-        <w:t xml:space="preserve">     подпись</w:t>
-      </w:r>
-      <w:r>
-        <w:tab/>
-      </w:r>
-      <w:r>
-        <w:tab/>
-      </w:r>
-      <w:r>
-        <w:tab/>
-        <w:t>расшифровка подписи</w:t>
-      </w:r>
-      <w:r>
-        <w:br/>
-      </w:r>
-    </w:p>
+    <w:tbl>
+      <w:tblPr>
+        <w:tblW w:w="9781" w:type="dxa"/>
+        <w:tblBorders>
+          <w:top w:val="nil"/>
+          <w:left w:val="nil"/>
+          <w:bottom w:val="nil"/>
+          <w:right w:val="nil"/>
+          <w:insideH w:val="nil"/>
+          <w:insideV w:val="nil"/>
+        </w:tblBorders>
+        <w:tblLayout w:type="fixed"/>
+        <w:tblCellMar>
+          <w:left w:w="0" w:type="dxa"/>
+          <w:right w:w="0" w:type="dxa"/>
+        </w:tblCellMar>
+        <w:tblLook w:val="04A0" w:firstRow="1" w:lastRow="0" w:firstColumn="1" w:lastColumn="0" w:noHBand="0" w:noVBand="1"/>
+      </w:tblPr>
+      <w:tblGrid>
+        <w:gridCol w:w="3300"/>
+        <w:gridCol w:w="2600"/>
+        <w:gridCol w:w="3881"/>
+      </w:tblGrid>
+      <w:tr>
+        <w:trPr>
+          <w:trHeight w:hRule="exact" w:val="300"/>
+        </w:trPr>
+        <w:tc>
+          <w:tcPr>
+            <w:tcW w:w="3300" w:type="dxa"/>
+            <w:tcBorders>
+              <w:top w:val="nil"/>
+              <w:left w:val="nil"/>
+              <w:bottom w:val="nil"/>
+              <w:right w:val="nil"/>
+            </w:tcBorders>
+            <w:vAlign w:val="bottom"/>
+          </w:tcPr>
+          <w:p>
+            <w:pPr>
+              <w:spacing w:line="220" w:lineRule="exact"/>
+            </w:pPr>
+            <w:r>
+              <w:rPr>
+                <w:rFonts w:ascii="Arial" w:eastAsia="Arial" w:hAnsi="Arial" w:cs="Arial"/>
+                <w:sz w:val="22"/>
+                <w:szCs w:val="22"/>
+              </w:rPr>
+              <w:t>Представитель заказчика</w:t>
+            </w:r>
+          </w:p>
+        </w:tc>
+        <w:tc>
+          <w:tcPr>
+            <w:tcW w:w="2600" w:type="dxa"/>
+            <w:tcBorders>
+              <w:top w:val="nil"/>
+              <w:left w:val="nil"/>
+              <w:bottom w:val="single" w:sz="4" w:space="0" w:color="000000"/>
+              <w:right w:val="nil"/>
+            </w:tcBorders>
+            <w:vAlign w:val="bottom"/>
+          </w:tcPr>
+          <w:p>
+            <w:pPr>
+              <w:spacing w:line="220" w:lineRule="exact"/>
+              <w:jc w:val="center"/>
+            </w:pPr>
+          </w:p>
+        </w:tc>
+        <w:tc>
+          <w:tcPr>
+            <w:tcW w:w="3881" w:type="dxa"/>
+            <w:tcBorders>
+              <w:top w:val="nil"/>
+              <w:left w:val="nil"/>
+              <w:bottom w:val="single" w:sz="4" w:space="0" w:color="000000"/>
+              <w:right w:val="nil"/>
+            </w:tcBorders>
+            <w:vAlign w:val="bottom"/>
+          </w:tcPr>
+          <w:p>
+            <w:pPr>
+              <w:spacing w:line="220" w:lineRule="exact"/>
+              <w:jc w:val="center"/>
+            </w:pPr>
+            <w:r>
+              <w:rPr>
+                <w:rFonts w:ascii="Arial" w:eastAsia="Arial" w:hAnsi="Arial" w:cs="Arial"/>
+                <w:sz w:val="22"/>
+                <w:szCs w:val="22"/>
+              </w:rPr>
+              <w:t>{{CustomerSignatureName}}</w:t>
+            </w:r>
+          </w:p>
+        </w:tc>
+      </w:tr>
+      <w:tr>
+        <w:trPr>
+          <w:trHeight w:hRule="exact" w:val="260"/>
+        </w:trPr>
+        <w:tc>
+          <w:tcPr>
+            <w:tcW w:w="3300" w:type="dxa"/>
+            <w:tcBorders>
+              <w:top w:val="nil"/>
+              <w:left w:val="nil"/>
+              <w:bottom w:val="nil"/>
+              <w:right w:val="nil"/>
+            </w:tcBorders>
+            <w:vAlign w:val="center"/>
+          </w:tcPr>
+          <w:p>
+            <w:pPr>
+              <w:spacing w:line="220" w:lineRule="exact"/>
+            </w:pPr>
+          </w:p>
+        </w:tc>
+        <w:tc>
+          <w:tcPr>
+            <w:tcW w:w="2600" w:type="dxa"/>
+            <w:tcBorders>
+              <w:top w:val="nil"/>
+              <w:left w:val="nil"/>
+              <w:bottom w:val="nil"/>
+              <w:right w:val="nil"/>
+            </w:tcBorders>
+            <w:vAlign w:val="center"/>
+          </w:tcPr>
+          <w:p>
+            <w:pPr>
+              <w:spacing w:line="220" w:lineRule="exact"/>
+              <w:jc w:val="center"/>
+            </w:pPr>
+            <w:r>
+              <w:rPr>
+                <w:rFonts w:ascii="Arial" w:eastAsia="Arial" w:hAnsi="Arial" w:cs="Arial"/>
+                <w:sz w:val="18"/>
+                <w:szCs w:val="18"/>
+              </w:rPr>
+              <w:t>подпись</w:t>
+            </w:r>
+          </w:p>
+        </w:tc>
+        <w:tc>
+          <w:tcPr>
+            <w:tcW w:w="3881" w:type="dxa"/>
+            <w:tcBorders>
+              <w:top w:val="nil"/>
+              <w:left w:val="nil"/>
+              <w:bottom w:val="nil"/>
+              <w:right w:val="nil"/>
+            </w:tcBorders>
+            <w:vAlign w:val="center"/>
+          </w:tcPr>
+          <w:p>
+            <w:pPr>
+              <w:spacing w:line="220" w:lineRule="exact"/>
+              <w:jc w:val="center"/>
+            </w:pPr>
+            <w:r>
+              <w:rPr>
+                <w:rFonts w:ascii="Arial" w:eastAsia="Arial" w:hAnsi="Arial" w:cs="Arial"/>
+                <w:sz w:val="18"/>
+                <w:szCs w:val="18"/>
+              </w:rPr>
+              <w:t>расшифровка подписи</w:t>
+            </w:r>
+          </w:p>
+        </w:tc>
+      </w:tr>
+      <w:tr>
+        <w:trPr>
+          <w:trHeight w:hRule="exact" w:val="300"/>
+        </w:trPr>
+        <w:tc>
+          <w:tcPr>
+            <w:tcW w:w="3300" w:type="dxa"/>
+            <w:tcBorders>
+              <w:top w:val="nil"/>
+              <w:left w:val="nil"/>
+              <w:bottom w:val="nil"/>
+              <w:right w:val="nil"/>
+            </w:tcBorders>
+            <w:vAlign w:val="bottom"/>
+          </w:tcPr>
+          <w:p>
+            <w:pPr>
+              <w:spacing w:line="220" w:lineRule="exact"/>
+            </w:pPr>
+            <w:r>
+              <w:rPr>
+                <w:rFonts w:ascii="Arial" w:eastAsia="Arial" w:hAnsi="Arial" w:cs="Arial"/>
+                <w:sz w:val="22"/>
+                <w:szCs w:val="22"/>
+              </w:rPr>
+              <w:t>Представитель исполнителя</w:t>
+            </w:r>
+          </w:p>
+        </w:tc>
+        <w:tc>
+          <w:tcPr>
+            <w:tcW w:w="2600" w:type="dxa"/>
+            <w:tcBorders>
+              <w:top w:val="nil"/>
+              <w:left w:val="nil"/>
+              <w:bottom w:val="single" w:sz="4" w:space="0" w:color="000000"/>
+              <w:right w:val="nil"/>
+            </w:tcBorders>
+            <w:vAlign w:val="bottom"/>
+          </w:tcPr>
+          <w:p>
+            <w:pPr>
+              <w:spacing w:line="220" w:lineRule="exact"/>
+              <w:jc w:val="center"/>
+            </w:pPr>
+          </w:p>
+        </w:tc>
+        <w:tc>
+          <w:tcPr>
+            <w:tcW w:w="3881" w:type="dxa"/>
+            <w:tcBorders>
+              <w:top w:val="nil"/>
+              <w:left w:val="nil"/>
+              <w:bottom w:val="single" w:sz="4" w:space="0" w:color="000000"/>
+              <w:right w:val="nil"/>
+            </w:tcBorders>
+            <w:vAlign w:val="bottom"/>
+          </w:tcPr>
+          <w:p>
+            <w:pPr>
+              <w:spacing w:line="220" w:lineRule="exact"/>
+              <w:jc w:val="center"/>
+            </w:pPr>
+            <w:r>
+              <w:rPr>
+                <w:rFonts w:ascii="Arial" w:eastAsia="Arial" w:hAnsi="Arial" w:cs="Arial"/>
+                <w:sz w:val="22"/>
+                <w:szCs w:val="22"/>
+              </w:rPr>
+              <w:t>{{ExecutorSignatureName}}</w:t>
+            </w:r>
+          </w:p>
+        </w:tc>
+      </w:tr>
+      <w:tr>
+        <w:trPr>
+          <w:trHeight w:hRule="exact" w:val="260"/>
+        </w:trPr>
+        <w:tc>
+          <w:tcPr>
+            <w:tcW w:w="3300" w:type="dxa"/>
+            <w:tcBorders>
+              <w:top w:val="nil"/>
+              <w:left w:val="nil"/>
+              <w:bottom w:val="nil"/>
+              <w:right w:val="nil"/>
+            </w:tcBorders>
+            <w:vAlign w:val="center"/>
+          </w:tcPr>
+          <w:p>
+            <w:pPr>
+              <w:spacing w:line="220" w:lineRule="exact"/>
+            </w:pPr>
+          </w:p>
+        </w:tc>
+        <w:tc>
+          <w:tcPr>
+            <w:tcW w:w="2600" w:type="dxa"/>
+            <w:tcBorders>
+              <w:top w:val="nil"/>
+              <w:left w:val="nil"/>
+              <w:bottom w:val="nil"/>
+              <w:right w:val="nil"/>
+            </w:tcBorders>
+            <w:vAlign w:val="center"/>
+          </w:tcPr>
+          <w:p>
+            <w:pPr>
+              <w:spacing w:line="220" w:lineRule="exact"/>
+              <w:jc w:val="center"/>
+            </w:pPr>
+            <w:r>
+              <w:rPr>
+                <w:rFonts w:ascii="Arial" w:eastAsia="Arial" w:hAnsi="Arial" w:cs="Arial"/>
+                <w:sz w:val="18"/>
+                <w:szCs w:val="18"/>
+              </w:rPr>
+              <w:t>подпись</w:t>
+            </w:r>
+          </w:p>
+        </w:tc>
+        <w:tc>
+          <w:tcPr>
+            <w:tcW w:w="3881" w:type="dxa"/>
+            <w:tcBorders>
+              <w:top w:val="nil"/>
+              <w:left w:val="nil"/>
+              <w:bottom w:val="nil"/>
+              <w:right w:val="nil"/>
+            </w:tcBorders>
+            <w:vAlign w:val="center"/>
+          </w:tcPr>
+          <w:p>
+            <w:pPr>
+              <w:spacing w:line="220" w:lineRule="exact"/>
+              <w:jc w:val="center"/>
+            </w:pPr>
+            <w:r>
+              <w:rPr>
+                <w:rFonts w:ascii="Arial" w:eastAsia="Arial" w:hAnsi="Arial" w:cs="Arial"/>
+                <w:sz w:val="18"/>
+                <w:szCs w:val="18"/>
+              </w:rPr>
+              <w:t>расшифровка подписи</w:t>
+            </w:r>
+          </w:p>
+        </w:tc>
+      </w:tr>
+    </w:tbl>
+    <w:p/>
     <w:sectPr>
       <w:pgSz w:w="11906" w:h="16838"/>
       <w:pgMar w:top="709" w:right="849" w:bottom="426" w:left="1560" w:header="708" w:footer="708" w:gutter="0"/>
@@ -1129,7 +2081,7 @@
 </file>
 
 <file path=word/numbering.xml><?xml version="1.0" encoding="utf-8"?>
-<w:numbering xmlns:wpc="http://schemas.microsoft.com/office/word/2010/wordprocessingCanvas" xmlns:cx="http://schemas.microsoft.com/office/drawing/2014/chartex" xmlns:cx1="http://schemas.microsoft.com/office/drawing/2015/9/8/chartex" xmlns:mc="http://schemas.openxmlformats.org/markup-compatibility/2006" xmlns:o="urn:schemas-microsoft-com:office:office" xmlns:r="http://schemas.openxmlformats.org/officeDocument/2006/relationships" xmlns:m="http://schemas.openxmlformats.org/officeDocument/2006/math" xmlns:v="urn:schemas-microsoft-com:vml" xmlns:wp14="http://schemas.microsoft.com/office/word/2010/wordprocessingDrawing" xmlns:wp="http://schemas.openxmlformats.org/drawingml/2006/wordprocessingDrawing" xmlns:w10="urn:schemas-microsoft-com:office:word" xmlns:w="http://schemas.openxmlformats.org/wordprocessingml/2006/main" xmlns:w14="http://schemas.microsoft.com/office/word/2010/wordml" xmlns:w15="http://schemas.microsoft.com/office/word/2012/wordml" xmlns:w16se="http://schemas.microsoft.com/office/word/2015/wordml/symex" xmlns:wpg="http://schemas.microsoft.com/office/word/2010/wordprocessingGroup" xmlns:wpi="http://schemas.microsoft.com/office/word/2010/wordprocessingInk" xmlns:wne="http://schemas.microsoft.com/office/word/2006/wordml" xmlns:wps="http://schemas.microsoft.com/office/word/2010/wordprocessingShape" mc:Ignorable="w14 w15 w16se wp14">
+<w:numbering xmlns:wpc="http://schemas.microsoft.com/office/word/2010/wordprocessingCanvas" xmlns:cx="http://schemas.microsoft.com/office/drawing/2014/chartex" xmlns:mc="http://schemas.openxmlformats.org/markup-compatibility/2006" xmlns:o="urn:schemas-microsoft-com:office:office" xmlns:r="http://schemas.openxmlformats.org/officeDocument/2006/relationships" xmlns:m="http://schemas.openxmlformats.org/officeDocument/2006/math" xmlns:v="urn:schemas-microsoft-com:vml" xmlns:wp14="http://schemas.microsoft.com/office/word/2010/wordprocessingDrawing" xmlns:wp="http://schemas.openxmlformats.org/drawingml/2006/wordprocessingDrawing" xmlns:w10="urn:schemas-microsoft-com:office:word" xmlns:w="http://schemas.openxmlformats.org/wordprocessingml/2006/main" xmlns:w14="http://schemas.microsoft.com/office/word/2010/wordml" xmlns:w15="http://schemas.microsoft.com/office/word/2012/wordml" xmlns:w16se="http://schemas.microsoft.com/office/word/2015/wordml/symex" xmlns:wpg="http://schemas.microsoft.com/office/word/2010/wordprocessingGroup" xmlns:wpi="http://schemas.microsoft.com/office/word/2010/wordprocessingInk" xmlns:wne="http://schemas.microsoft.com/office/word/2006/wordml" xmlns:wps="http://schemas.microsoft.com/office/word/2010/wordprocessingShape" mc:Ignorable="w14 w15 w16se wp14">
   <w:abstractNum w:abstractNumId="0" w15:restartNumberingAfterBreak="0">
     <w:nsid w:val="00A556E7"/>
     <w:multiLevelType w:val="multilevel"/>

</xml_diff>

<commit_message>
Finalize inspection act DOCX generation
</commit_message>
<xml_diff>
--- a/Templates/Acts/inspection_act.docx
+++ b/Templates/Acts/inspection_act.docx
@@ -322,7 +322,7 @@
       </w:tblGrid>
       <w:tr>
         <w:trPr>
-          <w:trHeight w:hRule="exact" w:val="300"/>
+          <w:trHeight w:hRule="exact" w:val="204"/>
         </w:trPr>
         <w:tc>
           <w:tcPr>
@@ -617,15 +617,7 @@
           <w:sz w:val="16"/>
           <w:szCs w:val="16"/>
         </w:rPr>
-        <w:t xml:space="preserve">и Ф.И.О лица, </w:t>
-      </w:r>
-      <w:r>
-        <w:rPr>
-          <w:rFonts w:ascii="Arial" w:eastAsia="Arial" w:hAnsi="Arial" w:cs="Arial"/>
-          <w:sz w:val="16"/>
-          <w:szCs w:val="16"/>
-        </w:rPr>
-        <w:t>подавшего заявку, или № служебной записки, или реквизиты иного документа</w:t>
+        <w:t>и Ф.И.О лица, подавшего заявку, или № служебной записки, или реквизиты иного документа</w:t>
       </w:r>
     </w:p>
     <w:p>
@@ -644,37 +636,19 @@
     <w:p>
       <w:pPr>
         <w:spacing w:line="220" w:lineRule="exact"/>
+      </w:pPr>
+      <w:r>
         <w:rPr>
           <w:rFonts w:ascii="Arial" w:eastAsia="Arial" w:hAnsi="Arial" w:cs="Arial"/>
           <w:sz w:val="22"/>
           <w:szCs w:val="22"/>
         </w:rPr>
-      </w:pPr>
-      <w:r>
-        <w:rPr>
-          <w:rFonts w:ascii="Arial" w:eastAsia="Arial" w:hAnsi="Arial" w:cs="Arial"/>
-          <w:sz w:val="22"/>
-          <w:szCs w:val="22"/>
-        </w:rPr>
-        <w:t xml:space="preserve">Мы </w:t>
+        <w:t>Мы нижеподписавшиеся:</w:t>
       </w:r>
-      <w:r>
-        <w:rPr>
-          <w:rFonts w:ascii="Arial" w:eastAsia="Arial" w:hAnsi="Arial" w:cs="Arial"/>
-          <w:sz w:val="22"/>
-          <w:szCs w:val="22"/>
-        </w:rPr>
-        <w:t>нижеподписавшиеся:</w:t>
-      </w:r>
-    </w:p>
-    <w:p>
-      <w:pPr>
-        <w:spacing w:line="220" w:lineRule="exact"/>
-      </w:pPr>
     </w:p>
     <w:tbl>
       <w:tblPr>
-        <w:tblW w:w="9574" w:type="dxa"/>
+        <w:tblW w:w="9639" w:type="dxa"/>
         <w:tblBorders>
           <w:top w:val="nil"/>
           <w:left w:val="nil"/>
@@ -691,8 +665,8 @@
         <w:tblLook w:val="04A0" w:firstRow="1" w:lastRow="0" w:firstColumn="1" w:lastColumn="0" w:noHBand="0" w:noVBand="1"/>
       </w:tblPr>
       <w:tblGrid>
-        <w:gridCol w:w="3686"/>
-        <w:gridCol w:w="5888"/>
+        <w:gridCol w:w="3608"/>
+        <w:gridCol w:w="6031"/>
       </w:tblGrid>
       <w:tr>
         <w:trPr>
@@ -700,7 +674,7 @@
         </w:trPr>
         <w:tc>
           <w:tcPr>
-            <w:tcW w:w="3686" w:type="dxa"/>
+            <w:tcW w:w="3608" w:type="dxa"/>
             <w:tcBorders>
               <w:top w:val="nil"/>
               <w:left w:val="nil"/>
@@ -730,7 +704,7 @@
         </w:tc>
         <w:tc>
           <w:tcPr>
-            <w:tcW w:w="5888" w:type="dxa"/>
+            <w:tcW w:w="6031" w:type="dxa"/>
             <w:tcBorders>
               <w:top w:val="nil"/>
               <w:left w:val="nil"/>
@@ -780,54 +754,20 @@
           </w:p>
         </w:tc>
       </w:tr>
-    </w:tbl>
-    <w:p>
-      <w:pPr>
-        <w:spacing w:line="220" w:lineRule="exact"/>
-        <w:jc w:val="center"/>
-      </w:pPr>
-      <w:r>
-        <w:rPr>
-          <w:rFonts w:ascii="Arial" w:eastAsia="Arial" w:hAnsi="Arial" w:cs="Arial"/>
-          <w:sz w:val="18"/>
-          <w:szCs w:val="18"/>
-        </w:rPr>
-        <w:t xml:space="preserve">                                                     </w:t>
-      </w:r>
-      <w:r>
-        <w:rPr>
-          <w:rFonts w:ascii="Arial" w:eastAsia="Arial" w:hAnsi="Arial" w:cs="Arial"/>
-          <w:sz w:val="18"/>
-          <w:szCs w:val="18"/>
-        </w:rPr>
-        <w:t>Ф.И.О, должность, наименование подразделения</w:t>
-      </w:r>
-    </w:p>
-    <w:tbl>
-      <w:tblPr>
-        <w:tblpPr w:leftFromText="180" w:rightFromText="180" w:vertAnchor="text" w:horzAnchor="margin" w:tblpXSpec="right" w:tblpY="76"/>
-        <w:tblW w:w="6521" w:type="dxa"/>
-        <w:tblBorders>
-          <w:top w:val="nil"/>
-          <w:left w:val="nil"/>
-          <w:bottom w:val="nil"/>
-          <w:right w:val="nil"/>
-          <w:insideH w:val="nil"/>
-          <w:insideV w:val="nil"/>
-        </w:tblBorders>
-        <w:tblLayout w:type="fixed"/>
-        <w:tblLook w:val="04A0" w:firstRow="1" w:lastRow="0" w:firstColumn="1" w:lastColumn="0" w:noHBand="0" w:noVBand="1"/>
-      </w:tblPr>
-      <w:tblGrid>
-        <w:gridCol w:w="6521"/>
-      </w:tblGrid>
       <w:tr>
+        <w:tblPrEx>
+          <w:tblCellMar>
+            <w:left w:w="108" w:type="dxa"/>
+            <w:right w:w="108" w:type="dxa"/>
+          </w:tblCellMar>
+        </w:tblPrEx>
         <w:trPr>
-          <w:trHeight w:hRule="exact" w:val="383"/>
+          <w:trHeight w:hRule="exact" w:val="326"/>
         </w:trPr>
         <w:tc>
           <w:tcPr>
-            <w:tcW w:w="6521" w:type="dxa"/>
+            <w:tcW w:w="9639" w:type="dxa"/>
+            <w:gridSpan w:val="2"/>
             <w:tcBorders>
               <w:top w:val="nil"/>
               <w:left w:val="nil"/>
@@ -846,15 +786,7 @@
                 <w:sz w:val="22"/>
                 <w:szCs w:val="22"/>
               </w:rPr>
-              <w:t xml:space="preserve">            </w:t>
-            </w:r>
-            <w:r>
-              <w:rPr>
-                <w:rFonts w:ascii="Arial" w:eastAsia="Arial" w:hAnsi="Arial" w:cs="Arial"/>
-                <w:sz w:val="22"/>
-                <w:szCs w:val="22"/>
-              </w:rPr>
-              <w:t>{{CustomerNamePosition1}}</w:t>
+              <w:t>{{ExecutorNamePosition2}}</w:t>
             </w:r>
           </w:p>
         </w:tc>
@@ -862,50 +794,180 @@
     </w:tbl>
     <w:p>
       <w:pPr>
-        <w:tabs>
-          <w:tab w:val="left" w:pos="-284"/>
-          <w:tab w:val="left" w:pos="284"/>
-        </w:tabs>
-      </w:pPr>
-    </w:p>
-    <w:p>
-      <w:pPr>
-        <w:spacing w:line="220" w:lineRule="exact"/>
-      </w:pPr>
-      <w:r>
-        <w:rPr>
-          <w:rFonts w:ascii="Arial" w:eastAsia="Arial" w:hAnsi="Arial" w:cs="Arial"/>
-          <w:sz w:val="22"/>
-          <w:szCs w:val="22"/>
-        </w:rPr>
-        <w:t>и представитель заказчика</w:t>
-      </w:r>
-    </w:p>
-    <w:p>
-      <w:pPr>
         <w:spacing w:line="220" w:lineRule="exact"/>
         <w:jc w:val="center"/>
+      </w:pPr>
+      <w:r>
         <w:rPr>
           <w:rFonts w:ascii="Arial" w:eastAsia="Arial" w:hAnsi="Arial" w:cs="Arial"/>
           <w:sz w:val="18"/>
           <w:szCs w:val="18"/>
         </w:rPr>
-      </w:pPr>
+        <w:t xml:space="preserve">                                                     </w:t>
+      </w:r>
       <w:r>
         <w:rPr>
           <w:rFonts w:ascii="Arial" w:eastAsia="Arial" w:hAnsi="Arial" w:cs="Arial"/>
           <w:sz w:val="18"/>
           <w:szCs w:val="18"/>
         </w:rPr>
-        <w:t xml:space="preserve">                               </w:t>
+        <w:t>Ф.И.О, должность, наименование подразделения</w:t>
       </w:r>
+    </w:p>
+    <w:tbl>
+      <w:tblPr>
+        <w:tblW w:w="9639" w:type="dxa"/>
+        <w:tblBorders>
+          <w:top w:val="nil"/>
+          <w:left w:val="nil"/>
+          <w:bottom w:val="nil"/>
+          <w:right w:val="nil"/>
+          <w:insideH w:val="nil"/>
+          <w:insideV w:val="nil"/>
+        </w:tblBorders>
+        <w:tblLayout w:type="fixed"/>
+        <w:tblCellMar>
+          <w:left w:w="0" w:type="dxa"/>
+          <w:right w:w="0" w:type="dxa"/>
+        </w:tblCellMar>
+        <w:tblLook w:val="04A0" w:firstRow="1" w:lastRow="0" w:firstColumn="1" w:lastColumn="0" w:noHBand="0" w:noVBand="1"/>
+      </w:tblPr>
+      <w:tblGrid>
+        <w:gridCol w:w="3608"/>
+        <w:gridCol w:w="6031"/>
+      </w:tblGrid>
+      <w:tr>
+        <w:trPr>
+          <w:trHeight w:hRule="exact" w:val="367"/>
+        </w:trPr>
+        <w:tc>
+          <w:tcPr>
+            <w:tcW w:w="3608" w:type="dxa"/>
+            <w:tcBorders>
+              <w:top w:val="nil"/>
+              <w:left w:val="nil"/>
+              <w:bottom w:val="nil"/>
+              <w:right w:val="nil"/>
+            </w:tcBorders>
+            <w:vAlign w:val="bottom"/>
+          </w:tcPr>
+          <w:p>
+            <w:pPr>
+              <w:spacing w:line="220" w:lineRule="exact"/>
+              <w:rPr>
+                <w:rFonts w:ascii="Arial" w:eastAsia="Arial" w:hAnsi="Arial" w:cs="Arial"/>
+                <w:sz w:val="22"/>
+                <w:szCs w:val="22"/>
+              </w:rPr>
+            </w:pPr>
+            <w:r>
+              <w:rPr>
+                <w:rFonts w:ascii="Arial" w:eastAsia="Arial" w:hAnsi="Arial" w:cs="Arial"/>
+                <w:sz w:val="22"/>
+                <w:szCs w:val="22"/>
+              </w:rPr>
+              <w:t>представитель исполнителя работ</w:t>
+            </w:r>
+          </w:p>
+        </w:tc>
+        <w:tc>
+          <w:tcPr>
+            <w:tcW w:w="6031" w:type="dxa"/>
+            <w:tcBorders>
+              <w:top w:val="nil"/>
+              <w:left w:val="nil"/>
+              <w:bottom w:val="single" w:sz="4" w:space="0" w:color="000000"/>
+              <w:right w:val="nil"/>
+            </w:tcBorders>
+            <w:vAlign w:val="bottom"/>
+          </w:tcPr>
+          <w:p>
+            <w:pPr>
+              <w:spacing w:line="220" w:lineRule="exact"/>
+            </w:pPr>
+            <w:r>
+              <w:rPr>
+                <w:rFonts w:ascii="Arial" w:eastAsia="Arial" w:hAnsi="Arial" w:cs="Arial"/>
+                <w:sz w:val="22"/>
+                <w:szCs w:val="22"/>
+              </w:rPr>
+              <w:t xml:space="preserve">  {{</w:t>
+            </w:r>
+            <w:proofErr w:type="spellStart"/>
+            <w:r>
+              <w:rPr>
+                <w:rFonts w:ascii="Arial" w:eastAsia="Arial" w:hAnsi="Arial" w:cs="Arial"/>
+                <w:sz w:val="22"/>
+                <w:szCs w:val="22"/>
+              </w:rPr>
+              <w:t>CustomerNamePosition</w:t>
+            </w:r>
+            <w:proofErr w:type="spellEnd"/>
+            <w:r>
+              <w:rPr>
+                <w:rFonts w:ascii="Arial" w:eastAsia="Arial" w:hAnsi="Arial" w:cs="Arial"/>
+                <w:sz w:val="22"/>
+                <w:szCs w:val="22"/>
+              </w:rPr>
+              <w:t>}}</w:t>
+            </w:r>
+          </w:p>
+        </w:tc>
+      </w:tr>
+      <w:tr>
+        <w:tblPrEx>
+          <w:tblCellMar>
+            <w:left w:w="108" w:type="dxa"/>
+            <w:right w:w="108" w:type="dxa"/>
+          </w:tblCellMar>
+        </w:tblPrEx>
+        <w:trPr>
+          <w:trHeight w:hRule="exact" w:val="395"/>
+        </w:trPr>
+        <w:tc>
+          <w:tcPr>
+            <w:tcW w:w="9639" w:type="dxa"/>
+            <w:gridSpan w:val="2"/>
+            <w:tcBorders>
+              <w:top w:val="nil"/>
+              <w:left w:val="nil"/>
+              <w:bottom w:val="single" w:sz="4" w:space="0" w:color="000000"/>
+              <w:right w:val="nil"/>
+            </w:tcBorders>
+            <w:vAlign w:val="bottom"/>
+          </w:tcPr>
+          <w:p>
+            <w:pPr>
+              <w:spacing w:line="220" w:lineRule="exact"/>
+            </w:pPr>
+            <w:r>
+              <w:rPr>
+                <w:rFonts w:ascii="Arial" w:eastAsia="Arial" w:hAnsi="Arial" w:cs="Arial"/>
+                <w:sz w:val="22"/>
+                <w:szCs w:val="22"/>
+              </w:rPr>
+              <w:t>{{CustomerNamePosition2}}</w:t>
+            </w:r>
+          </w:p>
+        </w:tc>
+      </w:tr>
+    </w:tbl>
+    <w:p>
+      <w:pPr>
+        <w:spacing w:line="220" w:lineRule="exact"/>
+        <w:jc w:val="center"/>
+        <w:rPr>
+          <w:sz w:val="16"/>
+          <w:szCs w:val="16"/>
+        </w:rPr>
+      </w:pPr>
       <w:r>
         <w:rPr>
           <w:rFonts w:ascii="Arial" w:eastAsia="Arial" w:hAnsi="Arial" w:cs="Arial"/>
           <w:sz w:val="18"/>
           <w:szCs w:val="18"/>
         </w:rPr>
-        <w:tab/>
+        <w:t>Ф</w:t>
       </w:r>
       <w:r>
         <w:rPr>
@@ -913,7 +975,7 @@
           <w:sz w:val="18"/>
           <w:szCs w:val="18"/>
         </w:rPr>
-        <w:tab/>
+        <w:t>.И.О, должность лица, подавшего заявку или начальника</w:t>
       </w:r>
       <w:r>
         <w:rPr>
@@ -921,7 +983,7 @@
           <w:sz w:val="18"/>
           <w:szCs w:val="18"/>
         </w:rPr>
-        <w:t>Ф.И.О, должность лица, подавшего заявку или начальника</w:t>
+        <w:t xml:space="preserve"> п</w:t>
       </w:r>
       <w:r>
         <w:rPr>
@@ -929,7 +991,7 @@
           <w:sz w:val="18"/>
           <w:szCs w:val="18"/>
         </w:rPr>
-        <w:t xml:space="preserve"> п</w:t>
+        <w:t>одразделения,</w:t>
       </w:r>
       <w:r>
         <w:rPr>
@@ -937,27 +999,25 @@
           <w:sz w:val="18"/>
           <w:szCs w:val="18"/>
         </w:rPr>
-        <w:t>одразделения,</w:t>
+        <w:t xml:space="preserve"> направившего служебную </w:t>
       </w:r>
-    </w:p>
-    <w:p>
-      <w:pPr>
-        <w:spacing w:line="220" w:lineRule="exact"/>
-        <w:ind w:left="3000"/>
-        <w:jc w:val="both"/>
+      <w:proofErr w:type="spellStart"/>
+      <w:r>
         <w:rPr>
           <w:rFonts w:ascii="Arial" w:eastAsia="Arial" w:hAnsi="Arial" w:cs="Arial"/>
           <w:sz w:val="18"/>
           <w:szCs w:val="18"/>
         </w:rPr>
-      </w:pPr>
+        <w:t>записк</w:t>
+      </w:r>
+      <w:proofErr w:type="spellEnd"/>
       <w:r>
         <w:rPr>
           <w:rFonts w:ascii="Arial" w:eastAsia="Arial" w:hAnsi="Arial" w:cs="Arial"/>
           <w:sz w:val="18"/>
           <w:szCs w:val="18"/>
         </w:rPr>
-        <w:t xml:space="preserve">направившего служебную записку или ответственного лица за приемку по </w:t>
+        <w:t xml:space="preserve"> </w:t>
       </w:r>
       <w:r>
         <w:rPr>
@@ -965,29 +1025,8 @@
           <w:sz w:val="18"/>
           <w:szCs w:val="18"/>
         </w:rPr>
-        <w:t xml:space="preserve">                                 </w:t>
+        <w:t>или ответственного лица за приемку по иному документу</w:t>
       </w:r>
-      <w:r>
-        <w:rPr>
-          <w:rFonts w:ascii="Arial" w:eastAsia="Arial" w:hAnsi="Arial" w:cs="Arial"/>
-          <w:sz w:val="18"/>
-          <w:szCs w:val="18"/>
-        </w:rPr>
-        <w:t>иному документу</w:t>
-      </w:r>
-    </w:p>
-    <w:p>
-      <w:pPr>
-        <w:tabs>
-          <w:tab w:val="left" w:pos="-284"/>
-          <w:tab w:val="left" w:pos="284"/>
-        </w:tabs>
-        <w:jc w:val="center"/>
-        <w:rPr>
-          <w:sz w:val="16"/>
-          <w:szCs w:val="16"/>
-        </w:rPr>
-      </w:pPr>
     </w:p>
     <w:p>
       <w:pPr>
@@ -1253,6 +1292,82 @@
               </w:rPr>
               <w:t xml:space="preserve">  </w:t>
             </w:r>
+            <w:r>
+              <w:rPr>
+                <w:rFonts w:ascii="Arial" w:eastAsia="Arial" w:hAnsi="Arial" w:cs="Arial"/>
+                <w:sz w:val="22"/>
+                <w:szCs w:val="22"/>
+              </w:rPr>
+              <w:t>{{InspectionResultLine6}}</w:t>
+            </w:r>
+          </w:p>
+        </w:tc>
+      </w:tr>
+      <w:tr>
+        <w:trPr>
+          <w:trHeight w:hRule="exact" w:val="400"/>
+        </w:trPr>
+        <w:tc>
+          <w:tcPr>
+            <w:tcW w:w="9781" w:type="dxa"/>
+            <w:tcBorders>
+              <w:top w:val="nil"/>
+              <w:left w:val="nil"/>
+              <w:bottom w:val="single" w:sz="4" w:space="0" w:color="000000"/>
+              <w:right w:val="nil"/>
+            </w:tcBorders>
+            <w:vAlign w:val="bottom"/>
+          </w:tcPr>
+          <w:p>
+            <w:pPr>
+              <w:spacing w:line="220" w:lineRule="exact"/>
+            </w:pPr>
+            <w:r>
+              <w:rPr>
+                <w:rFonts w:ascii="Arial" w:eastAsia="Arial" w:hAnsi="Arial" w:cs="Arial"/>
+                <w:sz w:val="22"/>
+                <w:szCs w:val="22"/>
+              </w:rPr>
+              <w:t xml:space="preserve">  </w:t>
+            </w:r>
+            <w:r>
+              <w:rPr>
+                <w:rFonts w:ascii="Arial" w:eastAsia="Arial" w:hAnsi="Arial" w:cs="Arial"/>
+                <w:sz w:val="22"/>
+                <w:szCs w:val="22"/>
+              </w:rPr>
+              <w:t>{{InspectionResultLine7}}</w:t>
+            </w:r>
+          </w:p>
+        </w:tc>
+      </w:tr>
+      <w:tr>
+        <w:trPr>
+          <w:trHeight w:hRule="exact" w:val="400"/>
+        </w:trPr>
+        <w:tc>
+          <w:tcPr>
+            <w:tcW w:w="9781" w:type="dxa"/>
+            <w:tcBorders>
+              <w:top w:val="nil"/>
+              <w:left w:val="nil"/>
+              <w:bottom w:val="single" w:sz="4" w:space="0" w:color="000000"/>
+              <w:right w:val="nil"/>
+            </w:tcBorders>
+            <w:vAlign w:val="bottom"/>
+          </w:tcPr>
+          <w:p>
+            <w:pPr>
+              <w:spacing w:line="220" w:lineRule="exact"/>
+            </w:pPr>
+            <w:r>
+              <w:rPr>
+                <w:rFonts w:ascii="Arial" w:eastAsia="Arial" w:hAnsi="Arial" w:cs="Arial"/>
+                <w:sz w:val="22"/>
+                <w:szCs w:val="22"/>
+              </w:rPr>
+              <w:t xml:space="preserve">  </w:t>
+            </w:r>
             <w:bookmarkStart w:id="0" w:name="_GoBack"/>
             <w:bookmarkEnd w:id="0"/>
             <w:r>
@@ -1261,7 +1376,7 @@
                 <w:sz w:val="22"/>
                 <w:szCs w:val="22"/>
               </w:rPr>
-              <w:t>{{InspectionResultLine6}}</w:t>
+              <w:t>{{InspectionResultLine8}}</w:t>
             </w:r>
           </w:p>
         </w:tc>
@@ -1300,7 +1415,7 @@
       </w:tblGrid>
       <w:tr>
         <w:trPr>
-          <w:trHeight w:hRule="exact" w:val="557"/>
+          <w:trHeight w:hRule="exact" w:val="341"/>
         </w:trPr>
         <w:tc>
           <w:tcPr>
@@ -1358,15 +1473,7 @@
           <w:sz w:val="18"/>
           <w:szCs w:val="18"/>
         </w:rPr>
-        <w:t xml:space="preserve">В какую службу, подразделение переданы работы по выполнению </w:t>
-      </w:r>
-      <w:r>
-        <w:rPr>
-          <w:rFonts w:ascii="Arial" w:eastAsia="Arial" w:hAnsi="Arial" w:cs="Arial"/>
-          <w:sz w:val="18"/>
-          <w:szCs w:val="18"/>
-        </w:rPr>
-        <w:t>заявки.</w:t>
+        <w:t>В какую службу, подразделение переданы работы по выполнению заявки.</w:t>
       </w:r>
     </w:p>
     <w:p>
@@ -1441,14 +1548,6 @@
             <w:pPr>
               <w:spacing w:line="220" w:lineRule="exact"/>
             </w:pPr>
-            <w:r>
-              <w:rPr>
-                <w:rFonts w:ascii="Arial" w:eastAsia="Arial" w:hAnsi="Arial" w:cs="Arial"/>
-                <w:sz w:val="22"/>
-                <w:szCs w:val="22"/>
-              </w:rPr>
-              <w:t>{{WorkStart}}</w:t>
-            </w:r>
           </w:p>
         </w:tc>
         <w:tc>
@@ -1491,14 +1590,6 @@
             <w:pPr>
               <w:spacing w:line="220" w:lineRule="exact"/>
             </w:pPr>
-            <w:r>
-              <w:rPr>
-                <w:rFonts w:ascii="Arial" w:eastAsia="Arial" w:hAnsi="Arial" w:cs="Arial"/>
-                <w:sz w:val="22"/>
-                <w:szCs w:val="22"/>
-              </w:rPr>
-              <w:t>{{WorkEnd}}</w:t>
-            </w:r>
           </w:p>
         </w:tc>
       </w:tr>
@@ -3979,6 +4070,7 @@
   <w:style w:type="paragraph" w:default="1" w:styleId="a">
     <w:name w:val="Normal"/>
     <w:qFormat/>
+    <w:rsid w:val="0037257B"/>
     <w:rPr>
       <w:sz w:val="24"/>
       <w:szCs w:val="24"/>

</xml_diff>

<commit_message>
Finalize inspection act template and roadmap
</commit_message>
<xml_diff>
--- a/Templates/Acts/inspection_act.docx
+++ b/Templates/Acts/inspection_act.docx
@@ -10,10 +10,16 @@
         </w:tabs>
         <w:ind w:left="5387"/>
         <w:outlineLvl w:val="0"/>
+        <w:rPr>
+          <w:sz w:val="22"/>
+          <w:szCs w:val="22"/>
+        </w:rPr>
       </w:pPr>
       <w:r>
         <w:rPr>
           <w:rFonts w:ascii="Arial" w:eastAsia="Arial" w:hAnsi="Arial" w:cs="Arial"/>
+          <w:sz w:val="22"/>
+          <w:szCs w:val="22"/>
         </w:rPr>
         <w:t>УТВЕРЖДАЮ</w:t>
       </w:r>
@@ -27,17 +33,23 @@
         <w:ind w:left="5387"/>
         <w:rPr>
           <w:rFonts w:ascii="Arial" w:eastAsia="Arial" w:hAnsi="Arial" w:cs="Arial"/>
+          <w:sz w:val="22"/>
+          <w:szCs w:val="22"/>
         </w:rPr>
       </w:pPr>
       <w:r>
         <w:rPr>
           <w:rFonts w:ascii="Arial" w:eastAsia="Arial" w:hAnsi="Arial" w:cs="Arial"/>
+          <w:sz w:val="22"/>
+          <w:szCs w:val="22"/>
         </w:rPr>
         <w:t>Замест</w:t>
       </w:r>
       <w:r>
         <w:rPr>
           <w:rFonts w:ascii="Arial" w:eastAsia="Arial" w:hAnsi="Arial" w:cs="Arial"/>
+          <w:sz w:val="22"/>
+          <w:szCs w:val="22"/>
         </w:rPr>
         <w:t xml:space="preserve">итель главного инженера </w:t>
       </w:r>
@@ -49,22 +61,32 @@
           <w:tab w:val="left" w:pos="284"/>
         </w:tabs>
         <w:ind w:left="5387"/>
+        <w:rPr>
+          <w:sz w:val="22"/>
+          <w:szCs w:val="22"/>
+        </w:rPr>
       </w:pPr>
       <w:r>
         <w:rPr>
           <w:rFonts w:ascii="Arial" w:eastAsia="Arial" w:hAnsi="Arial" w:cs="Arial"/>
+          <w:sz w:val="22"/>
+          <w:szCs w:val="22"/>
         </w:rPr>
         <w:t>по ИТиА -</w:t>
       </w:r>
       <w:r>
         <w:rPr>
           <w:rFonts w:ascii="Arial" w:eastAsia="Arial" w:hAnsi="Arial" w:cs="Arial"/>
+          <w:sz w:val="22"/>
+          <w:szCs w:val="22"/>
         </w:rPr>
         <w:t xml:space="preserve"> н</w:t>
       </w:r>
       <w:r>
         <w:rPr>
           <w:rFonts w:ascii="Arial" w:eastAsia="Arial" w:hAnsi="Arial" w:cs="Arial"/>
+          <w:sz w:val="22"/>
+          <w:szCs w:val="22"/>
         </w:rPr>
         <w:t>ачальник УИТиА</w:t>
       </w:r>
@@ -76,6 +98,10 @@
           <w:tab w:val="left" w:pos="284"/>
         </w:tabs>
         <w:ind w:left="5387"/>
+        <w:rPr>
+          <w:sz w:val="20"/>
+          <w:szCs w:val="20"/>
+        </w:rPr>
       </w:pPr>
     </w:p>
     <w:tbl>
@@ -115,14 +141,44 @@
           <w:p>
             <w:pPr>
               <w:spacing w:line="220" w:lineRule="exact"/>
+              <w:rPr>
+                <w:sz w:val="20"/>
+                <w:szCs w:val="20"/>
+              </w:rPr>
             </w:pPr>
             <w:r>
               <w:rPr>
                 <w:rFonts w:ascii="Arial" w:eastAsia="Arial" w:hAnsi="Arial" w:cs="Arial"/>
-                <w:sz w:val="22"/>
-                <w:szCs w:val="22"/>
-              </w:rPr>
-              <w:t>{{ApproverName}}</w:t>
+                <w:sz w:val="20"/>
+                <w:szCs w:val="20"/>
+              </w:rPr>
+              <w:t xml:space="preserve">                                        </w:t>
+            </w:r>
+            <w:r>
+              <w:rPr>
+                <w:rFonts w:ascii="Arial" w:eastAsia="Arial" w:hAnsi="Arial" w:cs="Arial"/>
+                <w:sz w:val="20"/>
+                <w:szCs w:val="20"/>
+              </w:rPr>
+              <w:t>{{</w:t>
+            </w:r>
+            <w:proofErr w:type="spellStart"/>
+            <w:r>
+              <w:rPr>
+                <w:rFonts w:ascii="Arial" w:eastAsia="Arial" w:hAnsi="Arial" w:cs="Arial"/>
+                <w:sz w:val="20"/>
+                <w:szCs w:val="20"/>
+              </w:rPr>
+              <w:t>ApproverName</w:t>
+            </w:r>
+            <w:proofErr w:type="spellEnd"/>
+            <w:r>
+              <w:rPr>
+                <w:rFonts w:ascii="Arial" w:eastAsia="Arial" w:hAnsi="Arial" w:cs="Arial"/>
+                <w:sz w:val="20"/>
+                <w:szCs w:val="20"/>
+              </w:rPr>
+              <w:t>}}</w:t>
             </w:r>
           </w:p>
         </w:tc>
@@ -146,12 +202,24 @@
           <w:p>
             <w:pPr>
               <w:spacing w:line="220" w:lineRule="exact"/>
+              <w:rPr>
+                <w:sz w:val="20"/>
+                <w:szCs w:val="20"/>
+              </w:rPr>
             </w:pPr>
             <w:r>
               <w:rPr>
                 <w:rFonts w:ascii="Arial" w:eastAsia="Arial" w:hAnsi="Arial" w:cs="Arial"/>
-                <w:sz w:val="22"/>
-                <w:szCs w:val="22"/>
+                <w:sz w:val="20"/>
+                <w:szCs w:val="20"/>
+              </w:rPr>
+              <w:t xml:space="preserve">                                        </w:t>
+            </w:r>
+            <w:r>
+              <w:rPr>
+                <w:rFonts w:ascii="Arial" w:eastAsia="Arial" w:hAnsi="Arial" w:cs="Arial"/>
+                <w:sz w:val="20"/>
+                <w:szCs w:val="20"/>
               </w:rPr>
               <w:t>{{</w:t>
             </w:r>
@@ -159,8 +227,8 @@
             <w:r>
               <w:rPr>
                 <w:rFonts w:ascii="Arial" w:eastAsia="Arial" w:hAnsi="Arial" w:cs="Arial"/>
-                <w:sz w:val="22"/>
-                <w:szCs w:val="22"/>
+                <w:sz w:val="20"/>
+                <w:szCs w:val="20"/>
               </w:rPr>
               <w:t>ApprovalDate</w:t>
             </w:r>
@@ -168,8 +236,8 @@
             <w:r>
               <w:rPr>
                 <w:rFonts w:ascii="Arial" w:eastAsia="Arial" w:hAnsi="Arial" w:cs="Arial"/>
-                <w:sz w:val="22"/>
-                <w:szCs w:val="22"/>
+                <w:sz w:val="20"/>
+                <w:szCs w:val="20"/>
               </w:rPr>
               <w:t>}}</w:t>
             </w:r>
@@ -194,10 +262,14 @@
         </w:tabs>
         <w:jc w:val="center"/>
         <w:outlineLvl w:val="0"/>
+        <w:rPr>
+          <w:b/>
+        </w:rPr>
       </w:pPr>
       <w:r>
         <w:rPr>
           <w:rFonts w:ascii="Arial" w:eastAsia="Arial" w:hAnsi="Arial" w:cs="Arial"/>
+          <w:b/>
         </w:rPr>
         <w:t>АКТ</w:t>
       </w:r>
@@ -238,12 +310,16 @@
           <w:p>
             <w:pPr>
               <w:spacing w:line="220" w:lineRule="exact"/>
+              <w:rPr>
+                <w:sz w:val="20"/>
+                <w:szCs w:val="20"/>
+              </w:rPr>
             </w:pPr>
             <w:r>
               <w:rPr>
                 <w:rFonts w:ascii="Arial" w:eastAsia="Arial" w:hAnsi="Arial" w:cs="Arial"/>
-                <w:sz w:val="22"/>
-                <w:szCs w:val="22"/>
+                <w:sz w:val="20"/>
+                <w:szCs w:val="20"/>
               </w:rPr>
               <w:t>о приемке выполненных работ от</w:t>
             </w:r>
@@ -263,12 +339,16 @@
           <w:p>
             <w:pPr>
               <w:spacing w:line="220" w:lineRule="exact"/>
+              <w:rPr>
+                <w:sz w:val="20"/>
+                <w:szCs w:val="20"/>
+              </w:rPr>
             </w:pPr>
             <w:r>
               <w:rPr>
                 <w:rFonts w:ascii="Arial" w:eastAsia="Arial" w:hAnsi="Arial" w:cs="Arial"/>
-                <w:sz w:val="22"/>
-                <w:szCs w:val="22"/>
+                <w:sz w:val="20"/>
+                <w:szCs w:val="20"/>
               </w:rPr>
               <w:t>{{</w:t>
             </w:r>
@@ -276,8 +356,8 @@
             <w:r>
               <w:rPr>
                 <w:rFonts w:ascii="Arial" w:eastAsia="Arial" w:hAnsi="Arial" w:cs="Arial"/>
-                <w:sz w:val="22"/>
-                <w:szCs w:val="22"/>
+                <w:sz w:val="20"/>
+                <w:szCs w:val="20"/>
               </w:rPr>
               <w:t>ActDate</w:t>
             </w:r>
@@ -285,8 +365,8 @@
             <w:r>
               <w:rPr>
                 <w:rFonts w:ascii="Arial" w:eastAsia="Arial" w:hAnsi="Arial" w:cs="Arial"/>
-                <w:sz w:val="22"/>
-                <w:szCs w:val="22"/>
+                <w:sz w:val="20"/>
+                <w:szCs w:val="20"/>
               </w:rPr>
               <w:t>}}</w:t>
             </w:r>
@@ -338,20 +418,24 @@
           <w:p>
             <w:pPr>
               <w:spacing w:line="220" w:lineRule="exact"/>
+              <w:rPr>
+                <w:sz w:val="20"/>
+                <w:szCs w:val="20"/>
+              </w:rPr>
             </w:pPr>
             <w:r>
               <w:rPr>
                 <w:rFonts w:ascii="Arial" w:eastAsia="Arial" w:hAnsi="Arial" w:cs="Arial"/>
-                <w:sz w:val="22"/>
-                <w:szCs w:val="22"/>
+                <w:sz w:val="20"/>
+                <w:szCs w:val="20"/>
               </w:rPr>
               <w:t xml:space="preserve">  </w:t>
             </w:r>
             <w:r>
               <w:rPr>
                 <w:rFonts w:ascii="Arial" w:eastAsia="Arial" w:hAnsi="Arial" w:cs="Arial"/>
-                <w:sz w:val="22"/>
-                <w:szCs w:val="22"/>
+                <w:sz w:val="20"/>
+                <w:szCs w:val="20"/>
               </w:rPr>
               <w:t>{{ObjectLine1}}</w:t>
             </w:r>
@@ -404,20 +488,24 @@
           <w:p>
             <w:pPr>
               <w:spacing w:line="220" w:lineRule="exact"/>
+              <w:rPr>
+                <w:sz w:val="20"/>
+                <w:szCs w:val="20"/>
+              </w:rPr>
             </w:pPr>
             <w:r>
               <w:rPr>
                 <w:rFonts w:ascii="Arial" w:eastAsia="Arial" w:hAnsi="Arial" w:cs="Arial"/>
-                <w:sz w:val="22"/>
-                <w:szCs w:val="22"/>
+                <w:sz w:val="20"/>
+                <w:szCs w:val="20"/>
               </w:rPr>
               <w:t xml:space="preserve">  </w:t>
             </w:r>
             <w:r>
               <w:rPr>
                 <w:rFonts w:ascii="Arial" w:eastAsia="Arial" w:hAnsi="Arial" w:cs="Arial"/>
-                <w:sz w:val="22"/>
-                <w:szCs w:val="22"/>
+                <w:sz w:val="20"/>
+                <w:szCs w:val="20"/>
               </w:rPr>
               <w:t>{{ObjectLine2}}</w:t>
             </w:r>
@@ -486,12 +574,16 @@
           <w:p>
             <w:pPr>
               <w:spacing w:line="220" w:lineRule="exact"/>
+              <w:rPr>
+                <w:sz w:val="20"/>
+                <w:szCs w:val="20"/>
+              </w:rPr>
             </w:pPr>
             <w:r>
               <w:rPr>
                 <w:rFonts w:ascii="Arial" w:eastAsia="Arial" w:hAnsi="Arial" w:cs="Arial"/>
-                <w:sz w:val="22"/>
-                <w:szCs w:val="22"/>
+                <w:sz w:val="20"/>
+                <w:szCs w:val="20"/>
               </w:rPr>
               <w:t>Основание</w:t>
             </w:r>
@@ -511,20 +603,24 @@
           <w:p>
             <w:pPr>
               <w:spacing w:line="220" w:lineRule="exact"/>
+              <w:rPr>
+                <w:sz w:val="20"/>
+                <w:szCs w:val="20"/>
+              </w:rPr>
             </w:pPr>
             <w:r>
               <w:rPr>
                 <w:rFonts w:ascii="Arial" w:eastAsia="Arial" w:hAnsi="Arial" w:cs="Arial"/>
-                <w:sz w:val="22"/>
-                <w:szCs w:val="22"/>
+                <w:sz w:val="20"/>
+                <w:szCs w:val="20"/>
               </w:rPr>
               <w:t xml:space="preserve">  </w:t>
             </w:r>
             <w:r>
               <w:rPr>
                 <w:rFonts w:ascii="Arial" w:eastAsia="Arial" w:hAnsi="Arial" w:cs="Arial"/>
-                <w:sz w:val="22"/>
-                <w:szCs w:val="22"/>
+                <w:sz w:val="20"/>
+                <w:szCs w:val="20"/>
               </w:rPr>
               <w:t>{{</w:t>
             </w:r>
@@ -532,8 +628,8 @@
             <w:r>
               <w:rPr>
                 <w:rFonts w:ascii="Arial" w:eastAsia="Arial" w:hAnsi="Arial" w:cs="Arial"/>
-                <w:sz w:val="22"/>
-                <w:szCs w:val="22"/>
+                <w:sz w:val="20"/>
+                <w:szCs w:val="20"/>
               </w:rPr>
               <w:t>RequestDocument</w:t>
             </w:r>
@@ -541,8 +637,8 @@
             <w:r>
               <w:rPr>
                 <w:rFonts w:ascii="Arial" w:eastAsia="Arial" w:hAnsi="Arial" w:cs="Arial"/>
-                <w:sz w:val="22"/>
-                <w:szCs w:val="22"/>
+                <w:sz w:val="20"/>
+                <w:szCs w:val="20"/>
               </w:rPr>
               <w:t>}}</w:t>
             </w:r>
@@ -556,8 +652,8 @@
         <w:jc w:val="center"/>
         <w:rPr>
           <w:rFonts w:ascii="Arial" w:eastAsia="Arial" w:hAnsi="Arial" w:cs="Arial"/>
-          <w:sz w:val="16"/>
-          <w:szCs w:val="16"/>
+          <w:sz w:val="18"/>
+          <w:szCs w:val="18"/>
         </w:rPr>
       </w:pPr>
       <w:r>
@@ -571,24 +667,24 @@
       <w:r>
         <w:rPr>
           <w:rFonts w:ascii="Arial" w:eastAsia="Arial" w:hAnsi="Arial" w:cs="Arial"/>
-          <w:sz w:val="16"/>
-          <w:szCs w:val="16"/>
+          <w:sz w:val="18"/>
+          <w:szCs w:val="18"/>
         </w:rPr>
         <w:t>заявка, служебная записка или иной документ, указать наименование подразделения,</w:t>
       </w:r>
       <w:r>
         <w:rPr>
           <w:rFonts w:ascii="Arial" w:eastAsia="Arial" w:hAnsi="Arial" w:cs="Arial"/>
-          <w:sz w:val="16"/>
-          <w:szCs w:val="16"/>
+          <w:sz w:val="18"/>
+          <w:szCs w:val="18"/>
         </w:rPr>
         <w:t xml:space="preserve"> </w:t>
       </w:r>
       <w:r>
         <w:rPr>
           <w:rFonts w:ascii="Arial" w:eastAsia="Arial" w:hAnsi="Arial" w:cs="Arial"/>
-          <w:sz w:val="16"/>
-          <w:szCs w:val="16"/>
+          <w:sz w:val="18"/>
+          <w:szCs w:val="18"/>
         </w:rPr>
         <w:t>должность</w:t>
       </w:r>
@@ -599,23 +695,23 @@
         <w:jc w:val="center"/>
         <w:rPr>
           <w:rFonts w:ascii="Arial" w:eastAsia="Arial" w:hAnsi="Arial" w:cs="Arial"/>
-          <w:sz w:val="16"/>
-          <w:szCs w:val="16"/>
+          <w:sz w:val="18"/>
+          <w:szCs w:val="18"/>
         </w:rPr>
       </w:pPr>
       <w:r>
         <w:rPr>
           <w:rFonts w:ascii="Arial" w:eastAsia="Arial" w:hAnsi="Arial" w:cs="Arial"/>
-          <w:sz w:val="16"/>
-          <w:szCs w:val="16"/>
+          <w:sz w:val="18"/>
+          <w:szCs w:val="18"/>
         </w:rPr>
         <w:t xml:space="preserve">                       </w:t>
       </w:r>
       <w:r>
         <w:rPr>
           <w:rFonts w:ascii="Arial" w:eastAsia="Arial" w:hAnsi="Arial" w:cs="Arial"/>
-          <w:sz w:val="16"/>
-          <w:szCs w:val="16"/>
+          <w:sz w:val="18"/>
+          <w:szCs w:val="18"/>
         </w:rPr>
         <w:t>и Ф.И.О лица, подавшего заявку, или № служебной записки, или реквизиты иного документа</w:t>
       </w:r>
@@ -636,12 +732,17 @@
     <w:p>
       <w:pPr>
         <w:spacing w:line="220" w:lineRule="exact"/>
+        <w:rPr>
+          <w:rFonts w:ascii="Arial" w:hAnsi="Arial" w:cs="Arial"/>
+          <w:sz w:val="20"/>
+          <w:szCs w:val="20"/>
+        </w:rPr>
       </w:pPr>
       <w:r>
         <w:rPr>
           <w:rFonts w:ascii="Arial" w:eastAsia="Arial" w:hAnsi="Arial" w:cs="Arial"/>
-          <w:sz w:val="22"/>
-          <w:szCs w:val="22"/>
+          <w:sz w:val="20"/>
+          <w:szCs w:val="20"/>
         </w:rPr>
         <w:t>Мы нижеподписавшиеся:</w:t>
       </w:r>
@@ -688,15 +789,15 @@
               <w:spacing w:line="220" w:lineRule="exact"/>
               <w:rPr>
                 <w:rFonts w:ascii="Arial" w:eastAsia="Arial" w:hAnsi="Arial" w:cs="Arial"/>
-                <w:sz w:val="22"/>
-                <w:szCs w:val="22"/>
+                <w:sz w:val="20"/>
+                <w:szCs w:val="20"/>
               </w:rPr>
             </w:pPr>
             <w:r>
               <w:rPr>
                 <w:rFonts w:ascii="Arial" w:eastAsia="Arial" w:hAnsi="Arial" w:cs="Arial"/>
-                <w:sz w:val="22"/>
-                <w:szCs w:val="22"/>
+                <w:sz w:val="20"/>
+                <w:szCs w:val="20"/>
               </w:rPr>
               <w:t>представитель исполнителя работ</w:t>
             </w:r>
@@ -716,20 +817,25 @@
           <w:p>
             <w:pPr>
               <w:spacing w:line="220" w:lineRule="exact"/>
+              <w:rPr>
+                <w:rFonts w:ascii="Arial" w:hAnsi="Arial" w:cs="Arial"/>
+                <w:sz w:val="20"/>
+                <w:szCs w:val="20"/>
+              </w:rPr>
             </w:pPr>
             <w:r>
               <w:rPr>
                 <w:rFonts w:ascii="Arial" w:eastAsia="Arial" w:hAnsi="Arial" w:cs="Arial"/>
-                <w:sz w:val="22"/>
-                <w:szCs w:val="22"/>
+                <w:sz w:val="20"/>
+                <w:szCs w:val="20"/>
               </w:rPr>
               <w:t xml:space="preserve">  </w:t>
             </w:r>
             <w:r>
               <w:rPr>
                 <w:rFonts w:ascii="Arial" w:eastAsia="Arial" w:hAnsi="Arial" w:cs="Arial"/>
-                <w:sz w:val="22"/>
-                <w:szCs w:val="22"/>
+                <w:sz w:val="20"/>
+                <w:szCs w:val="20"/>
               </w:rPr>
               <w:t>{{</w:t>
             </w:r>
@@ -737,8 +843,8 @@
             <w:r>
               <w:rPr>
                 <w:rFonts w:ascii="Arial" w:eastAsia="Arial" w:hAnsi="Arial" w:cs="Arial"/>
-                <w:sz w:val="22"/>
-                <w:szCs w:val="22"/>
+                <w:sz w:val="20"/>
+                <w:szCs w:val="20"/>
               </w:rPr>
               <w:t>ExecutorNamePosition</w:t>
             </w:r>
@@ -746,8 +852,8 @@
             <w:r>
               <w:rPr>
                 <w:rFonts w:ascii="Arial" w:eastAsia="Arial" w:hAnsi="Arial" w:cs="Arial"/>
-                <w:sz w:val="22"/>
-                <w:szCs w:val="22"/>
+                <w:sz w:val="20"/>
+                <w:szCs w:val="20"/>
               </w:rPr>
               <w:t>}}</w:t>
             </w:r>
@@ -779,12 +885,17 @@
           <w:p>
             <w:pPr>
               <w:spacing w:line="220" w:lineRule="exact"/>
+              <w:rPr>
+                <w:rFonts w:ascii="Arial" w:hAnsi="Arial" w:cs="Arial"/>
+                <w:sz w:val="20"/>
+                <w:szCs w:val="20"/>
+              </w:rPr>
             </w:pPr>
             <w:r>
               <w:rPr>
                 <w:rFonts w:ascii="Arial" w:eastAsia="Arial" w:hAnsi="Arial" w:cs="Arial"/>
-                <w:sz w:val="22"/>
-                <w:szCs w:val="22"/>
+                <w:sz w:val="20"/>
+                <w:szCs w:val="20"/>
               </w:rPr>
               <w:t>{{ExecutorNamePosition2}}</w:t>
             </w:r>
@@ -796,6 +907,11 @@
       <w:pPr>
         <w:spacing w:line="220" w:lineRule="exact"/>
         <w:jc w:val="center"/>
+        <w:rPr>
+          <w:rFonts w:ascii="Arial" w:hAnsi="Arial" w:cs="Arial"/>
+          <w:sz w:val="18"/>
+          <w:szCs w:val="18"/>
+        </w:rPr>
       </w:pPr>
       <w:r>
         <w:rPr>
@@ -856,18 +972,36 @@
               <w:spacing w:line="220" w:lineRule="exact"/>
               <w:rPr>
                 <w:rFonts w:ascii="Arial" w:eastAsia="Arial" w:hAnsi="Arial" w:cs="Arial"/>
-                <w:sz w:val="22"/>
-                <w:szCs w:val="22"/>
+                <w:sz w:val="20"/>
+                <w:szCs w:val="20"/>
               </w:rPr>
             </w:pPr>
             <w:r>
               <w:rPr>
                 <w:rFonts w:ascii="Arial" w:eastAsia="Arial" w:hAnsi="Arial" w:cs="Arial"/>
-                <w:sz w:val="22"/>
-                <w:szCs w:val="22"/>
-              </w:rPr>
-              <w:t>представитель исполнителя работ</w:t>
-            </w:r>
+                <w:sz w:val="20"/>
+                <w:szCs w:val="20"/>
+              </w:rPr>
+              <w:t xml:space="preserve">и </w:t>
+            </w:r>
+            <w:r>
+              <w:rPr>
+                <w:rFonts w:ascii="Arial" w:eastAsia="Arial" w:hAnsi="Arial" w:cs="Arial"/>
+                <w:sz w:val="20"/>
+                <w:szCs w:val="20"/>
+              </w:rPr>
+              <w:t xml:space="preserve">представитель </w:t>
+            </w:r>
+            <w:r>
+              <w:rPr>
+                <w:rFonts w:ascii="Arial" w:eastAsia="Arial" w:hAnsi="Arial" w:cs="Arial"/>
+                <w:sz w:val="20"/>
+                <w:szCs w:val="20"/>
+              </w:rPr>
+              <w:t>заказчика</w:t>
+            </w:r>
+            <w:bookmarkStart w:id="0" w:name="_GoBack"/>
+            <w:bookmarkEnd w:id="0"/>
           </w:p>
         </w:tc>
         <w:tc>
@@ -884,12 +1018,17 @@
           <w:p>
             <w:pPr>
               <w:spacing w:line="220" w:lineRule="exact"/>
+              <w:rPr>
+                <w:rFonts w:ascii="Arial" w:hAnsi="Arial" w:cs="Arial"/>
+                <w:sz w:val="20"/>
+                <w:szCs w:val="20"/>
+              </w:rPr>
             </w:pPr>
             <w:r>
               <w:rPr>
                 <w:rFonts w:ascii="Arial" w:eastAsia="Arial" w:hAnsi="Arial" w:cs="Arial"/>
-                <w:sz w:val="22"/>
-                <w:szCs w:val="22"/>
+                <w:sz w:val="20"/>
+                <w:szCs w:val="20"/>
               </w:rPr>
               <w:t xml:space="preserve">  {{</w:t>
             </w:r>
@@ -897,8 +1036,8 @@
             <w:r>
               <w:rPr>
                 <w:rFonts w:ascii="Arial" w:eastAsia="Arial" w:hAnsi="Arial" w:cs="Arial"/>
-                <w:sz w:val="22"/>
-                <w:szCs w:val="22"/>
+                <w:sz w:val="20"/>
+                <w:szCs w:val="20"/>
               </w:rPr>
               <w:t>CustomerNamePosition</w:t>
             </w:r>
@@ -906,8 +1045,8 @@
             <w:r>
               <w:rPr>
                 <w:rFonts w:ascii="Arial" w:eastAsia="Arial" w:hAnsi="Arial" w:cs="Arial"/>
-                <w:sz w:val="22"/>
-                <w:szCs w:val="22"/>
+                <w:sz w:val="20"/>
+                <w:szCs w:val="20"/>
               </w:rPr>
               <w:t>}}</w:t>
             </w:r>
@@ -939,12 +1078,17 @@
           <w:p>
             <w:pPr>
               <w:spacing w:line="220" w:lineRule="exact"/>
+              <w:rPr>
+                <w:rFonts w:ascii="Arial" w:hAnsi="Arial" w:cs="Arial"/>
+                <w:sz w:val="20"/>
+                <w:szCs w:val="20"/>
+              </w:rPr>
             </w:pPr>
             <w:r>
               <w:rPr>
                 <w:rFonts w:ascii="Arial" w:eastAsia="Arial" w:hAnsi="Arial" w:cs="Arial"/>
-                <w:sz w:val="22"/>
-                <w:szCs w:val="22"/>
+                <w:sz w:val="20"/>
+                <w:szCs w:val="20"/>
               </w:rPr>
               <w:t>{{CustomerNamePosition2}}</w:t>
             </w:r>
@@ -957,8 +1101,9 @@
         <w:spacing w:line="220" w:lineRule="exact"/>
         <w:jc w:val="center"/>
         <w:rPr>
-          <w:sz w:val="16"/>
-          <w:szCs w:val="16"/>
+          <w:rFonts w:ascii="Arial" w:hAnsi="Arial" w:cs="Arial"/>
+          <w:sz w:val="18"/>
+          <w:szCs w:val="18"/>
         </w:rPr>
       </w:pPr>
       <w:r>
@@ -1036,20 +1181,26 @@
         </w:tabs>
         <w:jc w:val="center"/>
         <w:rPr>
-          <w:sz w:val="16"/>
-          <w:szCs w:val="16"/>
+          <w:rFonts w:ascii="Arial" w:hAnsi="Arial" w:cs="Arial"/>
+          <w:sz w:val="20"/>
+          <w:szCs w:val="20"/>
         </w:rPr>
       </w:pPr>
     </w:p>
     <w:p>
       <w:pPr>
         <w:spacing w:line="220" w:lineRule="exact"/>
+        <w:rPr>
+          <w:rFonts w:ascii="Arial" w:hAnsi="Arial" w:cs="Arial"/>
+          <w:sz w:val="20"/>
+          <w:szCs w:val="20"/>
+        </w:rPr>
       </w:pPr>
       <w:r>
         <w:rPr>
           <w:rFonts w:ascii="Arial" w:eastAsia="Arial" w:hAnsi="Arial" w:cs="Arial"/>
-          <w:sz w:val="22"/>
-          <w:szCs w:val="22"/>
+          <w:sz w:val="20"/>
+          <w:szCs w:val="20"/>
         </w:rPr>
         <w:t>Провели осмотр и проверку выполненных работ и установили:</w:t>
       </w:r>
@@ -1077,7 +1228,7 @@
       </w:tblGrid>
       <w:tr>
         <w:trPr>
-          <w:trHeight w:hRule="exact" w:val="400"/>
+          <w:trHeight w:hRule="exact" w:val="340"/>
         </w:trPr>
         <w:tc>
           <w:tcPr>
@@ -1093,20 +1244,25 @@
           <w:p>
             <w:pPr>
               <w:spacing w:line="220" w:lineRule="exact"/>
+              <w:rPr>
+                <w:rFonts w:ascii="Arial" w:hAnsi="Arial" w:cs="Arial"/>
+                <w:sz w:val="20"/>
+                <w:szCs w:val="20"/>
+              </w:rPr>
             </w:pPr>
             <w:r>
               <w:rPr>
                 <w:rFonts w:ascii="Arial" w:eastAsia="Arial" w:hAnsi="Arial" w:cs="Arial"/>
-                <w:sz w:val="22"/>
-                <w:szCs w:val="22"/>
+                <w:sz w:val="20"/>
+                <w:szCs w:val="20"/>
               </w:rPr>
               <w:t xml:space="preserve">  </w:t>
             </w:r>
             <w:r>
               <w:rPr>
                 <w:rFonts w:ascii="Arial" w:eastAsia="Arial" w:hAnsi="Arial" w:cs="Arial"/>
-                <w:sz w:val="22"/>
-                <w:szCs w:val="22"/>
+                <w:sz w:val="20"/>
+                <w:szCs w:val="20"/>
               </w:rPr>
               <w:t>{{InspectionResultLine1}}</w:t>
             </w:r>
@@ -1115,7 +1271,7 @@
       </w:tr>
       <w:tr>
         <w:trPr>
-          <w:trHeight w:hRule="exact" w:val="400"/>
+          <w:trHeight w:hRule="exact" w:val="340"/>
         </w:trPr>
         <w:tc>
           <w:tcPr>
@@ -1131,20 +1287,25 @@
           <w:p>
             <w:pPr>
               <w:spacing w:line="220" w:lineRule="exact"/>
+              <w:rPr>
+                <w:rFonts w:ascii="Arial" w:hAnsi="Arial" w:cs="Arial"/>
+                <w:sz w:val="20"/>
+                <w:szCs w:val="20"/>
+              </w:rPr>
             </w:pPr>
             <w:r>
               <w:rPr>
                 <w:rFonts w:ascii="Arial" w:eastAsia="Arial" w:hAnsi="Arial" w:cs="Arial"/>
-                <w:sz w:val="22"/>
-                <w:szCs w:val="22"/>
+                <w:sz w:val="20"/>
+                <w:szCs w:val="20"/>
               </w:rPr>
               <w:t xml:space="preserve">  </w:t>
             </w:r>
             <w:r>
               <w:rPr>
                 <w:rFonts w:ascii="Arial" w:eastAsia="Arial" w:hAnsi="Arial" w:cs="Arial"/>
-                <w:sz w:val="22"/>
-                <w:szCs w:val="22"/>
+                <w:sz w:val="20"/>
+                <w:szCs w:val="20"/>
               </w:rPr>
               <w:t>{{InspectionResultLine2}}</w:t>
             </w:r>
@@ -1153,7 +1314,7 @@
       </w:tr>
       <w:tr>
         <w:trPr>
-          <w:trHeight w:hRule="exact" w:val="400"/>
+          <w:trHeight w:hRule="exact" w:val="340"/>
         </w:trPr>
         <w:tc>
           <w:tcPr>
@@ -1169,20 +1330,25 @@
           <w:p>
             <w:pPr>
               <w:spacing w:line="220" w:lineRule="exact"/>
+              <w:rPr>
+                <w:rFonts w:ascii="Arial" w:hAnsi="Arial" w:cs="Arial"/>
+                <w:sz w:val="20"/>
+                <w:szCs w:val="20"/>
+              </w:rPr>
             </w:pPr>
             <w:r>
               <w:rPr>
                 <w:rFonts w:ascii="Arial" w:eastAsia="Arial" w:hAnsi="Arial" w:cs="Arial"/>
-                <w:sz w:val="22"/>
-                <w:szCs w:val="22"/>
+                <w:sz w:val="20"/>
+                <w:szCs w:val="20"/>
               </w:rPr>
               <w:t xml:space="preserve">  </w:t>
             </w:r>
             <w:r>
               <w:rPr>
                 <w:rFonts w:ascii="Arial" w:eastAsia="Arial" w:hAnsi="Arial" w:cs="Arial"/>
-                <w:sz w:val="22"/>
-                <w:szCs w:val="22"/>
+                <w:sz w:val="20"/>
+                <w:szCs w:val="20"/>
               </w:rPr>
               <w:t>{{InspectionResultLine3}}</w:t>
             </w:r>
@@ -1191,7 +1357,7 @@
       </w:tr>
       <w:tr>
         <w:trPr>
-          <w:trHeight w:hRule="exact" w:val="400"/>
+          <w:trHeight w:hRule="exact" w:val="340"/>
         </w:trPr>
         <w:tc>
           <w:tcPr>
@@ -1207,20 +1373,25 @@
           <w:p>
             <w:pPr>
               <w:spacing w:line="220" w:lineRule="exact"/>
+              <w:rPr>
+                <w:rFonts w:ascii="Arial" w:hAnsi="Arial" w:cs="Arial"/>
+                <w:sz w:val="20"/>
+                <w:szCs w:val="20"/>
+              </w:rPr>
             </w:pPr>
             <w:r>
               <w:rPr>
                 <w:rFonts w:ascii="Arial" w:eastAsia="Arial" w:hAnsi="Arial" w:cs="Arial"/>
-                <w:sz w:val="22"/>
-                <w:szCs w:val="22"/>
+                <w:sz w:val="20"/>
+                <w:szCs w:val="20"/>
               </w:rPr>
               <w:t xml:space="preserve">  </w:t>
             </w:r>
             <w:r>
               <w:rPr>
                 <w:rFonts w:ascii="Arial" w:eastAsia="Arial" w:hAnsi="Arial" w:cs="Arial"/>
-                <w:sz w:val="22"/>
-                <w:szCs w:val="22"/>
+                <w:sz w:val="20"/>
+                <w:szCs w:val="20"/>
               </w:rPr>
               <w:t>{{InspectionResultLine4}}</w:t>
             </w:r>
@@ -1229,7 +1400,7 @@
       </w:tr>
       <w:tr>
         <w:trPr>
-          <w:trHeight w:hRule="exact" w:val="400"/>
+          <w:trHeight w:hRule="exact" w:val="340"/>
         </w:trPr>
         <w:tc>
           <w:tcPr>
@@ -1245,20 +1416,25 @@
           <w:p>
             <w:pPr>
               <w:spacing w:line="220" w:lineRule="exact"/>
+              <w:rPr>
+                <w:rFonts w:ascii="Arial" w:hAnsi="Arial" w:cs="Arial"/>
+                <w:sz w:val="20"/>
+                <w:szCs w:val="20"/>
+              </w:rPr>
             </w:pPr>
             <w:r>
               <w:rPr>
                 <w:rFonts w:ascii="Arial" w:eastAsia="Arial" w:hAnsi="Arial" w:cs="Arial"/>
-                <w:sz w:val="22"/>
-                <w:szCs w:val="22"/>
+                <w:sz w:val="20"/>
+                <w:szCs w:val="20"/>
               </w:rPr>
               <w:t xml:space="preserve">  </w:t>
             </w:r>
             <w:r>
               <w:rPr>
                 <w:rFonts w:ascii="Arial" w:eastAsia="Arial" w:hAnsi="Arial" w:cs="Arial"/>
-                <w:sz w:val="22"/>
-                <w:szCs w:val="22"/>
+                <w:sz w:val="20"/>
+                <w:szCs w:val="20"/>
               </w:rPr>
               <w:t>{{InspectionResultLine5}}</w:t>
             </w:r>
@@ -1267,7 +1443,7 @@
       </w:tr>
       <w:tr>
         <w:trPr>
-          <w:trHeight w:hRule="exact" w:val="400"/>
+          <w:trHeight w:hRule="exact" w:val="340"/>
         </w:trPr>
         <w:tc>
           <w:tcPr>
@@ -1283,20 +1459,25 @@
           <w:p>
             <w:pPr>
               <w:spacing w:line="220" w:lineRule="exact"/>
+              <w:rPr>
+                <w:rFonts w:ascii="Arial" w:hAnsi="Arial" w:cs="Arial"/>
+                <w:sz w:val="20"/>
+                <w:szCs w:val="20"/>
+              </w:rPr>
             </w:pPr>
             <w:r>
               <w:rPr>
                 <w:rFonts w:ascii="Arial" w:eastAsia="Arial" w:hAnsi="Arial" w:cs="Arial"/>
-                <w:sz w:val="22"/>
-                <w:szCs w:val="22"/>
+                <w:sz w:val="20"/>
+                <w:szCs w:val="20"/>
               </w:rPr>
               <w:t xml:space="preserve">  </w:t>
             </w:r>
             <w:r>
               <w:rPr>
                 <w:rFonts w:ascii="Arial" w:eastAsia="Arial" w:hAnsi="Arial" w:cs="Arial"/>
-                <w:sz w:val="22"/>
-                <w:szCs w:val="22"/>
+                <w:sz w:val="20"/>
+                <w:szCs w:val="20"/>
               </w:rPr>
               <w:t>{{InspectionResultLine6}}</w:t>
             </w:r>
@@ -1305,7 +1486,7 @@
       </w:tr>
       <w:tr>
         <w:trPr>
-          <w:trHeight w:hRule="exact" w:val="400"/>
+          <w:trHeight w:hRule="exact" w:val="340"/>
         </w:trPr>
         <w:tc>
           <w:tcPr>
@@ -1321,20 +1502,25 @@
           <w:p>
             <w:pPr>
               <w:spacing w:line="220" w:lineRule="exact"/>
+              <w:rPr>
+                <w:rFonts w:ascii="Arial" w:hAnsi="Arial" w:cs="Arial"/>
+                <w:sz w:val="20"/>
+                <w:szCs w:val="20"/>
+              </w:rPr>
             </w:pPr>
             <w:r>
               <w:rPr>
                 <w:rFonts w:ascii="Arial" w:eastAsia="Arial" w:hAnsi="Arial" w:cs="Arial"/>
-                <w:sz w:val="22"/>
-                <w:szCs w:val="22"/>
+                <w:sz w:val="20"/>
+                <w:szCs w:val="20"/>
               </w:rPr>
               <w:t xml:space="preserve">  </w:t>
             </w:r>
             <w:r>
               <w:rPr>
                 <w:rFonts w:ascii="Arial" w:eastAsia="Arial" w:hAnsi="Arial" w:cs="Arial"/>
-                <w:sz w:val="22"/>
-                <w:szCs w:val="22"/>
+                <w:sz w:val="20"/>
+                <w:szCs w:val="20"/>
               </w:rPr>
               <w:t>{{InspectionResultLine7}}</w:t>
             </w:r>
@@ -1343,7 +1529,7 @@
       </w:tr>
       <w:tr>
         <w:trPr>
-          <w:trHeight w:hRule="exact" w:val="400"/>
+          <w:trHeight w:hRule="exact" w:val="340"/>
         </w:trPr>
         <w:tc>
           <w:tcPr>
@@ -1359,22 +1545,25 @@
           <w:p>
             <w:pPr>
               <w:spacing w:line="220" w:lineRule="exact"/>
+              <w:rPr>
+                <w:rFonts w:ascii="Arial" w:hAnsi="Arial" w:cs="Arial"/>
+                <w:sz w:val="20"/>
+                <w:szCs w:val="20"/>
+              </w:rPr>
             </w:pPr>
             <w:r>
               <w:rPr>
                 <w:rFonts w:ascii="Arial" w:eastAsia="Arial" w:hAnsi="Arial" w:cs="Arial"/>
-                <w:sz w:val="22"/>
-                <w:szCs w:val="22"/>
+                <w:sz w:val="20"/>
+                <w:szCs w:val="20"/>
               </w:rPr>
               <w:t xml:space="preserve">  </w:t>
             </w:r>
-            <w:bookmarkStart w:id="0" w:name="_GoBack"/>
-            <w:bookmarkEnd w:id="0"/>
-            <w:r>
-              <w:rPr>
-                <w:rFonts w:ascii="Arial" w:eastAsia="Arial" w:hAnsi="Arial" w:cs="Arial"/>
-                <w:sz w:val="22"/>
-                <w:szCs w:val="22"/>
+            <w:r>
+              <w:rPr>
+                <w:rFonts w:ascii="Arial" w:eastAsia="Arial" w:hAnsi="Arial" w:cs="Arial"/>
+                <w:sz w:val="20"/>
+                <w:szCs w:val="20"/>
               </w:rPr>
               <w:t>{{InspectionResultLine8}}</w:t>
             </w:r>
@@ -1386,6 +1575,11 @@
       <w:pPr>
         <w:spacing w:line="220" w:lineRule="exact"/>
         <w:jc w:val="center"/>
+        <w:rPr>
+          <w:rFonts w:ascii="Arial" w:hAnsi="Arial" w:cs="Arial"/>
+          <w:sz w:val="18"/>
+          <w:szCs w:val="18"/>
+        </w:rPr>
       </w:pPr>
       <w:r>
         <w:rPr>
@@ -1431,12 +1625,17 @@
           <w:p>
             <w:pPr>
               <w:spacing w:line="220" w:lineRule="exact"/>
+              <w:rPr>
+                <w:rFonts w:ascii="Arial" w:hAnsi="Arial" w:cs="Arial"/>
+                <w:sz w:val="20"/>
+                <w:szCs w:val="20"/>
+              </w:rPr>
             </w:pPr>
             <w:r>
               <w:rPr>
                 <w:rFonts w:ascii="Arial" w:eastAsia="Arial" w:hAnsi="Arial" w:cs="Arial"/>
-                <w:sz w:val="22"/>
-                <w:szCs w:val="22"/>
+                <w:sz w:val="20"/>
+                <w:szCs w:val="20"/>
               </w:rPr>
               <w:t>{{</w:t>
             </w:r>
@@ -1444,8 +1643,8 @@
             <w:r>
               <w:rPr>
                 <w:rFonts w:ascii="Arial" w:eastAsia="Arial" w:hAnsi="Arial" w:cs="Arial"/>
-                <w:sz w:val="22"/>
-                <w:szCs w:val="22"/>
+                <w:sz w:val="20"/>
+                <w:szCs w:val="20"/>
               </w:rPr>
               <w:t>TransferredToLine</w:t>
             </w:r>
@@ -1453,8 +1652,8 @@
             <w:r>
               <w:rPr>
                 <w:rFonts w:ascii="Arial" w:eastAsia="Arial" w:hAnsi="Arial" w:cs="Arial"/>
-                <w:sz w:val="22"/>
-                <w:szCs w:val="22"/>
+                <w:sz w:val="20"/>
+                <w:szCs w:val="20"/>
               </w:rPr>
               <w:t>}}</w:t>
             </w:r>
@@ -1466,6 +1665,11 @@
       <w:pPr>
         <w:spacing w:line="220" w:lineRule="exact"/>
         <w:jc w:val="center"/>
+        <w:rPr>
+          <w:rFonts w:ascii="Arial" w:hAnsi="Arial" w:cs="Arial"/>
+          <w:sz w:val="18"/>
+          <w:szCs w:val="18"/>
+        </w:rPr>
       </w:pPr>
       <w:r>
         <w:rPr>
@@ -1482,6 +1686,11 @@
           <w:tab w:val="left" w:pos="-284"/>
           <w:tab w:val="left" w:pos="284"/>
         </w:tabs>
+        <w:rPr>
+          <w:rFonts w:ascii="Arial" w:hAnsi="Arial" w:cs="Arial"/>
+          <w:sz w:val="20"/>
+          <w:szCs w:val="20"/>
+        </w:rPr>
       </w:pPr>
     </w:p>
     <w:tbl>
@@ -1522,12 +1731,17 @@
           <w:p>
             <w:pPr>
               <w:spacing w:line="220" w:lineRule="exact"/>
+              <w:rPr>
+                <w:rFonts w:ascii="Arial" w:hAnsi="Arial" w:cs="Arial"/>
+                <w:sz w:val="20"/>
+                <w:szCs w:val="20"/>
+              </w:rPr>
             </w:pPr>
             <w:r>
               <w:rPr>
                 <w:rFonts w:ascii="Arial" w:eastAsia="Arial" w:hAnsi="Arial" w:cs="Arial"/>
-                <w:sz w:val="22"/>
-                <w:szCs w:val="22"/>
+                <w:sz w:val="20"/>
+                <w:szCs w:val="20"/>
               </w:rPr>
               <w:t>Начало работ</w:t>
             </w:r>
@@ -1547,6 +1761,11 @@
           <w:p>
             <w:pPr>
               <w:spacing w:line="220" w:lineRule="exact"/>
+              <w:rPr>
+                <w:rFonts w:ascii="Arial" w:hAnsi="Arial" w:cs="Arial"/>
+                <w:sz w:val="20"/>
+                <w:szCs w:val="20"/>
+              </w:rPr>
             </w:pPr>
           </w:p>
         </w:tc>
@@ -1564,12 +1783,17 @@
           <w:p>
             <w:pPr>
               <w:spacing w:line="220" w:lineRule="exact"/>
+              <w:rPr>
+                <w:rFonts w:ascii="Arial" w:hAnsi="Arial" w:cs="Arial"/>
+                <w:sz w:val="20"/>
+                <w:szCs w:val="20"/>
+              </w:rPr>
             </w:pPr>
             <w:r>
               <w:rPr>
                 <w:rFonts w:ascii="Arial" w:eastAsia="Arial" w:hAnsi="Arial" w:cs="Arial"/>
-                <w:sz w:val="22"/>
-                <w:szCs w:val="22"/>
+                <w:sz w:val="20"/>
+                <w:szCs w:val="20"/>
               </w:rPr>
               <w:t>Окончание работ</w:t>
             </w:r>
@@ -1589,6 +1813,11 @@
           <w:p>
             <w:pPr>
               <w:spacing w:line="220" w:lineRule="exact"/>
+              <w:rPr>
+                <w:rFonts w:ascii="Arial" w:hAnsi="Arial" w:cs="Arial"/>
+                <w:sz w:val="20"/>
+                <w:szCs w:val="20"/>
+              </w:rPr>
             </w:pPr>
           </w:p>
         </w:tc>
@@ -1600,42 +1829,103 @@
           <w:tab w:val="left" w:pos="-284"/>
           <w:tab w:val="left" w:pos="284"/>
         </w:tabs>
-      </w:pPr>
+        <w:rPr>
+          <w:rFonts w:ascii="Arial" w:hAnsi="Arial" w:cs="Arial"/>
+          <w:sz w:val="20"/>
+          <w:szCs w:val="20"/>
+        </w:rPr>
+      </w:pPr>
+      <w:r>
+        <w:rPr>
+          <w:rFonts w:ascii="Arial" w:eastAsia="Arial" w:hAnsi="Arial" w:cs="Arial"/>
+          <w:sz w:val="20"/>
+          <w:szCs w:val="20"/>
+        </w:rPr>
+        <w:tab/>
+      </w:r>
+      <w:r>
+        <w:rPr>
+          <w:rFonts w:ascii="Arial" w:eastAsia="Arial" w:hAnsi="Arial" w:cs="Arial"/>
+          <w:sz w:val="20"/>
+          <w:szCs w:val="20"/>
+        </w:rPr>
+        <w:tab/>
+      </w:r>
+      <w:r>
+        <w:rPr>
+          <w:rFonts w:ascii="Arial" w:eastAsia="Arial" w:hAnsi="Arial" w:cs="Arial"/>
+          <w:sz w:val="20"/>
+          <w:szCs w:val="20"/>
+        </w:rPr>
+        <w:tab/>
+      </w:r>
+      <w:r>
+        <w:rPr>
+          <w:rFonts w:ascii="Arial" w:eastAsia="Arial" w:hAnsi="Arial" w:cs="Arial"/>
+          <w:sz w:val="20"/>
+          <w:szCs w:val="20"/>
+        </w:rPr>
+        <w:tab/>
+      </w:r>
       <w:r>
         <w:rPr>
           <w:rFonts w:ascii="Arial" w:eastAsia="Arial" w:hAnsi="Arial" w:cs="Arial"/>
           <w:sz w:val="18"/>
           <w:szCs w:val="18"/>
         </w:rPr>
+        <w:t>Дата, время</w:t>
+      </w:r>
+      <w:r>
+        <w:rPr>
+          <w:rFonts w:ascii="Arial" w:eastAsia="Arial" w:hAnsi="Arial" w:cs="Arial"/>
+          <w:sz w:val="18"/>
+          <w:szCs w:val="18"/>
+        </w:rPr>
         <w:tab/>
       </w:r>
       <w:r>
         <w:rPr>
           <w:rFonts w:ascii="Arial" w:eastAsia="Arial" w:hAnsi="Arial" w:cs="Arial"/>
-          <w:sz w:val="18"/>
-          <w:szCs w:val="18"/>
+          <w:sz w:val="20"/>
+          <w:szCs w:val="20"/>
         </w:rPr>
         <w:tab/>
       </w:r>
       <w:r>
         <w:rPr>
           <w:rFonts w:ascii="Arial" w:eastAsia="Arial" w:hAnsi="Arial" w:cs="Arial"/>
-          <w:sz w:val="18"/>
-          <w:szCs w:val="18"/>
+          <w:sz w:val="20"/>
+          <w:szCs w:val="20"/>
         </w:rPr>
         <w:tab/>
       </w:r>
       <w:r>
         <w:rPr>
           <w:rFonts w:ascii="Arial" w:eastAsia="Arial" w:hAnsi="Arial" w:cs="Arial"/>
-          <w:sz w:val="18"/>
-          <w:szCs w:val="18"/>
+          <w:sz w:val="20"/>
+          <w:szCs w:val="20"/>
         </w:rPr>
         <w:tab/>
       </w:r>
       <w:r>
         <w:rPr>
           <w:rFonts w:ascii="Arial" w:eastAsia="Arial" w:hAnsi="Arial" w:cs="Arial"/>
+          <w:sz w:val="20"/>
+          <w:szCs w:val="20"/>
+        </w:rPr>
+        <w:tab/>
+      </w:r>
+      <w:r>
+        <w:rPr>
+          <w:rFonts w:ascii="Arial" w:eastAsia="Arial" w:hAnsi="Arial" w:cs="Arial"/>
+          <w:sz w:val="18"/>
+          <w:szCs w:val="18"/>
+        </w:rPr>
+        <w:tab/>
+      </w:r>
+      <w:r>
+        <w:rPr>
+          <w:rFonts w:ascii="Arial" w:eastAsia="Arial" w:hAnsi="Arial" w:cs="Arial"/>
           <w:sz w:val="18"/>
           <w:szCs w:val="18"/>
         </w:rPr>
@@ -1644,64 +1934,8 @@
       <w:r>
         <w:rPr>
           <w:rFonts w:ascii="Arial" w:eastAsia="Arial" w:hAnsi="Arial" w:cs="Arial"/>
-          <w:sz w:val="18"/>
-          <w:szCs w:val="18"/>
-        </w:rPr>
-        <w:tab/>
-      </w:r>
-      <w:r>
-        <w:rPr>
-          <w:rFonts w:ascii="Arial" w:eastAsia="Arial" w:hAnsi="Arial" w:cs="Arial"/>
-          <w:sz w:val="18"/>
-          <w:szCs w:val="18"/>
-        </w:rPr>
-        <w:tab/>
-      </w:r>
-      <w:r>
-        <w:rPr>
-          <w:rFonts w:ascii="Arial" w:eastAsia="Arial" w:hAnsi="Arial" w:cs="Arial"/>
-          <w:sz w:val="18"/>
-          <w:szCs w:val="18"/>
-        </w:rPr>
-        <w:tab/>
-      </w:r>
-      <w:r>
-        <w:rPr>
-          <w:rFonts w:ascii="Arial" w:eastAsia="Arial" w:hAnsi="Arial" w:cs="Arial"/>
-          <w:sz w:val="18"/>
-          <w:szCs w:val="18"/>
-        </w:rPr>
-        <w:tab/>
-      </w:r>
-      <w:r>
-        <w:rPr>
-          <w:rFonts w:ascii="Arial" w:eastAsia="Arial" w:hAnsi="Arial" w:cs="Arial"/>
-          <w:sz w:val="18"/>
-          <w:szCs w:val="18"/>
-        </w:rPr>
-        <w:tab/>
-      </w:r>
-      <w:r>
-        <w:rPr>
-          <w:rFonts w:ascii="Arial" w:eastAsia="Arial" w:hAnsi="Arial" w:cs="Arial"/>
-          <w:sz w:val="18"/>
-          <w:szCs w:val="18"/>
-        </w:rPr>
-        <w:tab/>
-      </w:r>
-      <w:r>
-        <w:rPr>
-          <w:rFonts w:ascii="Arial" w:eastAsia="Arial" w:hAnsi="Arial" w:cs="Arial"/>
-          <w:sz w:val="18"/>
-          <w:szCs w:val="18"/>
-        </w:rPr>
-        <w:t>Дата, время</w:t>
-      </w:r>
-      <w:r>
-        <w:rPr>
-          <w:rFonts w:ascii="Arial" w:eastAsia="Arial" w:hAnsi="Arial" w:cs="Arial"/>
-          <w:sz w:val="18"/>
-          <w:szCs w:val="18"/>
+          <w:sz w:val="20"/>
+          <w:szCs w:val="20"/>
         </w:rPr>
         <w:br/>
       </w:r>
@@ -1746,12 +1980,17 @@
           <w:p>
             <w:pPr>
               <w:spacing w:line="220" w:lineRule="exact"/>
+              <w:rPr>
+                <w:rFonts w:ascii="Arial" w:hAnsi="Arial" w:cs="Arial"/>
+                <w:sz w:val="20"/>
+                <w:szCs w:val="20"/>
+              </w:rPr>
             </w:pPr>
             <w:r>
               <w:rPr>
                 <w:rFonts w:ascii="Arial" w:eastAsia="Arial" w:hAnsi="Arial" w:cs="Arial"/>
-                <w:sz w:val="22"/>
-                <w:szCs w:val="22"/>
+                <w:sz w:val="20"/>
+                <w:szCs w:val="20"/>
               </w:rPr>
               <w:t>Фактическая трудоемкость работ</w:t>
             </w:r>
@@ -1771,20 +2010,25 @@
           <w:p>
             <w:pPr>
               <w:spacing w:line="220" w:lineRule="exact"/>
+              <w:rPr>
+                <w:rFonts w:ascii="Arial" w:hAnsi="Arial" w:cs="Arial"/>
+                <w:sz w:val="20"/>
+                <w:szCs w:val="20"/>
+              </w:rPr>
             </w:pPr>
             <w:r>
               <w:rPr>
                 <w:rFonts w:ascii="Arial" w:eastAsia="Arial" w:hAnsi="Arial" w:cs="Arial"/>
-                <w:sz w:val="22"/>
-                <w:szCs w:val="22"/>
+                <w:sz w:val="20"/>
+                <w:szCs w:val="20"/>
               </w:rPr>
               <w:t xml:space="preserve">  </w:t>
             </w:r>
             <w:r>
               <w:rPr>
                 <w:rFonts w:ascii="Arial" w:eastAsia="Arial" w:hAnsi="Arial" w:cs="Arial"/>
-                <w:sz w:val="22"/>
-                <w:szCs w:val="22"/>
+                <w:sz w:val="20"/>
+                <w:szCs w:val="20"/>
               </w:rPr>
               <w:t>{{</w:t>
             </w:r>
@@ -1792,8 +2036,8 @@
             <w:r>
               <w:rPr>
                 <w:rFonts w:ascii="Arial" w:eastAsia="Arial" w:hAnsi="Arial" w:cs="Arial"/>
-                <w:sz w:val="22"/>
-                <w:szCs w:val="22"/>
+                <w:sz w:val="20"/>
+                <w:szCs w:val="20"/>
               </w:rPr>
               <w:t>ActualLaborHours</w:t>
             </w:r>
@@ -1801,8 +2045,8 @@
             <w:r>
               <w:rPr>
                 <w:rFonts w:ascii="Arial" w:eastAsia="Arial" w:hAnsi="Arial" w:cs="Arial"/>
-                <w:sz w:val="22"/>
-                <w:szCs w:val="22"/>
+                <w:sz w:val="20"/>
+                <w:szCs w:val="20"/>
               </w:rPr>
               <w:t xml:space="preserve">}} </w:t>
             </w:r>
@@ -1810,8 +2054,8 @@
             <w:r>
               <w:rPr>
                 <w:rFonts w:ascii="Arial" w:eastAsia="Arial" w:hAnsi="Arial" w:cs="Arial"/>
-                <w:sz w:val="22"/>
-                <w:szCs w:val="22"/>
+                <w:sz w:val="20"/>
+                <w:szCs w:val="20"/>
               </w:rPr>
               <w:t>чел.часов</w:t>
             </w:r>
@@ -1826,6 +2070,11 @@
           <w:tab w:val="left" w:pos="-284"/>
           <w:tab w:val="left" w:pos="284"/>
         </w:tabs>
+        <w:rPr>
+          <w:rFonts w:ascii="Arial" w:hAnsi="Arial" w:cs="Arial"/>
+          <w:sz w:val="20"/>
+          <w:szCs w:val="20"/>
+        </w:rPr>
       </w:pPr>
     </w:p>
     <w:p>
@@ -1835,8 +2084,9 @@
           <w:tab w:val="left" w:pos="284"/>
         </w:tabs>
         <w:rPr>
-          <w:sz w:val="16"/>
-          <w:szCs w:val="16"/>
+          <w:rFonts w:ascii="Arial" w:hAnsi="Arial" w:cs="Arial"/>
+          <w:sz w:val="20"/>
+          <w:szCs w:val="20"/>
         </w:rPr>
       </w:pPr>
     </w:p>
@@ -1881,12 +2131,17 @@
           <w:p>
             <w:pPr>
               <w:spacing w:line="220" w:lineRule="exact"/>
+              <w:rPr>
+                <w:rFonts w:ascii="Arial" w:hAnsi="Arial" w:cs="Arial"/>
+                <w:sz w:val="20"/>
+                <w:szCs w:val="20"/>
+              </w:rPr>
             </w:pPr>
             <w:r>
               <w:rPr>
                 <w:rFonts w:ascii="Arial" w:eastAsia="Arial" w:hAnsi="Arial" w:cs="Arial"/>
-                <w:sz w:val="22"/>
-                <w:szCs w:val="22"/>
+                <w:sz w:val="20"/>
+                <w:szCs w:val="20"/>
               </w:rPr>
               <w:t>Представитель заказчика</w:t>
             </w:r>
@@ -1907,6 +2162,11 @@
             <w:pPr>
               <w:spacing w:line="220" w:lineRule="exact"/>
               <w:jc w:val="center"/>
+              <w:rPr>
+                <w:rFonts w:ascii="Arial" w:hAnsi="Arial" w:cs="Arial"/>
+                <w:sz w:val="20"/>
+                <w:szCs w:val="20"/>
+              </w:rPr>
             </w:pPr>
           </w:p>
         </w:tc>
@@ -1925,12 +2185,17 @@
             <w:pPr>
               <w:spacing w:line="220" w:lineRule="exact"/>
               <w:jc w:val="center"/>
+              <w:rPr>
+                <w:rFonts w:ascii="Arial" w:hAnsi="Arial" w:cs="Arial"/>
+                <w:sz w:val="20"/>
+                <w:szCs w:val="20"/>
+              </w:rPr>
             </w:pPr>
             <w:r>
               <w:rPr>
                 <w:rFonts w:ascii="Arial" w:eastAsia="Arial" w:hAnsi="Arial" w:cs="Arial"/>
-                <w:sz w:val="22"/>
-                <w:szCs w:val="22"/>
+                <w:sz w:val="20"/>
+                <w:szCs w:val="20"/>
               </w:rPr>
               <w:t>{{CustomerSignatureName}}</w:t>
             </w:r>
@@ -1955,6 +2220,11 @@
           <w:p>
             <w:pPr>
               <w:spacing w:line="220" w:lineRule="exact"/>
+              <w:rPr>
+                <w:rFonts w:ascii="Arial" w:hAnsi="Arial" w:cs="Arial"/>
+                <w:sz w:val="20"/>
+                <w:szCs w:val="20"/>
+              </w:rPr>
             </w:pPr>
           </w:p>
         </w:tc>
@@ -1973,6 +2243,11 @@
             <w:pPr>
               <w:spacing w:line="220" w:lineRule="exact"/>
               <w:jc w:val="center"/>
+              <w:rPr>
+                <w:rFonts w:ascii="Arial" w:hAnsi="Arial" w:cs="Arial"/>
+                <w:sz w:val="18"/>
+                <w:szCs w:val="18"/>
+              </w:rPr>
             </w:pPr>
             <w:r>
               <w:rPr>
@@ -1999,6 +2274,11 @@
             <w:pPr>
               <w:spacing w:line="220" w:lineRule="exact"/>
               <w:jc w:val="center"/>
+              <w:rPr>
+                <w:rFonts w:ascii="Arial" w:hAnsi="Arial" w:cs="Arial"/>
+                <w:sz w:val="18"/>
+                <w:szCs w:val="18"/>
+              </w:rPr>
             </w:pPr>
             <w:r>
               <w:rPr>
@@ -2029,12 +2309,17 @@
           <w:p>
             <w:pPr>
               <w:spacing w:line="220" w:lineRule="exact"/>
+              <w:rPr>
+                <w:rFonts w:ascii="Arial" w:hAnsi="Arial" w:cs="Arial"/>
+                <w:sz w:val="20"/>
+                <w:szCs w:val="20"/>
+              </w:rPr>
             </w:pPr>
             <w:r>
               <w:rPr>
                 <w:rFonts w:ascii="Arial" w:eastAsia="Arial" w:hAnsi="Arial" w:cs="Arial"/>
-                <w:sz w:val="22"/>
-                <w:szCs w:val="22"/>
+                <w:sz w:val="20"/>
+                <w:szCs w:val="20"/>
               </w:rPr>
               <w:t>Представитель исполнителя</w:t>
             </w:r>
@@ -2055,6 +2340,11 @@
             <w:pPr>
               <w:spacing w:line="220" w:lineRule="exact"/>
               <w:jc w:val="center"/>
+              <w:rPr>
+                <w:rFonts w:ascii="Arial" w:hAnsi="Arial" w:cs="Arial"/>
+                <w:sz w:val="20"/>
+                <w:szCs w:val="20"/>
+              </w:rPr>
             </w:pPr>
           </w:p>
         </w:tc>
@@ -2073,12 +2363,17 @@
             <w:pPr>
               <w:spacing w:line="220" w:lineRule="exact"/>
               <w:jc w:val="center"/>
+              <w:rPr>
+                <w:rFonts w:ascii="Arial" w:hAnsi="Arial" w:cs="Arial"/>
+                <w:sz w:val="20"/>
+                <w:szCs w:val="20"/>
+              </w:rPr>
             </w:pPr>
             <w:r>
               <w:rPr>
                 <w:rFonts w:ascii="Arial" w:eastAsia="Arial" w:hAnsi="Arial" w:cs="Arial"/>
-                <w:sz w:val="22"/>
-                <w:szCs w:val="22"/>
+                <w:sz w:val="20"/>
+                <w:szCs w:val="20"/>
               </w:rPr>
               <w:t>{{ExecutorSignatureName}}</w:t>
             </w:r>
@@ -2103,6 +2398,11 @@
           <w:p>
             <w:pPr>
               <w:spacing w:line="220" w:lineRule="exact"/>
+              <w:rPr>
+                <w:rFonts w:ascii="Arial" w:hAnsi="Arial" w:cs="Arial"/>
+                <w:sz w:val="18"/>
+                <w:szCs w:val="18"/>
+              </w:rPr>
             </w:pPr>
           </w:p>
         </w:tc>
@@ -2121,6 +2421,11 @@
             <w:pPr>
               <w:spacing w:line="220" w:lineRule="exact"/>
               <w:jc w:val="center"/>
+              <w:rPr>
+                <w:rFonts w:ascii="Arial" w:hAnsi="Arial" w:cs="Arial"/>
+                <w:sz w:val="18"/>
+                <w:szCs w:val="18"/>
+              </w:rPr>
             </w:pPr>
             <w:r>
               <w:rPr>
@@ -2147,6 +2452,11 @@
             <w:pPr>
               <w:spacing w:line="220" w:lineRule="exact"/>
               <w:jc w:val="center"/>
+              <w:rPr>
+                <w:rFonts w:ascii="Arial" w:hAnsi="Arial" w:cs="Arial"/>
+                <w:sz w:val="18"/>
+                <w:szCs w:val="18"/>
+              </w:rPr>
             </w:pPr>
             <w:r>
               <w:rPr>
@@ -2160,7 +2470,15 @@
         </w:tc>
       </w:tr>
     </w:tbl>
-    <w:p/>
+    <w:p>
+      <w:pPr>
+        <w:rPr>
+          <w:rFonts w:ascii="Arial" w:hAnsi="Arial" w:cs="Arial"/>
+          <w:sz w:val="18"/>
+          <w:szCs w:val="18"/>
+        </w:rPr>
+      </w:pPr>
+    </w:p>
     <w:sectPr>
       <w:pgSz w:w="11906" w:h="16838"/>
       <w:pgMar w:top="709" w:right="849" w:bottom="426" w:left="1560" w:header="708" w:footer="708" w:gutter="0"/>

</xml_diff>

<commit_message>
Finalize inspection act workflow and DOCX output
</commit_message>
<xml_diff>
--- a/Templates/Acts/inspection_act.docx
+++ b/Templates/Acts/inspection_act.docx
@@ -43,52 +43,25 @@
           <w:sz w:val="22"/>
           <w:szCs w:val="22"/>
         </w:rPr>
-        <w:t>Замест</w:t>
+        <w:t>{{</w:t>
       </w:r>
+      <w:proofErr w:type="spellStart"/>
       <w:r>
         <w:rPr>
           <w:rFonts w:ascii="Arial" w:eastAsia="Arial" w:hAnsi="Arial" w:cs="Arial"/>
           <w:sz w:val="22"/>
           <w:szCs w:val="22"/>
         </w:rPr>
-        <w:t xml:space="preserve">итель главного инженера </w:t>
+        <w:t>ApproverPosition</w:t>
       </w:r>
-    </w:p>
-    <w:p>
-      <w:pPr>
-        <w:tabs>
-          <w:tab w:val="left" w:pos="-284"/>
-          <w:tab w:val="left" w:pos="284"/>
-        </w:tabs>
-        <w:ind w:left="5387"/>
-        <w:rPr>
-          <w:sz w:val="22"/>
-          <w:szCs w:val="22"/>
-        </w:rPr>
-      </w:pPr>
+      <w:proofErr w:type="spellEnd"/>
       <w:r>
         <w:rPr>
           <w:rFonts w:ascii="Arial" w:eastAsia="Arial" w:hAnsi="Arial" w:cs="Arial"/>
           <w:sz w:val="22"/>
           <w:szCs w:val="22"/>
         </w:rPr>
-        <w:t>по ИТиА -</w:t>
-      </w:r>
-      <w:r>
-        <w:rPr>
-          <w:rFonts w:ascii="Arial" w:eastAsia="Arial" w:hAnsi="Arial" w:cs="Arial"/>
-          <w:sz w:val="22"/>
-          <w:szCs w:val="22"/>
-        </w:rPr>
-        <w:t xml:space="preserve"> н</w:t>
-      </w:r>
-      <w:r>
-        <w:rPr>
-          <w:rFonts w:ascii="Arial" w:eastAsia="Arial" w:hAnsi="Arial" w:cs="Arial"/>
-          <w:sz w:val="22"/>
-          <w:szCs w:val="22"/>
-        </w:rPr>
-        <w:t>ачальник УИТиА</w:t>
+        <w:t>}}</w:t>
       </w:r>
     </w:p>
     <w:p>
@@ -142,23 +115,31 @@
             <w:pPr>
               <w:spacing w:line="220" w:lineRule="exact"/>
               <w:rPr>
+                <w:sz w:val="22"/>
+                <w:szCs w:val="22"/>
+              </w:rPr>
+            </w:pPr>
+            <w:r>
+              <w:rPr>
+                <w:rFonts w:ascii="Arial" w:eastAsia="Arial" w:hAnsi="Arial" w:cs="Arial"/>
                 <w:sz w:val="20"/>
                 <w:szCs w:val="20"/>
               </w:rPr>
-            </w:pPr>
+              <w:t xml:space="preserve">     </w:t>
+            </w:r>
             <w:r>
               <w:rPr>
                 <w:rFonts w:ascii="Arial" w:eastAsia="Arial" w:hAnsi="Arial" w:cs="Arial"/>
                 <w:sz w:val="20"/>
                 <w:szCs w:val="20"/>
               </w:rPr>
-              <w:t xml:space="preserve">                                        </w:t>
-            </w:r>
-            <w:r>
-              <w:rPr>
-                <w:rFonts w:ascii="Arial" w:eastAsia="Arial" w:hAnsi="Arial" w:cs="Arial"/>
-                <w:sz w:val="20"/>
-                <w:szCs w:val="20"/>
+              <w:t xml:space="preserve">                            </w:t>
+            </w:r>
+            <w:r>
+              <w:rPr>
+                <w:rFonts w:ascii="Arial" w:eastAsia="Arial" w:hAnsi="Arial" w:cs="Arial"/>
+                <w:sz w:val="22"/>
+                <w:szCs w:val="22"/>
               </w:rPr>
               <w:t>{{</w:t>
             </w:r>
@@ -166,8 +147,8 @@
             <w:r>
               <w:rPr>
                 <w:rFonts w:ascii="Arial" w:eastAsia="Arial" w:hAnsi="Arial" w:cs="Arial"/>
-                <w:sz w:val="20"/>
-                <w:szCs w:val="20"/>
+                <w:sz w:val="22"/>
+                <w:szCs w:val="22"/>
               </w:rPr>
               <w:t>ApproverName</w:t>
             </w:r>
@@ -175,8 +156,8 @@
             <w:r>
               <w:rPr>
                 <w:rFonts w:ascii="Arial" w:eastAsia="Arial" w:hAnsi="Arial" w:cs="Arial"/>
-                <w:sz w:val="20"/>
-                <w:szCs w:val="20"/>
+                <w:sz w:val="22"/>
+                <w:szCs w:val="22"/>
               </w:rPr>
               <w:t>}}</w:t>
             </w:r>
@@ -215,32 +196,6 @@
               </w:rPr>
               <w:t xml:space="preserve">                                        </w:t>
             </w:r>
-            <w:r>
-              <w:rPr>
-                <w:rFonts w:ascii="Arial" w:eastAsia="Arial" w:hAnsi="Arial" w:cs="Arial"/>
-                <w:sz w:val="20"/>
-                <w:szCs w:val="20"/>
-              </w:rPr>
-              <w:t>{{</w:t>
-            </w:r>
-            <w:proofErr w:type="spellStart"/>
-            <w:r>
-              <w:rPr>
-                <w:rFonts w:ascii="Arial" w:eastAsia="Arial" w:hAnsi="Arial" w:cs="Arial"/>
-                <w:sz w:val="20"/>
-                <w:szCs w:val="20"/>
-              </w:rPr>
-              <w:t>ApprovalDate</w:t>
-            </w:r>
-            <w:proofErr w:type="spellEnd"/>
-            <w:r>
-              <w:rPr>
-                <w:rFonts w:ascii="Arial" w:eastAsia="Arial" w:hAnsi="Arial" w:cs="Arial"/>
-                <w:sz w:val="20"/>
-                <w:szCs w:val="20"/>
-              </w:rPr>
-              <w:t>}}</w:t>
-            </w:r>
           </w:p>
         </w:tc>
       </w:tr>
@@ -264,12 +219,16 @@
         <w:outlineLvl w:val="0"/>
         <w:rPr>
           <w:b/>
+          <w:sz w:val="22"/>
+          <w:szCs w:val="22"/>
         </w:rPr>
       </w:pPr>
       <w:r>
         <w:rPr>
           <w:rFonts w:ascii="Arial" w:eastAsia="Arial" w:hAnsi="Arial" w:cs="Arial"/>
           <w:b/>
+          <w:sz w:val="22"/>
+          <w:szCs w:val="22"/>
         </w:rPr>
         <w:t>АКТ</w:t>
       </w:r>
@@ -340,15 +299,15 @@
             <w:pPr>
               <w:spacing w:line="220" w:lineRule="exact"/>
               <w:rPr>
-                <w:sz w:val="20"/>
-                <w:szCs w:val="20"/>
+                <w:sz w:val="22"/>
+                <w:szCs w:val="22"/>
               </w:rPr>
             </w:pPr>
             <w:r>
               <w:rPr>
                 <w:rFonts w:ascii="Arial" w:eastAsia="Arial" w:hAnsi="Arial" w:cs="Arial"/>
-                <w:sz w:val="20"/>
-                <w:szCs w:val="20"/>
+                <w:sz w:val="22"/>
+                <w:szCs w:val="22"/>
               </w:rPr>
               <w:t>{{</w:t>
             </w:r>
@@ -356,8 +315,8 @@
             <w:r>
               <w:rPr>
                 <w:rFonts w:ascii="Arial" w:eastAsia="Arial" w:hAnsi="Arial" w:cs="Arial"/>
-                <w:sz w:val="20"/>
-                <w:szCs w:val="20"/>
+                <w:sz w:val="22"/>
+                <w:szCs w:val="22"/>
               </w:rPr>
               <w:t>ActDate</w:t>
             </w:r>
@@ -365,8 +324,8 @@
             <w:r>
               <w:rPr>
                 <w:rFonts w:ascii="Arial" w:eastAsia="Arial" w:hAnsi="Arial" w:cs="Arial"/>
-                <w:sz w:val="20"/>
-                <w:szCs w:val="20"/>
+                <w:sz w:val="22"/>
+                <w:szCs w:val="22"/>
               </w:rPr>
               <w:t>}}</w:t>
             </w:r>
@@ -419,23 +378,31 @@
             <w:pPr>
               <w:spacing w:line="220" w:lineRule="exact"/>
               <w:rPr>
+                <w:sz w:val="22"/>
+                <w:szCs w:val="22"/>
+              </w:rPr>
+            </w:pPr>
+            <w:r>
+              <w:rPr>
+                <w:rFonts w:ascii="Arial" w:eastAsia="Arial" w:hAnsi="Arial" w:cs="Arial"/>
                 <w:sz w:val="20"/>
                 <w:szCs w:val="20"/>
               </w:rPr>
-            </w:pPr>
-            <w:r>
-              <w:rPr>
-                <w:rFonts w:ascii="Arial" w:eastAsia="Arial" w:hAnsi="Arial" w:cs="Arial"/>
-                <w:sz w:val="20"/>
-                <w:szCs w:val="20"/>
-              </w:rPr>
-              <w:t xml:space="preserve">  </w:t>
-            </w:r>
-            <w:r>
-              <w:rPr>
-                <w:rFonts w:ascii="Arial" w:eastAsia="Arial" w:hAnsi="Arial" w:cs="Arial"/>
-                <w:sz w:val="20"/>
-                <w:szCs w:val="20"/>
+              <w:t xml:space="preserve"> </w:t>
+            </w:r>
+            <w:r>
+              <w:rPr>
+                <w:rFonts w:ascii="Arial" w:eastAsia="Arial" w:hAnsi="Arial" w:cs="Arial"/>
+                <w:sz w:val="22"/>
+                <w:szCs w:val="22"/>
+              </w:rPr>
+              <w:t xml:space="preserve"> </w:t>
+            </w:r>
+            <w:r>
+              <w:rPr>
+                <w:rFonts w:ascii="Arial" w:eastAsia="Arial" w:hAnsi="Arial" w:cs="Arial"/>
+                <w:sz w:val="22"/>
+                <w:szCs w:val="22"/>
               </w:rPr>
               <w:t>{{ObjectLine1}}</w:t>
             </w:r>
@@ -489,23 +456,23 @@
             <w:pPr>
               <w:spacing w:line="220" w:lineRule="exact"/>
               <w:rPr>
+                <w:sz w:val="22"/>
+                <w:szCs w:val="22"/>
+              </w:rPr>
+            </w:pPr>
+            <w:r>
+              <w:rPr>
+                <w:rFonts w:ascii="Arial" w:eastAsia="Arial" w:hAnsi="Arial" w:cs="Arial"/>
                 <w:sz w:val="20"/>
                 <w:szCs w:val="20"/>
               </w:rPr>
-            </w:pPr>
-            <w:r>
-              <w:rPr>
-                <w:rFonts w:ascii="Arial" w:eastAsia="Arial" w:hAnsi="Arial" w:cs="Arial"/>
-                <w:sz w:val="20"/>
-                <w:szCs w:val="20"/>
-              </w:rPr>
               <w:t xml:space="preserve">  </w:t>
             </w:r>
             <w:r>
               <w:rPr>
                 <w:rFonts w:ascii="Arial" w:eastAsia="Arial" w:hAnsi="Arial" w:cs="Arial"/>
-                <w:sz w:val="20"/>
-                <w:szCs w:val="20"/>
+                <w:sz w:val="22"/>
+                <w:szCs w:val="22"/>
               </w:rPr>
               <w:t>{{ObjectLine2}}</w:t>
             </w:r>
@@ -604,23 +571,23 @@
             <w:pPr>
               <w:spacing w:line="220" w:lineRule="exact"/>
               <w:rPr>
+                <w:sz w:val="22"/>
+                <w:szCs w:val="22"/>
+              </w:rPr>
+            </w:pPr>
+            <w:r>
+              <w:rPr>
+                <w:rFonts w:ascii="Arial" w:eastAsia="Arial" w:hAnsi="Arial" w:cs="Arial"/>
                 <w:sz w:val="20"/>
                 <w:szCs w:val="20"/>
               </w:rPr>
-            </w:pPr>
-            <w:r>
-              <w:rPr>
-                <w:rFonts w:ascii="Arial" w:eastAsia="Arial" w:hAnsi="Arial" w:cs="Arial"/>
-                <w:sz w:val="20"/>
-                <w:szCs w:val="20"/>
-              </w:rPr>
               <w:t xml:space="preserve">  </w:t>
             </w:r>
             <w:r>
               <w:rPr>
                 <w:rFonts w:ascii="Arial" w:eastAsia="Arial" w:hAnsi="Arial" w:cs="Arial"/>
-                <w:sz w:val="20"/>
-                <w:szCs w:val="20"/>
+                <w:sz w:val="22"/>
+                <w:szCs w:val="22"/>
               </w:rPr>
               <w:t>{{</w:t>
             </w:r>
@@ -628,8 +595,8 @@
             <w:r>
               <w:rPr>
                 <w:rFonts w:ascii="Arial" w:eastAsia="Arial" w:hAnsi="Arial" w:cs="Arial"/>
-                <w:sz w:val="20"/>
-                <w:szCs w:val="20"/>
+                <w:sz w:val="22"/>
+                <w:szCs w:val="22"/>
               </w:rPr>
               <w:t>RequestDocument</w:t>
             </w:r>
@@ -637,8 +604,8 @@
             <w:r>
               <w:rPr>
                 <w:rFonts w:ascii="Arial" w:eastAsia="Arial" w:hAnsi="Arial" w:cs="Arial"/>
-                <w:sz w:val="20"/>
-                <w:szCs w:val="20"/>
+                <w:sz w:val="22"/>
+                <w:szCs w:val="22"/>
               </w:rPr>
               <w:t>}}</w:t>
             </w:r>
@@ -819,23 +786,23 @@
               <w:spacing w:line="220" w:lineRule="exact"/>
               <w:rPr>
                 <w:rFonts w:ascii="Arial" w:hAnsi="Arial" w:cs="Arial"/>
+                <w:sz w:val="22"/>
+                <w:szCs w:val="22"/>
+              </w:rPr>
+            </w:pPr>
+            <w:r>
+              <w:rPr>
+                <w:rFonts w:ascii="Arial" w:eastAsia="Arial" w:hAnsi="Arial" w:cs="Arial"/>
                 <w:sz w:val="20"/>
                 <w:szCs w:val="20"/>
               </w:rPr>
-            </w:pPr>
-            <w:r>
-              <w:rPr>
-                <w:rFonts w:ascii="Arial" w:eastAsia="Arial" w:hAnsi="Arial" w:cs="Arial"/>
-                <w:sz w:val="20"/>
-                <w:szCs w:val="20"/>
-              </w:rPr>
               <w:t xml:space="preserve">  </w:t>
             </w:r>
             <w:r>
               <w:rPr>
                 <w:rFonts w:ascii="Arial" w:eastAsia="Arial" w:hAnsi="Arial" w:cs="Arial"/>
-                <w:sz w:val="20"/>
-                <w:szCs w:val="20"/>
+                <w:sz w:val="22"/>
+                <w:szCs w:val="22"/>
               </w:rPr>
               <w:t>{{</w:t>
             </w:r>
@@ -843,8 +810,8 @@
             <w:r>
               <w:rPr>
                 <w:rFonts w:ascii="Arial" w:eastAsia="Arial" w:hAnsi="Arial" w:cs="Arial"/>
-                <w:sz w:val="20"/>
-                <w:szCs w:val="20"/>
+                <w:sz w:val="22"/>
+                <w:szCs w:val="22"/>
               </w:rPr>
               <w:t>ExecutorNamePosition</w:t>
             </w:r>
@@ -852,8 +819,8 @@
             <w:r>
               <w:rPr>
                 <w:rFonts w:ascii="Arial" w:eastAsia="Arial" w:hAnsi="Arial" w:cs="Arial"/>
-                <w:sz w:val="20"/>
-                <w:szCs w:val="20"/>
+                <w:sz w:val="22"/>
+                <w:szCs w:val="22"/>
               </w:rPr>
               <w:t>}}</w:t>
             </w:r>
@@ -887,15 +854,15 @@
               <w:spacing w:line="220" w:lineRule="exact"/>
               <w:rPr>
                 <w:rFonts w:ascii="Arial" w:hAnsi="Arial" w:cs="Arial"/>
-                <w:sz w:val="20"/>
-                <w:szCs w:val="20"/>
+                <w:sz w:val="22"/>
+                <w:szCs w:val="22"/>
               </w:rPr>
             </w:pPr>
             <w:r>
               <w:rPr>
                 <w:rFonts w:ascii="Arial" w:eastAsia="Arial" w:hAnsi="Arial" w:cs="Arial"/>
-                <w:sz w:val="20"/>
-                <w:szCs w:val="20"/>
+                <w:sz w:val="22"/>
+                <w:szCs w:val="22"/>
               </w:rPr>
               <w:t>{{ExecutorNamePosition2}}</w:t>
             </w:r>
@@ -1000,8 +967,6 @@
               </w:rPr>
               <w:t>заказчика</w:t>
             </w:r>
-            <w:bookmarkStart w:id="0" w:name="_GoBack"/>
-            <w:bookmarkEnd w:id="0"/>
           </w:p>
         </w:tc>
         <w:tc>
@@ -1020,24 +985,32 @@
               <w:spacing w:line="220" w:lineRule="exact"/>
               <w:rPr>
                 <w:rFonts w:ascii="Arial" w:hAnsi="Arial" w:cs="Arial"/>
+                <w:sz w:val="22"/>
+                <w:szCs w:val="22"/>
+              </w:rPr>
+            </w:pPr>
+            <w:r>
+              <w:rPr>
+                <w:rFonts w:ascii="Arial" w:eastAsia="Arial" w:hAnsi="Arial" w:cs="Arial"/>
                 <w:sz w:val="20"/>
                 <w:szCs w:val="20"/>
               </w:rPr>
-            </w:pPr>
-            <w:r>
-              <w:rPr>
-                <w:rFonts w:ascii="Arial" w:eastAsia="Arial" w:hAnsi="Arial" w:cs="Arial"/>
-                <w:sz w:val="20"/>
-                <w:szCs w:val="20"/>
-              </w:rPr>
-              <w:t xml:space="preserve">  {{</w:t>
+              <w:t xml:space="preserve">  </w:t>
+            </w:r>
+            <w:r>
+              <w:rPr>
+                <w:rFonts w:ascii="Arial" w:eastAsia="Arial" w:hAnsi="Arial" w:cs="Arial"/>
+                <w:sz w:val="22"/>
+                <w:szCs w:val="22"/>
+              </w:rPr>
+              <w:t>{{</w:t>
             </w:r>
             <w:proofErr w:type="spellStart"/>
             <w:r>
               <w:rPr>
                 <w:rFonts w:ascii="Arial" w:eastAsia="Arial" w:hAnsi="Arial" w:cs="Arial"/>
-                <w:sz w:val="20"/>
-                <w:szCs w:val="20"/>
+                <w:sz w:val="22"/>
+                <w:szCs w:val="22"/>
               </w:rPr>
               <w:t>CustomerNamePosition</w:t>
             </w:r>
@@ -1045,8 +1018,8 @@
             <w:r>
               <w:rPr>
                 <w:rFonts w:ascii="Arial" w:eastAsia="Arial" w:hAnsi="Arial" w:cs="Arial"/>
-                <w:sz w:val="20"/>
-                <w:szCs w:val="20"/>
+                <w:sz w:val="22"/>
+                <w:szCs w:val="22"/>
               </w:rPr>
               <w:t>}}</w:t>
             </w:r>
@@ -1080,15 +1053,15 @@
               <w:spacing w:line="220" w:lineRule="exact"/>
               <w:rPr>
                 <w:rFonts w:ascii="Arial" w:hAnsi="Arial" w:cs="Arial"/>
-                <w:sz w:val="20"/>
-                <w:szCs w:val="20"/>
+                <w:sz w:val="22"/>
+                <w:szCs w:val="22"/>
               </w:rPr>
             </w:pPr>
             <w:r>
               <w:rPr>
                 <w:rFonts w:ascii="Arial" w:eastAsia="Arial" w:hAnsi="Arial" w:cs="Arial"/>
-                <w:sz w:val="20"/>
-                <w:szCs w:val="20"/>
+                <w:sz w:val="22"/>
+                <w:szCs w:val="22"/>
               </w:rPr>
               <w:t>{{CustomerNamePosition2}}</w:t>
             </w:r>
@@ -1246,23 +1219,23 @@
               <w:spacing w:line="220" w:lineRule="exact"/>
               <w:rPr>
                 <w:rFonts w:ascii="Arial" w:hAnsi="Arial" w:cs="Arial"/>
-                <w:sz w:val="20"/>
-                <w:szCs w:val="20"/>
+                <w:sz w:val="22"/>
+                <w:szCs w:val="22"/>
               </w:rPr>
             </w:pPr>
             <w:r>
               <w:rPr>
                 <w:rFonts w:ascii="Arial" w:eastAsia="Arial" w:hAnsi="Arial" w:cs="Arial"/>
-                <w:sz w:val="20"/>
-                <w:szCs w:val="20"/>
+                <w:sz w:val="22"/>
+                <w:szCs w:val="22"/>
               </w:rPr>
               <w:t xml:space="preserve">  </w:t>
             </w:r>
             <w:r>
               <w:rPr>
                 <w:rFonts w:ascii="Arial" w:eastAsia="Arial" w:hAnsi="Arial" w:cs="Arial"/>
-                <w:sz w:val="20"/>
-                <w:szCs w:val="20"/>
+                <w:sz w:val="22"/>
+                <w:szCs w:val="22"/>
               </w:rPr>
               <w:t>{{InspectionResultLine1}}</w:t>
             </w:r>
@@ -1289,23 +1262,23 @@
               <w:spacing w:line="220" w:lineRule="exact"/>
               <w:rPr>
                 <w:rFonts w:ascii="Arial" w:hAnsi="Arial" w:cs="Arial"/>
-                <w:sz w:val="20"/>
-                <w:szCs w:val="20"/>
+                <w:sz w:val="22"/>
+                <w:szCs w:val="22"/>
               </w:rPr>
             </w:pPr>
             <w:r>
               <w:rPr>
                 <w:rFonts w:ascii="Arial" w:eastAsia="Arial" w:hAnsi="Arial" w:cs="Arial"/>
-                <w:sz w:val="20"/>
-                <w:szCs w:val="20"/>
+                <w:sz w:val="22"/>
+                <w:szCs w:val="22"/>
               </w:rPr>
               <w:t xml:space="preserve">  </w:t>
             </w:r>
             <w:r>
               <w:rPr>
                 <w:rFonts w:ascii="Arial" w:eastAsia="Arial" w:hAnsi="Arial" w:cs="Arial"/>
-                <w:sz w:val="20"/>
-                <w:szCs w:val="20"/>
+                <w:sz w:val="22"/>
+                <w:szCs w:val="22"/>
               </w:rPr>
               <w:t>{{InspectionResultLine2}}</w:t>
             </w:r>
@@ -1332,23 +1305,23 @@
               <w:spacing w:line="220" w:lineRule="exact"/>
               <w:rPr>
                 <w:rFonts w:ascii="Arial" w:hAnsi="Arial" w:cs="Arial"/>
-                <w:sz w:val="20"/>
-                <w:szCs w:val="20"/>
+                <w:sz w:val="22"/>
+                <w:szCs w:val="22"/>
               </w:rPr>
             </w:pPr>
             <w:r>
               <w:rPr>
                 <w:rFonts w:ascii="Arial" w:eastAsia="Arial" w:hAnsi="Arial" w:cs="Arial"/>
-                <w:sz w:val="20"/>
-                <w:szCs w:val="20"/>
+                <w:sz w:val="22"/>
+                <w:szCs w:val="22"/>
               </w:rPr>
               <w:t xml:space="preserve">  </w:t>
             </w:r>
             <w:r>
               <w:rPr>
                 <w:rFonts w:ascii="Arial" w:eastAsia="Arial" w:hAnsi="Arial" w:cs="Arial"/>
-                <w:sz w:val="20"/>
-                <w:szCs w:val="20"/>
+                <w:sz w:val="22"/>
+                <w:szCs w:val="22"/>
               </w:rPr>
               <w:t>{{InspectionResultLine3}}</w:t>
             </w:r>
@@ -1375,23 +1348,23 @@
               <w:spacing w:line="220" w:lineRule="exact"/>
               <w:rPr>
                 <w:rFonts w:ascii="Arial" w:hAnsi="Arial" w:cs="Arial"/>
-                <w:sz w:val="20"/>
-                <w:szCs w:val="20"/>
+                <w:sz w:val="22"/>
+                <w:szCs w:val="22"/>
               </w:rPr>
             </w:pPr>
             <w:r>
               <w:rPr>
                 <w:rFonts w:ascii="Arial" w:eastAsia="Arial" w:hAnsi="Arial" w:cs="Arial"/>
-                <w:sz w:val="20"/>
-                <w:szCs w:val="20"/>
+                <w:sz w:val="22"/>
+                <w:szCs w:val="22"/>
               </w:rPr>
               <w:t xml:space="preserve">  </w:t>
             </w:r>
             <w:r>
               <w:rPr>
                 <w:rFonts w:ascii="Arial" w:eastAsia="Arial" w:hAnsi="Arial" w:cs="Arial"/>
-                <w:sz w:val="20"/>
-                <w:szCs w:val="20"/>
+                <w:sz w:val="22"/>
+                <w:szCs w:val="22"/>
               </w:rPr>
               <w:t>{{InspectionResultLine4}}</w:t>
             </w:r>
@@ -1418,23 +1391,23 @@
               <w:spacing w:line="220" w:lineRule="exact"/>
               <w:rPr>
                 <w:rFonts w:ascii="Arial" w:hAnsi="Arial" w:cs="Arial"/>
-                <w:sz w:val="20"/>
-                <w:szCs w:val="20"/>
+                <w:sz w:val="22"/>
+                <w:szCs w:val="22"/>
               </w:rPr>
             </w:pPr>
             <w:r>
               <w:rPr>
                 <w:rFonts w:ascii="Arial" w:eastAsia="Arial" w:hAnsi="Arial" w:cs="Arial"/>
-                <w:sz w:val="20"/>
-                <w:szCs w:val="20"/>
+                <w:sz w:val="22"/>
+                <w:szCs w:val="22"/>
               </w:rPr>
               <w:t xml:space="preserve">  </w:t>
             </w:r>
             <w:r>
               <w:rPr>
                 <w:rFonts w:ascii="Arial" w:eastAsia="Arial" w:hAnsi="Arial" w:cs="Arial"/>
-                <w:sz w:val="20"/>
-                <w:szCs w:val="20"/>
+                <w:sz w:val="22"/>
+                <w:szCs w:val="22"/>
               </w:rPr>
               <w:t>{{InspectionResultLine5}}</w:t>
             </w:r>
@@ -1461,23 +1434,23 @@
               <w:spacing w:line="220" w:lineRule="exact"/>
               <w:rPr>
                 <w:rFonts w:ascii="Arial" w:hAnsi="Arial" w:cs="Arial"/>
-                <w:sz w:val="20"/>
-                <w:szCs w:val="20"/>
+                <w:sz w:val="22"/>
+                <w:szCs w:val="22"/>
               </w:rPr>
             </w:pPr>
             <w:r>
               <w:rPr>
                 <w:rFonts w:ascii="Arial" w:eastAsia="Arial" w:hAnsi="Arial" w:cs="Arial"/>
-                <w:sz w:val="20"/>
-                <w:szCs w:val="20"/>
+                <w:sz w:val="22"/>
+                <w:szCs w:val="22"/>
               </w:rPr>
               <w:t xml:space="preserve">  </w:t>
             </w:r>
             <w:r>
               <w:rPr>
                 <w:rFonts w:ascii="Arial" w:eastAsia="Arial" w:hAnsi="Arial" w:cs="Arial"/>
-                <w:sz w:val="20"/>
-                <w:szCs w:val="20"/>
+                <w:sz w:val="22"/>
+                <w:szCs w:val="22"/>
               </w:rPr>
               <w:t>{{InspectionResultLine6}}</w:t>
             </w:r>
@@ -1504,23 +1477,23 @@
               <w:spacing w:line="220" w:lineRule="exact"/>
               <w:rPr>
                 <w:rFonts w:ascii="Arial" w:hAnsi="Arial" w:cs="Arial"/>
-                <w:sz w:val="20"/>
-                <w:szCs w:val="20"/>
+                <w:sz w:val="22"/>
+                <w:szCs w:val="22"/>
               </w:rPr>
             </w:pPr>
             <w:r>
               <w:rPr>
                 <w:rFonts w:ascii="Arial" w:eastAsia="Arial" w:hAnsi="Arial" w:cs="Arial"/>
-                <w:sz w:val="20"/>
-                <w:szCs w:val="20"/>
+                <w:sz w:val="22"/>
+                <w:szCs w:val="22"/>
               </w:rPr>
               <w:t xml:space="preserve">  </w:t>
             </w:r>
             <w:r>
               <w:rPr>
                 <w:rFonts w:ascii="Arial" w:eastAsia="Arial" w:hAnsi="Arial" w:cs="Arial"/>
-                <w:sz w:val="20"/>
-                <w:szCs w:val="20"/>
+                <w:sz w:val="22"/>
+                <w:szCs w:val="22"/>
               </w:rPr>
               <w:t>{{InspectionResultLine7}}</w:t>
             </w:r>
@@ -1547,23 +1520,23 @@
               <w:spacing w:line="220" w:lineRule="exact"/>
               <w:rPr>
                 <w:rFonts w:ascii="Arial" w:hAnsi="Arial" w:cs="Arial"/>
-                <w:sz w:val="20"/>
-                <w:szCs w:val="20"/>
+                <w:sz w:val="22"/>
+                <w:szCs w:val="22"/>
               </w:rPr>
             </w:pPr>
             <w:r>
               <w:rPr>
                 <w:rFonts w:ascii="Arial" w:eastAsia="Arial" w:hAnsi="Arial" w:cs="Arial"/>
-                <w:sz w:val="20"/>
-                <w:szCs w:val="20"/>
+                <w:sz w:val="22"/>
+                <w:szCs w:val="22"/>
               </w:rPr>
               <w:t xml:space="preserve">  </w:t>
             </w:r>
             <w:r>
               <w:rPr>
                 <w:rFonts w:ascii="Arial" w:eastAsia="Arial" w:hAnsi="Arial" w:cs="Arial"/>
-                <w:sz w:val="20"/>
-                <w:szCs w:val="20"/>
+                <w:sz w:val="22"/>
+                <w:szCs w:val="22"/>
               </w:rPr>
               <w:t>{{InspectionResultLine8}}</w:t>
             </w:r>
@@ -1627,15 +1600,15 @@
               <w:spacing w:line="220" w:lineRule="exact"/>
               <w:rPr>
                 <w:rFonts w:ascii="Arial" w:hAnsi="Arial" w:cs="Arial"/>
-                <w:sz w:val="20"/>
-                <w:szCs w:val="20"/>
+                <w:sz w:val="22"/>
+                <w:szCs w:val="22"/>
               </w:rPr>
             </w:pPr>
             <w:r>
               <w:rPr>
                 <w:rFonts w:ascii="Arial" w:eastAsia="Arial" w:hAnsi="Arial" w:cs="Arial"/>
-                <w:sz w:val="20"/>
-                <w:szCs w:val="20"/>
+                <w:sz w:val="22"/>
+                <w:szCs w:val="22"/>
               </w:rPr>
               <w:t>{{</w:t>
             </w:r>
@@ -1643,8 +1616,8 @@
             <w:r>
               <w:rPr>
                 <w:rFonts w:ascii="Arial" w:eastAsia="Arial" w:hAnsi="Arial" w:cs="Arial"/>
-                <w:sz w:val="20"/>
-                <w:szCs w:val="20"/>
+                <w:sz w:val="22"/>
+                <w:szCs w:val="22"/>
               </w:rPr>
               <w:t>TransferredToLine</w:t>
             </w:r>
@@ -1652,8 +1625,8 @@
             <w:r>
               <w:rPr>
                 <w:rFonts w:ascii="Arial" w:eastAsia="Arial" w:hAnsi="Arial" w:cs="Arial"/>
-                <w:sz w:val="20"/>
-                <w:szCs w:val="20"/>
+                <w:sz w:val="22"/>
+                <w:szCs w:val="22"/>
               </w:rPr>
               <w:t>}}</w:t>
             </w:r>
@@ -2019,36 +1992,44 @@
             <w:r>
               <w:rPr>
                 <w:rFonts w:ascii="Arial" w:eastAsia="Arial" w:hAnsi="Arial" w:cs="Arial"/>
+                <w:sz w:val="22"/>
+                <w:szCs w:val="22"/>
+              </w:rPr>
+              <w:t xml:space="preserve">  </w:t>
+            </w:r>
+            <w:r>
+              <w:rPr>
+                <w:rFonts w:ascii="Arial" w:eastAsia="Arial" w:hAnsi="Arial" w:cs="Arial"/>
+                <w:sz w:val="22"/>
+                <w:szCs w:val="22"/>
+              </w:rPr>
+              <w:t>{{</w:t>
+            </w:r>
+            <w:proofErr w:type="spellStart"/>
+            <w:r>
+              <w:rPr>
+                <w:rFonts w:ascii="Arial" w:eastAsia="Arial" w:hAnsi="Arial" w:cs="Arial"/>
+                <w:sz w:val="22"/>
+                <w:szCs w:val="22"/>
+              </w:rPr>
+              <w:t>ActualLaborHours</w:t>
+            </w:r>
+            <w:proofErr w:type="spellEnd"/>
+            <w:r>
+              <w:rPr>
+                <w:rFonts w:ascii="Arial" w:eastAsia="Arial" w:hAnsi="Arial" w:cs="Arial"/>
+                <w:sz w:val="22"/>
+                <w:szCs w:val="22"/>
+              </w:rPr>
+              <w:t>}}</w:t>
+            </w:r>
+            <w:r>
+              <w:rPr>
+                <w:rFonts w:ascii="Arial" w:eastAsia="Arial" w:hAnsi="Arial" w:cs="Arial"/>
                 <w:sz w:val="20"/>
                 <w:szCs w:val="20"/>
               </w:rPr>
-              <w:t xml:space="preserve">  </w:t>
-            </w:r>
-            <w:r>
-              <w:rPr>
-                <w:rFonts w:ascii="Arial" w:eastAsia="Arial" w:hAnsi="Arial" w:cs="Arial"/>
-                <w:sz w:val="20"/>
-                <w:szCs w:val="20"/>
-              </w:rPr>
-              <w:t>{{</w:t>
-            </w:r>
-            <w:proofErr w:type="spellStart"/>
-            <w:r>
-              <w:rPr>
-                <w:rFonts w:ascii="Arial" w:eastAsia="Arial" w:hAnsi="Arial" w:cs="Arial"/>
-                <w:sz w:val="20"/>
-                <w:szCs w:val="20"/>
-              </w:rPr>
-              <w:t>ActualLaborHours</w:t>
-            </w:r>
-            <w:proofErr w:type="spellEnd"/>
-            <w:r>
-              <w:rPr>
-                <w:rFonts w:ascii="Arial" w:eastAsia="Arial" w:hAnsi="Arial" w:cs="Arial"/>
-                <w:sz w:val="20"/>
-                <w:szCs w:val="20"/>
-              </w:rPr>
-              <w:t xml:space="preserve">}} </w:t>
+              <w:t xml:space="preserve"> </w:t>
             </w:r>
             <w:proofErr w:type="spellStart"/>
             <w:r>
@@ -2143,7 +2124,17 @@
                 <w:sz w:val="20"/>
                 <w:szCs w:val="20"/>
               </w:rPr>
-              <w:t>Представитель заказчика</w:t>
+              <w:t>Представите</w:t>
+            </w:r>
+            <w:bookmarkStart w:id="0" w:name="_GoBack"/>
+            <w:bookmarkEnd w:id="0"/>
+            <w:r>
+              <w:rPr>
+                <w:rFonts w:ascii="Arial" w:eastAsia="Arial" w:hAnsi="Arial" w:cs="Arial"/>
+                <w:sz w:val="20"/>
+                <w:szCs w:val="20"/>
+              </w:rPr>
+              <w:t>ль заказчика</w:t>
             </w:r>
           </w:p>
         </w:tc>
@@ -2187,17 +2178,35 @@
               <w:jc w:val="center"/>
               <w:rPr>
                 <w:rFonts w:ascii="Arial" w:hAnsi="Arial" w:cs="Arial"/>
-                <w:sz w:val="20"/>
-                <w:szCs w:val="20"/>
+                <w:sz w:val="22"/>
+                <w:szCs w:val="22"/>
               </w:rPr>
             </w:pPr>
             <w:r>
               <w:rPr>
                 <w:rFonts w:ascii="Arial" w:eastAsia="Arial" w:hAnsi="Arial" w:cs="Arial"/>
-                <w:sz w:val="20"/>
-                <w:szCs w:val="20"/>
-              </w:rPr>
-              <w:t>{{CustomerSignatureName}}</w:t>
+                <w:sz w:val="22"/>
+                <w:szCs w:val="22"/>
+              </w:rPr>
+              <w:t>{{</w:t>
+            </w:r>
+            <w:proofErr w:type="spellStart"/>
+            <w:r>
+              <w:rPr>
+                <w:rFonts w:ascii="Arial" w:eastAsia="Arial" w:hAnsi="Arial" w:cs="Arial"/>
+                <w:sz w:val="22"/>
+                <w:szCs w:val="22"/>
+              </w:rPr>
+              <w:t>CustomerSignatureName</w:t>
+            </w:r>
+            <w:proofErr w:type="spellEnd"/>
+            <w:r>
+              <w:rPr>
+                <w:rFonts w:ascii="Arial" w:eastAsia="Arial" w:hAnsi="Arial" w:cs="Arial"/>
+                <w:sz w:val="22"/>
+                <w:szCs w:val="22"/>
+              </w:rPr>
+              <w:t>}}</w:t>
             </w:r>
           </w:p>
         </w:tc>
@@ -2365,17 +2374,35 @@
               <w:jc w:val="center"/>
               <w:rPr>
                 <w:rFonts w:ascii="Arial" w:hAnsi="Arial" w:cs="Arial"/>
-                <w:sz w:val="20"/>
-                <w:szCs w:val="20"/>
+                <w:sz w:val="22"/>
+                <w:szCs w:val="22"/>
               </w:rPr>
             </w:pPr>
             <w:r>
               <w:rPr>
                 <w:rFonts w:ascii="Arial" w:eastAsia="Arial" w:hAnsi="Arial" w:cs="Arial"/>
-                <w:sz w:val="20"/>
-                <w:szCs w:val="20"/>
-              </w:rPr>
-              <w:t>{{ExecutorSignatureName}}</w:t>
+                <w:sz w:val="22"/>
+                <w:szCs w:val="22"/>
+              </w:rPr>
+              <w:t>{{</w:t>
+            </w:r>
+            <w:proofErr w:type="spellStart"/>
+            <w:r>
+              <w:rPr>
+                <w:rFonts w:ascii="Arial" w:eastAsia="Arial" w:hAnsi="Arial" w:cs="Arial"/>
+                <w:sz w:val="22"/>
+                <w:szCs w:val="22"/>
+              </w:rPr>
+              <w:t>ExecutorSignatureName</w:t>
+            </w:r>
+            <w:proofErr w:type="spellEnd"/>
+            <w:r>
+              <w:rPr>
+                <w:rFonts w:ascii="Arial" w:eastAsia="Arial" w:hAnsi="Arial" w:cs="Arial"/>
+                <w:sz w:val="22"/>
+                <w:szCs w:val="22"/>
+              </w:rPr>
+              <w:t>}}</w:t>
             </w:r>
           </w:p>
         </w:tc>

</xml_diff>